<commit_message>
courseware: publish executive Copilot curriculum v2.0
</commit_message>
<xml_diff>
--- a/courseware/LG-AI-Transformation-with-Microsoft-Copilot.docx
+++ b/courseware/LG-AI-Transformation-with-Microsoft-Copilot.docx
@@ -15,7 +15,7 @@
               <a:graphicData uri="http://schemas.openxmlformats.org/drawingml/2006/picture">
                 <pic:pic>
                   <pic:nvPicPr>
-                    <pic:cNvPr id="0" name="tertiary-infotech-logo.png"/>
+                    <pic:cNvPr id="0" name="provider-logo.png"/>
                     <pic:cNvPicPr/>
                   </pic:nvPicPr>
                   <pic:blipFill>
@@ -84,7 +84,7 @@
     </w:p>
     <w:p>
       <w:r>
-        <w:t>Learner Guide | TGS-2024044051 | v1.0 | 27 September 2026</w:t>
+        <w:t>Learner Guide | TGS-2024044051 | v2.0 | 27 September 2026</w:t>
       </w:r>
     </w:p>
     <w:p>
@@ -186,7 +186,49 @@
           </w:tcPr>
           <w:p>
             <w:r>
-              <w:t>Complete replacement of legacy MS-700 content with Copilot implementation, security, agents and value assessment.</w:t>
+              <w:t>Initial Copilot technical courseware release.</w:t>
+            </w:r>
+          </w:p>
+        </w:tc>
+        <w:tc>
+          <w:tcPr>
+            <w:tcW w:type="dxa" w:w="2160"/>
+          </w:tcPr>
+          <w:p>
+            <w:r>
+              <w:t>Tertiary Infotech Academy</w:t>
+            </w:r>
+          </w:p>
+        </w:tc>
+      </w:tr>
+      <w:tr>
+        <w:tc>
+          <w:tcPr>
+            <w:tcW w:type="dxa" w:w="2160"/>
+          </w:tcPr>
+          <w:p>
+            <w:r>
+              <w:t>v2.0</w:t>
+            </w:r>
+          </w:p>
+        </w:tc>
+        <w:tc>
+          <w:tcPr>
+            <w:tcW w:type="dxa" w:w="2160"/>
+          </w:tcPr>
+          <w:p>
+            <w:r>
+              <w:t>27 September 2026</w:t>
+            </w:r>
+          </w:p>
+        </w:tc>
+        <w:tc>
+          <w:tcPr>
+            <w:tcW w:type="dxa" w:w="2160"/>
+          </w:tcPr>
+          <w:p>
+            <w:r>
+              <w:t>Executive overhaul: direct Copilot use, strategic decisions, governance, adoption and measured outcomes.</w:t>
             </w:r>
           </w:p>
         </w:tc>
@@ -212,6 +254,20 @@
     </w:p>
     <w:p>
       <w:pPr>
+        <w:spacing w:after="0"/>
+      </w:pPr>
+      <w:r>
+        <w:fldChar w:fldCharType="begin"/>
+      </w:r>
+      <w:r>
+        <w:instrText xml:space="preserve">TOC \o "1-3" \h \z \u</w:instrText>
+      </w:r>
+      <w:r>
+        <w:fldChar w:fldCharType="end"/>
+      </w:r>
+    </w:p>
+    <w:p>
+      <w:pPr>
         <w:ind w:left="288"/>
       </w:pPr>
       <w:hyperlink w:anchor="topic1">
@@ -219,7 +275,7 @@
           <w:rPr>
             <w:color w:val="1F6FEB"/>
           </w:rPr>
-          <w:t>Topic 1: Microsoft 365 Copilot Implementation and Business Process Transformation  ........................................  3</w:t>
+          <w:t>Topic 1: Set the Copilot Transformation Strategy and Lead by Example  ........................................  3</w:t>
         </w:r>
       </w:hyperlink>
     </w:p>
@@ -232,7 +288,7 @@
           <w:rPr>
             <w:color w:val="1F6FEB"/>
           </w:rPr>
-          <w:t>Topic 2: Microsoft Copilot Administration, Security and Responsible AI  ........................................  9</w:t>
+          <w:t>Topic 2: Govern Copilot Use and Protect Business Decisions  ........................................  10</w:t>
         </w:r>
       </w:hyperlink>
     </w:p>
@@ -245,7 +301,7 @@
           <w:rPr>
             <w:color w:val="1F6FEB"/>
           </w:rPr>
-          <w:t>Topic 3: Copilot Integration, AI Agents and Cross-Platform Workflows  ........................................  14</w:t>
+          <w:t>Topic 3: Integrate Copilot into the Executive Operating Model  ........................................  14</w:t>
         </w:r>
       </w:hyperlink>
     </w:p>
@@ -258,7 +314,7 @@
           <w:rPr>
             <w:color w:val="1F6FEB"/>
           </w:rPr>
-          <w:t>Topic 4: AI Optimization, Performance Monitoring and Business Value Assessment  ........................................  20</w:t>
+          <w:t>Topic 4: Measure Value, Scale Adoption and Report to the Board  ........................................  19</w:t>
         </w:r>
       </w:hyperlink>
     </w:p>
@@ -271,7 +327,7 @@
           <w:rPr>
             <w:color w:val="1F6FEB"/>
           </w:rPr>
-          <w:t>Lab walkthroughs  ........................................  26</w:t>
+          <w:t>Lab walkthroughs  ........................................  25</w:t>
         </w:r>
       </w:hyperlink>
     </w:p>
@@ -284,7 +340,7 @@
           <w:rPr>
             <w:color w:val="1F6FEB"/>
           </w:rPr>
-          <w:t>Assessment preparation  ........................................  46</w:t>
+          <w:t>Assessment preparation  ........................................  45</w:t>
         </w:r>
       </w:hyperlink>
     </w:p>
@@ -343,22 +399,27 @@
     </w:p>
     <w:p>
       <w:r>
-        <w:t>Some tenant features require licences or administrator policy. Use the provided synthetic evidence and decision templates when a feature is unavailable; record the limitation rather than claiming a live configuration.</w:t>
-      </w:r>
-    </w:p>
-    <w:p>
-      <w:bookmarkStart w:id="35914" w:name="topic1"/>
+        <w:t>Use Microsoft 365 Copilot in an approved work or school account when licensed. If a feature is unavailable, use the supplied synthetic source pack and label the artifact as an offline exercise. Review every consequential Copilot statement against its source.</w:t>
+      </w:r>
+    </w:p>
+    <w:p>
+      <w:r>
+        <w:t>Reference basis: Microsoft AI Business Professional (AB-730) informs direct Copilot work in Microsoft 365 apps; AB-100 informs strategic planning, governance and business value. This WSQ course is not Microsoft certification preparation.</w:t>
+      </w:r>
+    </w:p>
+    <w:p>
+      <w:bookmarkStart w:id="15117" w:name="topic1"/>
       <w:pPr>
         <w:pStyle w:val="Heading1"/>
       </w:pPr>
       <w:r>
-        <w:t>Topic 1: Microsoft 365 Copilot Implementation and Business Process Transformation</w:t>
-      </w:r>
-      <w:bookmarkEnd w:id="35914"/>
-    </w:p>
-    <w:p>
-      <w:r>
-        <w:t>Learning outcome: LO1. Official reference: https://learn.microsoft.com/en-us/copilot/microsoft-365/microsoft-365-copilot-architecture</w:t>
+        <w:t>Topic 1: Set the Copilot Transformation Strategy and Lead by Example</w:t>
+      </w:r>
+      <w:bookmarkEnd w:id="15117"/>
+    </w:p>
+    <w:p>
+      <w:r>
+        <w:t>Learning outcome: LO1. Official reference: https://learn.microsoft.com/en-us/credentials/certifications/exams/ab-100/</w:t>
       </w:r>
     </w:p>
     <w:p>
@@ -366,32 +427,32 @@
         <w:pStyle w:val="Heading2"/>
       </w:pPr>
       <w:r>
-        <w:t>01. Tenant readiness</w:t>
-      </w:r>
-    </w:p>
-    <w:p>
-      <w:r>
-        <w:t>Operational situation. Northstar Service starts with microsoft 365 tenant inventory. The intended transformation is to check identities, data estate and licensed workload availability and produce readiness register with owner and gap.</w:t>
-      </w:r>
-    </w:p>
-    <w:p>
-      <w:r>
-        <w:t>Procedure. 1. Open the relevant approved Microsoft 365 or Copilot Studio workspace, or the synthetic case record supplied in the lab. 2. Record the input and its owner. 3. Apply the transformation to a copy. 4. Compare the output with the source. 5. Log the reviewer, decision and date. Never claim a simulated configuration is a tenant deployment.</w:t>
-      </w:r>
-    </w:p>
-    <w:p>
-      <w:r>
-        <w:t>Control. Admin signs off app and data prerequisites. Diagnose a failure when licensed user lacks a supported app or data source. Preserve an input/output evidence trace and rerun the same test after correction.</w:t>
-      </w:r>
-    </w:p>
-    <w:p>
-      <w:r>
-        <w:t>Measure. Eligible users divided by target users. Define numerator, denominator, time window and cohort before comparing a baseline with a pilot. Do not infer business value from activity counts alone.</w:t>
-      </w:r>
-    </w:p>
-    <w:p>
-      <w:r>
-        <w:t>Practice in Lab 01. Evidence: Readiness register with owner and gap; expected acceptance: Admin signs off app and data prerequisites.</w:t>
+        <w:t>01. Transformation ambition</w:t>
+      </w:r>
+    </w:p>
+    <w:p>
+      <w:r>
+        <w:t>Business decision. Northstar Service starts with a service division misses response targets. Use Copilot Chat to compare three improvement ambitions. The output is one-page transformation mandate.</w:t>
+      </w:r>
+    </w:p>
+    <w:p>
+      <w:r>
+        <w:t>Copilot practice. 1. Open Microsoft Copilot Chat in the approved Microsoft 365 work environment, or open the synthetic case pack. 2. State the executive decision, audience, source and constraints. 3. Ask Copilot for the named output and request assumptions and uncertainties. 4. Compare material claims and figures with the supplied source. 5. Edit and save a human-owned decision artifact. The matching Lab 01 gives a copy-ready prompt and detailed steps.</w:t>
+      </w:r>
+    </w:p>
+    <w:p>
+      <w:r>
+        <w:t>Executive gate. CEO approves a measurable business problem. Challenge the result if ambition is only a technology slogan. Record the decision owner and a corrective action.</w:t>
+      </w:r>
+    </w:p>
+    <w:p>
+      <w:r>
+        <w:t>Outcome measure. Target service-cycle reduction. State the baseline, cohort and period. Separate observed results from estimates before presenting value to a sponsor.</w:t>
+      </w:r>
+    </w:p>
+    <w:p>
+      <w:r>
+        <w:t>Practice in Lab 01. Evidence: One-page transformation mandate; expected acceptance: CEO approves a measurable business problem.</w:t>
       </w:r>
     </w:p>
     <w:p>
@@ -399,32 +460,32 @@
         <w:pStyle w:val="Heading2"/>
       </w:pPr>
       <w:r>
-        <w:t>02. License allocation</w:t>
-      </w:r>
-    </w:p>
-    <w:p>
-      <w:r>
-        <w:t>Operational situation. Northstar Service starts with 30 pilot seats and role list. The intended transformation is to match entitlement to high-frequency document tasks and produce license assignment and cohort list.</w:t>
-      </w:r>
-    </w:p>
-    <w:p>
-      <w:r>
-        <w:t>Procedure. 1. Open the relevant approved Microsoft 365 or Copilot Studio workspace, or the synthetic case record supplied in the lab. 2. Record the input and its owner. 3. Apply the transformation to a copy. 4. Compare the output with the source. 5. Log the reviewer, decision and date. Never claim a simulated configuration is a tenant deployment.</w:t>
-      </w:r>
-    </w:p>
-    <w:p>
-      <w:r>
-        <w:t>Control. Approve seats against role and cost center. Diagnose a failure when seat assigned but service plan disabled. Preserve an input/output evidence trace and rerun the same test after correction.</w:t>
-      </w:r>
-    </w:p>
-    <w:p>
-      <w:r>
-        <w:t>Measure. Active pilot users divided by assigned seats. Define numerator, denominator, time window and cohort before comparing a baseline with a pilot. Do not infer business value from activity counts alone.</w:t>
-      </w:r>
-    </w:p>
-    <w:p>
-      <w:r>
-        <w:t>Practice in Lab 01. Evidence: License assignment and cohort list; expected acceptance: Approve seats against role and cost center.</w:t>
+        <w:t>02. Value pool map</w:t>
+      </w:r>
+    </w:p>
+    <w:p>
+      <w:r>
+        <w:t>Business decision. Northstar Service starts with five departments and task-volume estimates. Ask Copilot to cluster recurring knowledge-work opportunities. The output is value pool map with owner.</w:t>
+      </w:r>
+    </w:p>
+    <w:p>
+      <w:r>
+        <w:t>Copilot practice. 1. Open Microsoft Copilot Chat in the approved Microsoft 365 work environment, or open the synthetic case pack. 2. State the executive decision, audience, source and constraints. 3. Ask Copilot for the named output and request assumptions and uncertainties. 4. Compare material claims and figures with the supplied source. 5. Edit and save a human-owned decision artifact. The matching Lab 01 gives a copy-ready prompt and detailed steps.</w:t>
+      </w:r>
+    </w:p>
+    <w:p>
+      <w:r>
+        <w:t>Executive gate. Keep only opportunities tied to a named outcome. Challenge the result if high-volume activity has no customer value. Record the decision owner and a corrective action.</w:t>
+      </w:r>
+    </w:p>
+    <w:p>
+      <w:r>
+        <w:t>Outcome measure. Annual addressable hours by pool. State the baseline, cohort and period. Separate observed results from estimates before presenting value to a sponsor.</w:t>
+      </w:r>
+    </w:p>
+    <w:p>
+      <w:r>
+        <w:t>Practice in Lab 01. Evidence: Value pool map with owner; expected acceptance: Keep only opportunities tied to a named outcome.</w:t>
       </w:r>
     </w:p>
     <w:p>
@@ -432,32 +493,32 @@
         <w:pStyle w:val="Heading2"/>
       </w:pPr>
       <w:r>
-        <w:t>03. Graph permission scope</w:t>
-      </w:r>
-    </w:p>
-    <w:p>
-      <w:r>
-        <w:t>Operational situation. Northstar Service starts with sharepoint file acl and test identities. The intended transformation is to compare search results under user a and user b and produce access matrix with allowed files.</w:t>
-      </w:r>
-    </w:p>
-    <w:p>
-      <w:r>
-        <w:t>Procedure. 1. Open the relevant approved Microsoft 365 or Copilot Studio workspace, or the synthetic case record supplied in the lab. 2. Record the input and its owner. 3. Apply the transformation to a copy. 4. Compare the output with the source. 5. Log the reviewer, decision and date. Never claim a simulated configuration is a tenant deployment.</w:t>
-      </w:r>
-    </w:p>
-    <w:p>
-      <w:r>
-        <w:t>Control. Least privilege and owner review. Diagnose a failure when overshared file appears in both result sets. Preserve an input/output evidence trace and rerun the same test after correction.</w:t>
-      </w:r>
-    </w:p>
-    <w:p>
-      <w:r>
-        <w:t>Measure. Unexpected accessible files count. Define numerator, denominator, time window and cohort before comparing a baseline with a pilot. Do not infer business value from activity counts alone.</w:t>
-      </w:r>
-    </w:p>
-    <w:p>
-      <w:r>
-        <w:t>Practice in Lab 01. Evidence: Access matrix with allowed files; expected acceptance: Least privilege and owner review.</w:t>
+        <w:t>03. Executive sponsor</w:t>
+      </w:r>
+    </w:p>
+    <w:p>
+      <w:r>
+        <w:t>Business decision. Northstar Service starts with four competing leadership priorities. Draft a sponsor brief in Word with Copilot. The output is sponsor decision and named accountable owner.</w:t>
+      </w:r>
+    </w:p>
+    <w:p>
+      <w:r>
+        <w:t>Copilot practice. 1. Open Microsoft Copilot Chat in the approved Microsoft 365 work environment, or open the synthetic case pack. 2. State the executive decision, audience, source and constraints. 3. Ask Copilot for the named output and request assumptions and uncertainties. 4. Compare material claims and figures with the supplied source. 5. Edit and save a human-owned decision artifact. The matching Lab 01 gives a copy-ready prompt and detailed steps.</w:t>
+      </w:r>
+    </w:p>
+    <w:p>
+      <w:r>
+        <w:t>Executive gate. Sponsor commits a review cadence. Challenge the result if no executive owns the benefit. Record the decision owner and a corrective action.</w:t>
+      </w:r>
+    </w:p>
+    <w:p>
+      <w:r>
+        <w:t>Outcome measure. Sponsor decisions closed on time. State the baseline, cohort and period. Separate observed results from estimates before presenting value to a sponsor.</w:t>
+      </w:r>
+    </w:p>
+    <w:p>
+      <w:r>
+        <w:t>Practice in Lab 01. Evidence: Sponsor decision and named accountable owner; expected acceptance: Sponsor commits a review cadence.</w:t>
       </w:r>
     </w:p>
     <w:p>
@@ -465,32 +526,32 @@
         <w:pStyle w:val="Heading2"/>
       </w:pPr>
       <w:r>
-        <w:t>04. Business-process mapping</w:t>
-      </w:r>
-    </w:p>
-    <w:p>
-      <w:r>
-        <w:t>Operational situation. Northstar Service starts with service request intake with six handoffs. The intended transformation is to mark drafting, lookup and approval steps and produce current-to-future swimlane.</w:t>
-      </w:r>
-    </w:p>
-    <w:p>
-      <w:r>
-        <w:t>Procedure. 1. Open the relevant approved Microsoft 365 or Copilot Studio workspace, or the synthetic case record supplied in the lab. 2. Record the input and its owner. 3. Apply the transformation to a copy. 4. Compare the output with the source. 5. Log the reviewer, decision and date. Never claim a simulated configuration is a tenant deployment.</w:t>
-      </w:r>
-    </w:p>
-    <w:p>
-      <w:r>
-        <w:t>Control. Keep human approval on customer-facing send. Diagnose a failure when automation bypasses approval. Preserve an input/output evidence trace and rerun the same test after correction.</w:t>
-      </w:r>
-    </w:p>
-    <w:p>
-      <w:r>
-        <w:t>Measure. Median handoff time in minutes. Define numerator, denominator, time window and cohort before comparing a baseline with a pilot. Do not infer business value from activity counts alone.</w:t>
-      </w:r>
-    </w:p>
-    <w:p>
-      <w:r>
-        <w:t>Practice in Lab 01. Evidence: Current-to-future swimlane; expected acceptance: Keep human approval on customer-facing send.</w:t>
+        <w:t>04. Stakeholder alignment</w:t>
+      </w:r>
+    </w:p>
+    <w:p>
+      <w:r>
+        <w:t>Business decision. Northstar Service starts with sales, service, finance and risk concerns. Summarise the competing positions with Copilot. The output is stakeholder trade-off matrix.</w:t>
+      </w:r>
+    </w:p>
+    <w:p>
+      <w:r>
+        <w:t>Copilot practice. 1. Open Microsoft Copilot Chat in the approved Microsoft 365 work environment, or open the synthetic case pack. 2. State the executive decision, audience, source and constraints. 3. Ask Copilot for the named output and request assumptions and uncertainties. 4. Compare material claims and figures with the supplied source. 5. Edit and save a human-owned decision artifact. The matching Lab 01 gives a copy-ready prompt and detailed steps.</w:t>
+      </w:r>
+    </w:p>
+    <w:p>
+      <w:r>
+        <w:t>Executive gate. Record dissent before selecting a pilot. Challenge the result if risk concern is omitted from the brief. Record the decision owner and a corrective action.</w:t>
+      </w:r>
+    </w:p>
+    <w:p>
+      <w:r>
+        <w:t>Outcome measure. Unresolved stakeholder objections. State the baseline, cohort and period. Separate observed results from estimates before presenting value to a sponsor.</w:t>
+      </w:r>
+    </w:p>
+    <w:p>
+      <w:r>
+        <w:t>Practice in Lab 01. Evidence: Stakeholder trade-off matrix; expected acceptance: Record dissent before selecting a pilot.</w:t>
       </w:r>
     </w:p>
     <w:p>
@@ -498,32 +559,32 @@
         <w:pStyle w:val="Heading2"/>
       </w:pPr>
       <w:r>
-        <w:t>05. Opportunity scoring</w:t>
-      </w:r>
-    </w:p>
-    <w:p>
-      <w:r>
-        <w:t>Operational situation. Northstar Service starts with ten candidate workflows. The intended transformation is to score volume, time, data quality and risk and produce ranked use-case backlog.</w:t>
-      </w:r>
-    </w:p>
-    <w:p>
-      <w:r>
-        <w:t>Procedure. 1. Open the relevant approved Microsoft 365 or Copilot Studio workspace, or the synthetic case record supplied in the lab. 2. Record the input and its owner. 3. Apply the transformation to a copy. 4. Compare the output with the source. 5. Log the reviewer, decision and date. Never claim a simulated configuration is a tenant deployment.</w:t>
-      </w:r>
-    </w:p>
-    <w:p>
-      <w:r>
-        <w:t>Control. Reject use case with ungoverned sensitive data. Diagnose a failure when high score hides missing data owner. Preserve an input/output evidence trace and rerun the same test after correction.</w:t>
-      </w:r>
-    </w:p>
-    <w:p>
-      <w:r>
-        <w:t>Measure. Weighted score per use case. Define numerator, denominator, time window and cohort before comparing a baseline with a pilot. Do not infer business value from activity counts alone.</w:t>
-      </w:r>
-    </w:p>
-    <w:p>
-      <w:r>
-        <w:t>Practice in Lab 01. Evidence: Ranked use-case backlog; expected acceptance: Reject use case with ungoverned sensitive data.</w:t>
+        <w:t>05. Success definition</w:t>
+      </w:r>
+    </w:p>
+    <w:p>
+      <w:r>
+        <w:t>Business decision. Northstar Service starts with baseline cycle time and quality scores. Use Copilot to draft a result statement. The output is outcome scorecard with baseline and target.</w:t>
+      </w:r>
+    </w:p>
+    <w:p>
+      <w:r>
+        <w:t>Copilot practice. 1. Open Microsoft Copilot Chat in the approved Microsoft 365 work environment, or open the synthetic case pack. 2. State the executive decision, audience, source and constraints. 3. Ask Copilot for the named output and request assumptions and uncertainties. 4. Compare material claims and figures with the supplied source. 5. Edit and save a human-owned decision artifact. The matching Lab 01 gives a copy-ready prompt and detailed steps.</w:t>
+      </w:r>
+    </w:p>
+    <w:p>
+      <w:r>
+        <w:t>Executive gate. Board accepts denominator and time window. Challenge the result if activity count is presented as impact. Record the decision owner and a corrective action.</w:t>
+      </w:r>
+    </w:p>
+    <w:p>
+      <w:r>
+        <w:t>Outcome measure. Target met on comparable work. State the baseline, cohort and period. Separate observed results from estimates before presenting value to a sponsor.</w:t>
+      </w:r>
+    </w:p>
+    <w:p>
+      <w:r>
+        <w:t>Practice in Lab 01. Evidence: Outcome scorecard with baseline and target; expected acceptance: Board accepts denominator and time window.</w:t>
       </w:r>
     </w:p>
     <w:p>
@@ -531,32 +592,32 @@
         <w:pStyle w:val="Heading2"/>
       </w:pPr>
       <w:r>
-        <w:t>06. Prompt context window</w:t>
-      </w:r>
-    </w:p>
-    <w:p>
-      <w:r>
-        <w:t>Operational situation. Northstar Service starts with customer email and policy excerpts. The intended transformation is to separate task, context, constraints and format and produce reusable prompt card.</w:t>
-      </w:r>
-    </w:p>
-    <w:p>
-      <w:r>
-        <w:t>Procedure. 1. Open the relevant approved Microsoft 365 or Copilot Studio workspace, or the synthetic case record supplied in the lab. 2. Record the input and its owner. 3. Apply the transformation to a copy. 4. Compare the output with the source. 5. Log the reviewer, decision and date. Never claim a simulated configuration is a tenant deployment.</w:t>
-      </w:r>
-    </w:p>
-    <w:p>
-      <w:r>
-        <w:t>Control. Never paste personal data into unmanaged chat. Diagnose a failure when answer omits policy exception. Preserve an input/output evidence trace and rerun the same test after correction.</w:t>
-      </w:r>
-    </w:p>
-    <w:p>
-      <w:r>
-        <w:t>Measure. Grounded claims divided by claims. Define numerator, denominator, time window and cohort before comparing a baseline with a pilot. Do not infer business value from activity counts alone.</w:t>
-      </w:r>
-    </w:p>
-    <w:p>
-      <w:r>
-        <w:t>Practice in Lab 02. Evidence: Reusable prompt card; expected acceptance: Never paste personal data into unmanaged chat.</w:t>
+        <w:t>06. Copilot Chat briefing</w:t>
+      </w:r>
+    </w:p>
+    <w:p>
+      <w:r>
+        <w:t>Business decision. Northstar Service starts with synthetic board pack and policy extract. Ask Copilot Chat for a sourced executive summary. The output is five-point decision brief.</w:t>
+      </w:r>
+    </w:p>
+    <w:p>
+      <w:r>
+        <w:t>Copilot practice. 1. Open Microsoft Copilot Chat in the approved Microsoft 365 work environment, or open the synthetic case pack. 2. State the executive decision, audience, source and constraints. 3. Ask Copilot for the named output and request assumptions and uncertainties. 4. Compare material claims and figures with the supplied source. 5. Edit and save a human-owned decision artifact. The matching Lab 02 gives a copy-ready prompt and detailed steps.</w:t>
+      </w:r>
+    </w:p>
+    <w:p>
+      <w:r>
+        <w:t>Executive gate. Verify each material claim against the pack. Challenge the result if plausible but unsupported claim. Record the decision owner and a corrective action.</w:t>
+      </w:r>
+    </w:p>
+    <w:p>
+      <w:r>
+        <w:t>Outcome measure. Supported claims divided by claims. State the baseline, cohort and period. Separate observed results from estimates before presenting value to a sponsor.</w:t>
+      </w:r>
+    </w:p>
+    <w:p>
+      <w:r>
+        <w:t>Practice in Lab 02. Evidence: Five-point decision brief; expected acceptance: Verify each material claim against the pack.</w:t>
       </w:r>
     </w:p>
     <w:p>
@@ -564,32 +625,32 @@
         <w:pStyle w:val="Heading2"/>
       </w:pPr>
       <w:r>
-        <w:t>07. Grounded retrieval</w:t>
-      </w:r>
-    </w:p>
-    <w:p>
-      <w:r>
-        <w:t>Operational situation. Northstar Service starts with approved policy file and user query. The intended transformation is to retrieve accessible passages before generation and produce answer with source citations.</w:t>
-      </w:r>
-    </w:p>
-    <w:p>
-      <w:r>
-        <w:t>Procedure. 1. Open the relevant approved Microsoft 365 or Copilot Studio workspace, or the synthetic case record supplied in the lab. 2. Record the input and its owner. 3. Apply the transformation to a copy. 4. Compare the output with the source. 5. Log the reviewer, decision and date. Never claim a simulated configuration is a tenant deployment.</w:t>
-      </w:r>
-    </w:p>
-    <w:p>
-      <w:r>
-        <w:t>Control. Verify source version and user permission. Diagnose a failure when citation points to superseded policy. Preserve an input/output evidence trace and rerun the same test after correction.</w:t>
-      </w:r>
-    </w:p>
-    <w:p>
-      <w:r>
-        <w:t>Measure. Supported answer statements divided by total. Define numerator, denominator, time window and cohort before comparing a baseline with a pilot. Do not infer business value from activity counts alone.</w:t>
-      </w:r>
-    </w:p>
-    <w:p>
-      <w:r>
-        <w:t>Practice in Lab 02. Evidence: Answer with source citations; expected acceptance: Verify source version and user permission.</w:t>
+        <w:t>07. Question refinement</w:t>
+      </w:r>
+    </w:p>
+    <w:p>
+      <w:r>
+        <w:t>Business decision. Northstar Service starts with a broad request for better service. Refine goal, context, constraints and format in Copilot. The output is reusable executive prompt.</w:t>
+      </w:r>
+    </w:p>
+    <w:p>
+      <w:r>
+        <w:t>Copilot practice. 1. Open Microsoft Copilot Chat in the approved Microsoft 365 work environment, or open the synthetic case pack. 2. State the executive decision, audience, source and constraints. 3. Ask Copilot for the named output and request assumptions and uncertainties. 4. Compare material claims and figures with the supplied source. 5. Edit and save a human-owned decision artifact. The matching Lab 02 gives a copy-ready prompt and detailed steps.</w:t>
+      </w:r>
+    </w:p>
+    <w:p>
+      <w:r>
+        <w:t>Executive gate. Prompt names audience and decision. Challenge the result if response is polished but irrelevant. Record the decision owner and a corrective action.</w:t>
+      </w:r>
+    </w:p>
+    <w:p>
+      <w:r>
+        <w:t>Outcome measure. Decision-relevant points per answer. State the baseline, cohort and period. Separate observed results from estimates before presenting value to a sponsor.</w:t>
+      </w:r>
+    </w:p>
+    <w:p>
+      <w:r>
+        <w:t>Practice in Lab 02. Evidence: Reusable executive prompt; expected acceptance: Prompt names audience and decision.</w:t>
       </w:r>
     </w:p>
     <w:p>
@@ -597,32 +658,32 @@
         <w:pStyle w:val="Heading2"/>
       </w:pPr>
       <w:r>
-        <w:t>08. Word proposal draft</w:t>
-      </w:r>
-    </w:p>
-    <w:p>
-      <w:r>
-        <w:t>Operational situation. Northstar Service starts with synthetic service improvement brief. The intended transformation is to generate structure then compare to source register and produce draft proposal with evidence comments.</w:t>
-      </w:r>
-    </w:p>
-    <w:p>
-      <w:r>
-        <w:t>Procedure. 1. Open the relevant approved Microsoft 365 or Copilot Studio workspace, or the synthetic case record supplied in the lab. 2. Record the input and its owner. 3. Apply the transformation to a copy. 4. Compare the output with the source. 5. Log the reviewer, decision and date. Never claim a simulated configuration is a tenant deployment.</w:t>
-      </w:r>
-    </w:p>
-    <w:p>
-      <w:r>
-        <w:t>Control. Human owns final facts and approval. Diagnose a failure when unsupported cost claim enters draft. Preserve an input/output evidence trace and rerun the same test after correction.</w:t>
-      </w:r>
-    </w:p>
-    <w:p>
-      <w:r>
-        <w:t>Measure. Verified claims divided by total claims. Define numerator, denominator, time window and cohort before comparing a baseline with a pilot. Do not infer business value from activity counts alone.</w:t>
-      </w:r>
-    </w:p>
-    <w:p>
-      <w:r>
-        <w:t>Practice in Lab 02. Evidence: Draft proposal with evidence comments; expected acceptance: Human owns final facts and approval.</w:t>
+        <w:t>08. Source challenge</w:t>
+      </w:r>
+    </w:p>
+    <w:p>
+      <w:r>
+        <w:t>Business decision. Northstar Service starts with two contradictory policy versions. Ask Copilot to identify differences and uncertainty. The output is source conflict register.</w:t>
+      </w:r>
+    </w:p>
+    <w:p>
+      <w:r>
+        <w:t>Copilot practice. 1. Open Microsoft Copilot Chat in the approved Microsoft 365 work environment, or open the synthetic case pack. 2. State the executive decision, audience, source and constraints. 3. Ask Copilot for the named output and request assumptions and uncertainties. 4. Compare material claims and figures with the supplied source. 5. Edit and save a human-owned decision artifact. The matching Lab 02 gives a copy-ready prompt and detailed steps.</w:t>
+      </w:r>
+    </w:p>
+    <w:p>
+      <w:r>
+        <w:t>Executive gate. Owner resolves the authoritative version. Challenge the result if retired document becomes the basis. Record the decision owner and a corrective action.</w:t>
+      </w:r>
+    </w:p>
+    <w:p>
+      <w:r>
+        <w:t>Outcome measure. Current-source citation rate. State the baseline, cohort and period. Separate observed results from estimates before presenting value to a sponsor.</w:t>
+      </w:r>
+    </w:p>
+    <w:p>
+      <w:r>
+        <w:t>Practice in Lab 02. Evidence: Source conflict register; expected acceptance: Owner resolves the authoritative version.</w:t>
       </w:r>
     </w:p>
     <w:p>
@@ -630,32 +691,32 @@
         <w:pStyle w:val="Heading2"/>
       </w:pPr>
       <w:r>
-        <w:t>09. Excel service analysis</w:t>
-      </w:r>
-    </w:p>
-    <w:p>
-      <w:r>
-        <w:t>Operational situation. Northstar Service starts with synthetic ticket table: 120 rows. The intended transformation is to aggregate cycle time by issue category and produce pivot table and chart.</w:t>
-      </w:r>
-    </w:p>
-    <w:p>
-      <w:r>
-        <w:t>Procedure. 1. Open the relevant approved Microsoft 365 or Copilot Studio workspace, or the synthetic case record supplied in the lab. 2. Record the input and its owner. 3. Apply the transformation to a copy. 4. Compare the output with the source. 5. Log the reviewer, decision and date. Never claim a simulated configuration is a tenant deployment.</w:t>
-      </w:r>
-    </w:p>
-    <w:p>
-      <w:r>
-        <w:t>Control. Check formula range and outliers. Diagnose a failure when blank dates skew mean. Preserve an input/output evidence trace and rerun the same test after correction.</w:t>
-      </w:r>
-    </w:p>
-    <w:p>
-      <w:r>
-        <w:t>Measure. Median cycle time by category. Define numerator, denominator, time window and cohort before comparing a baseline with a pilot. Do not infer business value from activity counts alone.</w:t>
-      </w:r>
-    </w:p>
-    <w:p>
-      <w:r>
-        <w:t>Practice in Lab 02. Evidence: Pivot table and chart; expected acceptance: Check formula range and outliers.</w:t>
+        <w:t>09. Scenario comparison</w:t>
+      </w:r>
+    </w:p>
+    <w:p>
+      <w:r>
+        <w:t>Business decision. Northstar Service starts with three service improvement options. Ask Copilot for assumptions and trade-offs. The output is option comparison table.</w:t>
+      </w:r>
+    </w:p>
+    <w:p>
+      <w:r>
+        <w:t>Copilot practice. 1. Open Microsoft Copilot Chat in the approved Microsoft 365 work environment, or open the synthetic case pack. 2. State the executive decision, audience, source and constraints. 3. Ask Copilot for the named output and request assumptions and uncertainties. 4. Compare material claims and figures with the supplied source. 5. Edit and save a human-owned decision artifact. The matching Lab 02 gives a copy-ready prompt and detailed steps.</w:t>
+      </w:r>
+    </w:p>
+    <w:p>
+      <w:r>
+        <w:t>Executive gate. Compare options with the same criteria. Challenge the result if one option gets a favourable metric. Record the decision owner and a corrective action.</w:t>
+      </w:r>
+    </w:p>
+    <w:p>
+      <w:r>
+        <w:t>Outcome measure. Criteria applied to all options. State the baseline, cohort and period. Separate observed results from estimates before presenting value to a sponsor.</w:t>
+      </w:r>
+    </w:p>
+    <w:p>
+      <w:r>
+        <w:t>Practice in Lab 02. Evidence: Option comparison table; expected acceptance: Compare options with the same criteria.</w:t>
       </w:r>
     </w:p>
     <w:p>
@@ -663,32 +724,32 @@
         <w:pStyle w:val="Heading2"/>
       </w:pPr>
       <w:r>
-        <w:t>10. PowerPoint executive story</w:t>
-      </w:r>
-    </w:p>
-    <w:p>
-      <w:r>
-        <w:t>Operational situation. Northstar Service starts with approved word findings and excel chart. The intended transformation is to create a three-message decision deck and produce five-slide review deck.</w:t>
-      </w:r>
-    </w:p>
-    <w:p>
-      <w:r>
-        <w:t>Procedure. 1. Open the relevant approved Microsoft 365 or Copilot Studio workspace, or the synthetic case record supplied in the lab. 2. Record the input and its owner. 3. Apply the transformation to a copy. 4. Compare the output with the source. 5. Log the reviewer, decision and date. Never claim a simulated configuration is a tenant deployment.</w:t>
-      </w:r>
-    </w:p>
-    <w:p>
-      <w:r>
-        <w:t>Control. Presenter validates every number. Diagnose a failure when chart title and source mismatch. Preserve an input/output evidence trace and rerun the same test after correction.</w:t>
-      </w:r>
-    </w:p>
-    <w:p>
-      <w:r>
-        <w:t>Measure. Correct figures divided by checked figures. Define numerator, denominator, time window and cohort before comparing a baseline with a pilot. Do not infer business value from activity counts alone.</w:t>
-      </w:r>
-    </w:p>
-    <w:p>
-      <w:r>
-        <w:t>Practice in Lab 02. Evidence: Five-slide review deck; expected acceptance: Presenter validates every number.</w:t>
+        <w:t>10. Executive follow-up</w:t>
+      </w:r>
+    </w:p>
+    <w:p>
+      <w:r>
+        <w:t>Business decision. Northstar Service starts with a decision brief with open questions. Use Copilot to list evidence gaps and owners. The output is follow-up action register.</w:t>
+      </w:r>
+    </w:p>
+    <w:p>
+      <w:r>
+        <w:t>Copilot practice. 1. Open Microsoft Copilot Chat in the approved Microsoft 365 work environment, or open the synthetic case pack. 2. State the executive decision, audience, source and constraints. 3. Ask Copilot for the named output and request assumptions and uncertainties. 4. Compare material claims and figures with the supplied source. 5. Edit and save a human-owned decision artifact. The matching Lab 02 gives a copy-ready prompt and detailed steps.</w:t>
+      </w:r>
+    </w:p>
+    <w:p>
+      <w:r>
+        <w:t>Executive gate. No recommendation without missing facts. Challenge the result if open question disappears from summary. Record the decision owner and a corrective action.</w:t>
+      </w:r>
+    </w:p>
+    <w:p>
+      <w:r>
+        <w:t>Outcome measure. Critical gaps assigned to owners. State the baseline, cohort and period. Separate observed results from estimates before presenting value to a sponsor.</w:t>
+      </w:r>
+    </w:p>
+    <w:p>
+      <w:r>
+        <w:t>Practice in Lab 02. Evidence: Follow-up action register; expected acceptance: No recommendation without missing facts.</w:t>
       </w:r>
     </w:p>
     <w:p>
@@ -696,32 +757,32 @@
         <w:pStyle w:val="Heading2"/>
       </w:pPr>
       <w:r>
-        <w:t>11. Outlook response workflow</w:t>
-      </w:r>
-    </w:p>
-    <w:p>
-      <w:r>
-        <w:t>Operational situation. Northstar Service starts with synthetic customer escalation email. The intended transformation is to draft acknowledgement and response options and produce reviewed reply with owner and deadline.</w:t>
-      </w:r>
-    </w:p>
-    <w:p>
-      <w:r>
-        <w:t>Procedure. 1. Open the relevant approved Microsoft 365 or Copilot Studio workspace, or the synthetic case record supplied in the lab. 2. Record the input and its owner. 3. Apply the transformation to a copy. 4. Compare the output with the source. 5. Log the reviewer, decision and date. Never claim a simulated configuration is a tenant deployment.</w:t>
-      </w:r>
-    </w:p>
-    <w:p>
-      <w:r>
-        <w:t>Control. Send remains a human action. Diagnose a failure when tone implies an unapproved commitment. Preserve an input/output evidence trace and rerun the same test after correction.</w:t>
-      </w:r>
-    </w:p>
-    <w:p>
-      <w:r>
-        <w:t>Measure. Replies with explicit next owner. Define numerator, denominator, time window and cohort before comparing a baseline with a pilot. Do not infer business value from activity counts alone.</w:t>
-      </w:r>
-    </w:p>
-    <w:p>
-      <w:r>
-        <w:t>Practice in Lab 03. Evidence: Reviewed reply with owner and deadline; expected acceptance: Send remains a human action.</w:t>
+        <w:t>11. Word strategy memo</w:t>
+      </w:r>
+    </w:p>
+    <w:p>
+      <w:r>
+        <w:t>Business decision. Northstar Service starts with a synthetic service improvement brief. Draft a decision memo with Copilot in Word. The output is two-page strategy memo.</w:t>
+      </w:r>
+    </w:p>
+    <w:p>
+      <w:r>
+        <w:t>Copilot practice. 1. Open Copilot in Word and PowerPoint in the approved Microsoft 365 work environment, or open the synthetic case pack. 2. State the executive decision, audience, source and constraints. 3. Ask Copilot for the named output and request assumptions and uncertainties. 4. Compare material claims and figures with the supplied source. 5. Edit and save a human-owned decision artifact. The matching Lab 03 gives a copy-ready prompt and detailed steps.</w:t>
+      </w:r>
+    </w:p>
+    <w:p>
+      <w:r>
+        <w:t>Executive gate. Human executive signs the recommendation. Challenge the result if draft invents a savings figure. Record the decision owner and a corrective action.</w:t>
+      </w:r>
+    </w:p>
+    <w:p>
+      <w:r>
+        <w:t>Outcome measure. Verified material claims. State the baseline, cohort and period. Separate observed results from estimates before presenting value to a sponsor.</w:t>
+      </w:r>
+    </w:p>
+    <w:p>
+      <w:r>
+        <w:t>Practice in Lab 03. Evidence: Two-page strategy memo; expected acceptance: Human executive signs the recommendation.</w:t>
       </w:r>
     </w:p>
     <w:p>
@@ -729,32 +790,32 @@
         <w:pStyle w:val="Heading2"/>
       </w:pPr>
       <w:r>
-        <w:t>12. Teams meeting synthesis</w:t>
-      </w:r>
-    </w:p>
-    <w:p>
-      <w:r>
-        <w:t>Operational situation. Northstar Service starts with synthetic transcript with actions. The intended transformation is to extract decisions, dissent and open questions and produce action register with timestamps.</w:t>
-      </w:r>
-    </w:p>
-    <w:p>
-      <w:r>
-        <w:t>Procedure. 1. Open the relevant approved Microsoft 365 or Copilot Studio workspace, or the synthetic case record supplied in the lab. 2. Record the input and its owner. 3. Apply the transformation to a copy. 4. Compare the output with the source. 5. Log the reviewer, decision and date. Never claim a simulated configuration is a tenant deployment.</w:t>
-      </w:r>
-    </w:p>
-    <w:p>
-      <w:r>
-        <w:t>Control. Meeting owner confirms transcript accuracy. Diagnose a failure when speaker attribution is wrong. Preserve an input/output evidence trace and rerun the same test after correction.</w:t>
-      </w:r>
-    </w:p>
-    <w:p>
-      <w:r>
-        <w:t>Measure. Confirmed actions divided by extracted actions. Define numerator, denominator, time window and cohort before comparing a baseline with a pilot. Do not infer business value from activity counts alone.</w:t>
-      </w:r>
-    </w:p>
-    <w:p>
-      <w:r>
-        <w:t>Practice in Lab 03. Evidence: Action register with timestamps; expected acceptance: Meeting owner confirms transcript accuracy.</w:t>
+        <w:t>12. Recommendation logic</w:t>
+      </w:r>
+    </w:p>
+    <w:p>
+      <w:r>
+        <w:t>Business decision. Northstar Service starts with three options and a cost ceiling. Ask Copilot to test the logic of a recommendation. The output is recommendation with assumptions.</w:t>
+      </w:r>
+    </w:p>
+    <w:p>
+      <w:r>
+        <w:t>Copilot practice. 1. Open Copilot in Word and PowerPoint in the approved Microsoft 365 work environment, or open the synthetic case pack. 2. State the executive decision, audience, source and constraints. 3. Ask Copilot for the named output and request assumptions and uncertainties. 4. Compare material claims and figures with the supplied source. 5. Edit and save a human-owned decision artifact. The matching Lab 03 gives a copy-ready prompt and detailed steps.</w:t>
+      </w:r>
+    </w:p>
+    <w:p>
+      <w:r>
+        <w:t>Executive gate. State rejected alternatives and rationale. Challenge the result if trade-off is hidden. Record the decision owner and a corrective action.</w:t>
+      </w:r>
+    </w:p>
+    <w:p>
+      <w:r>
+        <w:t>Outcome measure. Board questions answered with evidence. State the baseline, cohort and period. Separate observed results from estimates before presenting value to a sponsor.</w:t>
+      </w:r>
+    </w:p>
+    <w:p>
+      <w:r>
+        <w:t>Practice in Lab 03. Evidence: Recommendation with assumptions; expected acceptance: State rejected alternatives and rationale.</w:t>
       </w:r>
     </w:p>
     <w:p>
@@ -762,47 +823,113 @@
         <w:pStyle w:val="Heading2"/>
       </w:pPr>
       <w:r>
-        <w:t>13. Adoption rollout</w:t>
-      </w:r>
-    </w:p>
-    <w:p>
-      <w:r>
-        <w:t>Operational situation. Northstar Service starts with three departments and pilot feedback. The intended transformation is to sequence champions, learning and support and produce 30-60-90 day rollout plan.</w:t>
-      </w:r>
-    </w:p>
-    <w:p>
-      <w:r>
-        <w:t>Procedure. 1. Open the relevant approved Microsoft 365 or Copilot Studio workspace, or the synthetic case record supplied in the lab. 2. Record the input and its owner. 3. Apply the transformation to a copy. 4. Compare the output with the source. 5. Log the reviewer, decision and date. Never claim a simulated configuration is a tenant deployment.</w:t>
-      </w:r>
-    </w:p>
-    <w:p>
-      <w:r>
-        <w:t>Control. Gate wave two on measured quality. Diagnose a failure when low adoption despite licenses. Preserve an input/output evidence trace and rerun the same test after correction.</w:t>
-      </w:r>
-    </w:p>
-    <w:p>
-      <w:r>
-        <w:t>Measure. Weekly active usage by cohort. Define numerator, denominator, time window and cohort before comparing a baseline with a pilot. Do not infer business value from activity counts alone.</w:t>
-      </w:r>
-    </w:p>
-    <w:p>
-      <w:r>
-        <w:t>Practice in Lab 03. Evidence: 30-60-90 day rollout plan; expected acceptance: Gate wave two on measured quality.</w:t>
-      </w:r>
-    </w:p>
-    <w:p>
-      <w:bookmarkStart w:id="98801" w:name="topic2"/>
+        <w:t>13. PowerPoint board story</w:t>
+      </w:r>
+    </w:p>
+    <w:p>
+      <w:r>
+        <w:t>Business decision. Northstar Service starts with approved strategy memo and metrics. Create a concise executive deck with Copilot in PowerPoint. The output is five-slide board narrative.</w:t>
+      </w:r>
+    </w:p>
+    <w:p>
+      <w:r>
+        <w:t>Copilot practice. 1. Open Copilot in Word and PowerPoint in the approved Microsoft 365 work environment, or open the synthetic case pack. 2. State the executive decision, audience, source and constraints. 3. Ask Copilot for the named output and request assumptions and uncertainties. 4. Compare material claims and figures with the supplied source. 5. Edit and save a human-owned decision artifact. The matching Lab 03 gives a copy-ready prompt and detailed steps.</w:t>
+      </w:r>
+    </w:p>
+    <w:p>
+      <w:r>
+        <w:t>Executive gate. Every chart traces to approved numbers. Challenge the result if slide claims exceed the source. Record the decision owner and a corrective action.</w:t>
+      </w:r>
+    </w:p>
+    <w:p>
+      <w:r>
+        <w:t>Outcome measure. Figures verified before review. State the baseline, cohort and period. Separate observed results from estimates before presenting value to a sponsor.</w:t>
+      </w:r>
+    </w:p>
+    <w:p>
+      <w:r>
+        <w:t>Practice in Lab 03. Evidence: Five-slide board narrative; expected acceptance: Every chart traces to approved numbers.</w:t>
+      </w:r>
+    </w:p>
+    <w:p>
+      <w:pPr>
+        <w:pStyle w:val="Heading2"/>
+      </w:pPr>
+      <w:r>
+        <w:t>14. Decision appendix</w:t>
+      </w:r>
+    </w:p>
+    <w:p>
+      <w:r>
+        <w:t>Business decision. Northstar Service starts with risk and sensitivity notes. Use Copilot to structure board Q&amp;A. The output is board appendix and question log.</w:t>
+      </w:r>
+    </w:p>
+    <w:p>
+      <w:r>
+        <w:t>Copilot practice. 1. Open Copilot in Word and PowerPoint in the approved Microsoft 365 work environment, or open the synthetic case pack. 2. State the executive decision, audience, source and constraints. 3. Ask Copilot for the named output and request assumptions and uncertainties. 4. Compare material claims and figures with the supplied source. 5. Edit and save a human-owned decision artifact. The matching Lab 03 gives a copy-ready prompt and detailed steps.</w:t>
+      </w:r>
+    </w:p>
+    <w:p>
+      <w:r>
+        <w:t>Executive gate. Distinguish evidence from assumptions. Challenge the result if appendix repeats unsupported claims. Record the decision owner and a corrective action.</w:t>
+      </w:r>
+    </w:p>
+    <w:p>
+      <w:r>
+        <w:t>Outcome measure. Questions with grounded answers. State the baseline, cohort and period. Separate observed results from estimates before presenting value to a sponsor.</w:t>
+      </w:r>
+    </w:p>
+    <w:p>
+      <w:r>
+        <w:t>Practice in Lab 03. Evidence: Board appendix and question log; expected acceptance: Distinguish evidence from assumptions.</w:t>
+      </w:r>
+    </w:p>
+    <w:p>
+      <w:pPr>
+        <w:pStyle w:val="Heading2"/>
+      </w:pPr>
+      <w:r>
+        <w:t>15. Leadership communication</w:t>
+      </w:r>
+    </w:p>
+    <w:p>
+      <w:r>
+        <w:t>Business decision. Northstar Service starts with approved board decision. Draft a leader message with Copilot in Outlook. The output is change announcement for review.</w:t>
+      </w:r>
+    </w:p>
+    <w:p>
+      <w:r>
+        <w:t>Copilot practice. 1. Open Copilot in Word and PowerPoint in the approved Microsoft 365 work environment, or open the synthetic case pack. 2. State the executive decision, audience, source and constraints. 3. Ask Copilot for the named output and request assumptions and uncertainties. 4. Compare material claims and figures with the supplied source. 5. Edit and save a human-owned decision artifact. The matching Lab 03 gives a copy-ready prompt and detailed steps.</w:t>
+      </w:r>
+    </w:p>
+    <w:p>
+      <w:r>
+        <w:t>Executive gate. No send until approved by sponsor. Challenge the result if message promises unapproved outcomes. Record the decision owner and a corrective action.</w:t>
+      </w:r>
+    </w:p>
+    <w:p>
+      <w:r>
+        <w:t>Outcome measure. Message comprehension in pilot survey. State the baseline, cohort and period. Separate observed results from estimates before presenting value to a sponsor.</w:t>
+      </w:r>
+    </w:p>
+    <w:p>
+      <w:r>
+        <w:t>Practice in Lab 03. Evidence: Change announcement for review; expected acceptance: No send until approved by sponsor.</w:t>
+      </w:r>
+    </w:p>
+    <w:p>
+      <w:bookmarkStart w:id="87669" w:name="topic2"/>
       <w:pPr>
         <w:pStyle w:val="Heading1"/>
       </w:pPr>
       <w:r>
-        <w:t>Topic 2: Microsoft Copilot Administration, Security and Responsible AI</w:t>
-      </w:r>
-      <w:bookmarkEnd w:id="98801"/>
-    </w:p>
-    <w:p>
-      <w:r>
-        <w:t>Learning outcome: LO2. Official reference: https://learn.microsoft.com/en-us/microsoft-copilot-studio/security-faq</w:t>
+        <w:t>Topic 2: Govern Copilot Use and Protect Business Decisions</w:t>
+      </w:r>
+      <w:bookmarkEnd w:id="87669"/>
+    </w:p>
+    <w:p>
+      <w:r>
+        <w:t>Learning outcome: LO2. Official reference: https://learn.microsoft.com/en-us/microsoft-365/copilot/copilot-controls/security-governance</w:t>
       </w:r>
     </w:p>
     <w:p>
@@ -810,32 +937,32 @@
         <w:pStyle w:val="Heading2"/>
       </w:pPr>
       <w:r>
-        <w:t>14. Identity and MFA</w:t>
-      </w:r>
-    </w:p>
-    <w:p>
-      <w:r>
-        <w:t>Operational situation. Northstar Service starts with user roles and sign-in policy. The intended transformation is to require appropriate identity assurance and produce conditional-access decision log.</w:t>
-      </w:r>
-    </w:p>
-    <w:p>
-      <w:r>
-        <w:t>Procedure. 1. Open the relevant approved Microsoft 365 or Copilot Studio workspace, or the synthetic case record supplied in the lab. 2. Record the input and its owner. 3. Apply the transformation to a copy. 4. Compare the output with the source. 5. Log the reviewer, decision and date. Never claim a simulated configuration is a tenant deployment.</w:t>
-      </w:r>
-    </w:p>
-    <w:p>
-      <w:r>
-        <w:t>Control. Security team owns exception process. Diagnose a failure when shared account bypasses attribution. Preserve an input/output evidence trace and rerun the same test after correction.</w:t>
-      </w:r>
-    </w:p>
-    <w:p>
-      <w:r>
-        <w:t>Measure. Protected sign-ins divided by sign-ins. Define numerator, denominator, time window and cohort before comparing a baseline with a pilot. Do not infer business value from activity counts alone.</w:t>
-      </w:r>
-    </w:p>
-    <w:p>
-      <w:r>
-        <w:t>Practice in Lab 03. Evidence: Conditional-access decision log; expected acceptance: Security team owns exception process.</w:t>
+        <w:t>16. Information boundary</w:t>
+      </w:r>
+    </w:p>
+    <w:p>
+      <w:r>
+        <w:t>Business decision. Northstar Service starts with synthetic confidential account file. Decide which content may be used with Copilot. The output is data-use decision table.</w:t>
+      </w:r>
+    </w:p>
+    <w:p>
+      <w:r>
+        <w:t>Copilot practice. 1. Open Microsoft Copilot Chat in the approved Microsoft 365 work environment, or open the synthetic case pack. 2. State the executive decision, audience, source and constraints. 3. Ask Copilot for the named output and request assumptions and uncertainties. 4. Compare material claims and figures with the supplied source. 5. Edit and save a human-owned decision artifact. The matching Lab 04 gives a copy-ready prompt and detailed steps.</w:t>
+      </w:r>
+    </w:p>
+    <w:p>
+      <w:r>
+        <w:t>Executive gate. Data owner approves permitted sources. Challenge the result if sensitive source is broadly shared. Record the decision owner and a corrective action.</w:t>
+      </w:r>
+    </w:p>
+    <w:p>
+      <w:r>
+        <w:t>Outcome measure. Restricted exposures found in review. State the baseline, cohort and period. Separate observed results from estimates before presenting value to a sponsor.</w:t>
+      </w:r>
+    </w:p>
+    <w:p>
+      <w:r>
+        <w:t>Practice in Lab 04. Evidence: Data-use decision table; expected acceptance: Data owner approves permitted sources.</w:t>
       </w:r>
     </w:p>
     <w:p>
@@ -843,32 +970,32 @@
         <w:pStyle w:val="Heading2"/>
       </w:pPr>
       <w:r>
-        <w:t>15. Sensitivity labels</w:t>
-      </w:r>
-    </w:p>
-    <w:p>
-      <w:r>
-        <w:t>Operational situation. Northstar Service starts with public, internal and confidential files. The intended transformation is to map labels to sharing and copilot exposure and produce label policy matrix.</w:t>
-      </w:r>
-    </w:p>
-    <w:p>
-      <w:r>
-        <w:t>Procedure. 1. Open the relevant approved Microsoft 365 or Copilot Studio workspace, or the synthetic case record supplied in the lab. 2. Record the input and its owner. 3. Apply the transformation to a copy. 4. Compare the output with the source. 5. Log the reviewer, decision and date. Never claim a simulated configuration is a tenant deployment.</w:t>
-      </w:r>
-    </w:p>
-    <w:p>
-      <w:r>
-        <w:t>Control. Data owner reviews label changes. Diagnose a failure when confidential file labelled public. Preserve an input/output evidence trace and rerun the same test after correction.</w:t>
-      </w:r>
-    </w:p>
-    <w:p>
-      <w:r>
-        <w:t>Measure. Mislabelled sampled files count. Define numerator, denominator, time window and cohort before comparing a baseline with a pilot. Do not infer business value from activity counts alone.</w:t>
-      </w:r>
-    </w:p>
-    <w:p>
-      <w:r>
-        <w:t>Practice in Lab 03. Evidence: Label policy matrix; expected acceptance: Data owner reviews label changes.</w:t>
+        <w:t>17. Permission reality</w:t>
+      </w:r>
+    </w:p>
+    <w:p>
+      <w:r>
+        <w:t>Business decision. Northstar Service starts with two roles with different access. Request the same summary under each approved identity. The output is access-test evidence record.</w:t>
+      </w:r>
+    </w:p>
+    <w:p>
+      <w:r>
+        <w:t>Copilot practice. 1. Open Microsoft Copilot Chat in the approved Microsoft 365 work environment, or open the synthetic case pack. 2. State the executive decision, audience, source and constraints. 3. Ask Copilot for the named output and request assumptions and uncertainties. 4. Compare material claims and figures with the supplied source. 5. Edit and save a human-owned decision artifact. The matching Lab 04 gives a copy-ready prompt and detailed steps.</w:t>
+      </w:r>
+    </w:p>
+    <w:p>
+      <w:r>
+        <w:t>Executive gate. Security owner reviews unexpected access. Challenge the result if user receives material outside role. Record the decision owner and a corrective action.</w:t>
+      </w:r>
+    </w:p>
+    <w:p>
+      <w:r>
+        <w:t>Outcome measure. Unexpected accessible files. State the baseline, cohort and period. Separate observed results from estimates before presenting value to a sponsor.</w:t>
+      </w:r>
+    </w:p>
+    <w:p>
+      <w:r>
+        <w:t>Practice in Lab 04. Evidence: Access-test evidence record; expected acceptance: Security owner reviews unexpected access.</w:t>
       </w:r>
     </w:p>
     <w:p>
@@ -876,32 +1003,32 @@
         <w:pStyle w:val="Heading2"/>
       </w:pPr>
       <w:r>
-        <w:t>16. DLP boundaries</w:t>
-      </w:r>
-    </w:p>
-    <w:p>
-      <w:r>
-        <w:t>Operational situation. Northstar Service starts with prompt containing synthetic account number. The intended transformation is to block or warn for restricted data movement and produce dlp test evidence.</w:t>
-      </w:r>
-    </w:p>
-    <w:p>
-      <w:r>
-        <w:t>Procedure. 1. Open the relevant approved Microsoft 365 or Copilot Studio workspace, or the synthetic case record supplied in the lab. 2. Record the input and its owner. 3. Apply the transformation to a copy. 4. Compare the output with the source. 5. Log the reviewer, decision and date. Never claim a simulated configuration is a tenant deployment.</w:t>
-      </w:r>
-    </w:p>
-    <w:p>
-      <w:r>
-        <w:t>Control. Policy owner approves exceptions. Diagnose a failure when sensitive output leaves approved boundary. Preserve an input/output evidence trace and rerun the same test after correction.</w:t>
-      </w:r>
-    </w:p>
-    <w:p>
-      <w:r>
-        <w:t>Measure. Blocked risky attempts per test set. Define numerator, denominator, time window and cohort before comparing a baseline with a pilot. Do not infer business value from activity counts alone.</w:t>
-      </w:r>
-    </w:p>
-    <w:p>
-      <w:r>
-        <w:t>Practice in Lab 04. Evidence: DLP test evidence; expected acceptance: Policy owner approves exceptions.</w:t>
+        <w:t>18. Source reliability</w:t>
+      </w:r>
+    </w:p>
+    <w:p>
+      <w:r>
+        <w:t>Business decision. Northstar Service starts with current and retired policies. Compare Copilot answer with authoritative source. The output is claim-verification worksheet.</w:t>
+      </w:r>
+    </w:p>
+    <w:p>
+      <w:r>
+        <w:t>Copilot practice. 1. Open Microsoft Copilot Chat in the approved Microsoft 365 work environment, or open the synthetic case pack. 2. State the executive decision, audience, source and constraints. 3. Ask Copilot for the named output and request assumptions and uncertainties. 4. Compare material claims and figures with the supplied source. 5. Edit and save a human-owned decision artifact. The matching Lab 04 gives a copy-ready prompt and detailed steps.</w:t>
+      </w:r>
+    </w:p>
+    <w:p>
+      <w:r>
+        <w:t>Executive gate. Reviewer checks every material statement. Challenge the result if retired policy cited as current. Record the decision owner and a corrective action.</w:t>
+      </w:r>
+    </w:p>
+    <w:p>
+      <w:r>
+        <w:t>Outcome measure. Supported claims divided by claims. State the baseline, cohort and period. Separate observed results from estimates before presenting value to a sponsor.</w:t>
+      </w:r>
+    </w:p>
+    <w:p>
+      <w:r>
+        <w:t>Practice in Lab 04. Evidence: Claim-verification worksheet; expected acceptance: Reviewer checks every material statement.</w:t>
       </w:r>
     </w:p>
     <w:p>
@@ -909,32 +1036,32 @@
         <w:pStyle w:val="Heading2"/>
       </w:pPr>
       <w:r>
-        <w:t>17. SharePoint oversharing</w:t>
-      </w:r>
-    </w:p>
-    <w:p>
-      <w:r>
-        <w:t>Operational situation. Northstar Service starts with site members, visitors and anonymous links. The intended transformation is to review inherited access and link types and produce remediation ticket list.</w:t>
-      </w:r>
-    </w:p>
-    <w:p>
-      <w:r>
-        <w:t>Procedure. 1. Open the relevant approved Microsoft 365 or Copilot Studio workspace, or the synthetic case record supplied in the lab. 2. Record the input and its owner. 3. Apply the transformation to a copy. 4. Compare the output with the source. 5. Log the reviewer, decision and date. Never claim a simulated configuration is a tenant deployment.</w:t>
-      </w:r>
-    </w:p>
-    <w:p>
-      <w:r>
-        <w:t>Control. Owner removes broad access before pilot. Diagnose a failure when copilot surfaces a broadly shared secret. Preserve an input/output evidence trace and rerun the same test after correction.</w:t>
-      </w:r>
-    </w:p>
-    <w:p>
-      <w:r>
-        <w:t>Measure. High-risk links remediated. Define numerator, denominator, time window and cohort before comparing a baseline with a pilot. Do not infer business value from activity counts alone.</w:t>
-      </w:r>
-    </w:p>
-    <w:p>
-      <w:r>
-        <w:t>Practice in Lab 04. Evidence: Remediation ticket list; expected acceptance: Owner removes broad access before pilot.</w:t>
+        <w:t>19. Human approval</w:t>
+      </w:r>
+    </w:p>
+    <w:p>
+      <w:r>
+        <w:t>Business decision. Northstar Service starts with draft external customer commitment. Assign a human approval point before release. The output is approval decision record.</w:t>
+      </w:r>
+    </w:p>
+    <w:p>
+      <w:r>
+        <w:t>Copilot practice. 1. Open Microsoft Copilot Chat in the approved Microsoft 365 work environment, or open the synthetic case pack. 2. State the executive decision, audience, source and constraints. 3. Ask Copilot for the named output and request assumptions and uncertainties. 4. Compare material claims and figures with the supplied source. 5. Edit and save a human-owned decision artifact. The matching Lab 04 gives a copy-ready prompt and detailed steps.</w:t>
+      </w:r>
+    </w:p>
+    <w:p>
+      <w:r>
+        <w:t>Executive gate. Named owner signs external commitment. Challenge the result if copilot text is sent without review. Record the decision owner and a corrective action.</w:t>
+      </w:r>
+    </w:p>
+    <w:p>
+      <w:r>
+        <w:t>Outcome measure. Unapproved external actions. State the baseline, cohort and period. Separate observed results from estimates before presenting value to a sponsor.</w:t>
+      </w:r>
+    </w:p>
+    <w:p>
+      <w:r>
+        <w:t>Practice in Lab 04. Evidence: Approval decision record; expected acceptance: Named owner signs external commitment.</w:t>
       </w:r>
     </w:p>
     <w:p>
@@ -942,32 +1069,32 @@
         <w:pStyle w:val="Heading2"/>
       </w:pPr>
       <w:r>
-        <w:t>18. Retention and records</w:t>
-      </w:r>
-    </w:p>
-    <w:p>
-      <w:r>
-        <w:t>Operational situation. Northstar Service starts with contract lifecycle and retention schedule. The intended transformation is to apply record class to source documents and produce retention decision table.</w:t>
-      </w:r>
-    </w:p>
-    <w:p>
-      <w:r>
-        <w:t>Procedure. 1. Open the relevant approved Microsoft 365 or Copilot Studio workspace, or the synthetic case record supplied in the lab. 2. Record the input and its owner. 3. Apply the transformation to a copy. 4. Compare the output with the source. 5. Log the reviewer, decision and date. Never claim a simulated configuration is a tenant deployment.</w:t>
-      </w:r>
-    </w:p>
-    <w:p>
-      <w:r>
-        <w:t>Control. Records officer approves disposal. Diagnose a failure when old draft retrieved as current policy. Preserve an input/output evidence trace and rerun the same test after correction.</w:t>
-      </w:r>
-    </w:p>
-    <w:p>
-      <w:r>
-        <w:t>Measure. Current-version retrieval rate. Define numerator, denominator, time window and cohort before comparing a baseline with a pilot. Do not infer business value from activity counts alone.</w:t>
-      </w:r>
-    </w:p>
-    <w:p>
-      <w:r>
-        <w:t>Practice in Lab 04. Evidence: Retention decision table; expected acceptance: Records officer approves disposal.</w:t>
+        <w:t>20. Responsible-use rule</w:t>
+      </w:r>
+    </w:p>
+    <w:p>
+      <w:r>
+        <w:t>Business decision. Northstar Service starts with a sensitive executive scenario. Draft a plain-language use rule in Word. The output is one-page responsible-use charter.</w:t>
+      </w:r>
+    </w:p>
+    <w:p>
+      <w:r>
+        <w:t>Copilot practice. 1. Open Microsoft Copilot Chat in the approved Microsoft 365 work environment, or open the synthetic case pack. 2. State the executive decision, audience, source and constraints. 3. Ask Copilot for the named output and request assumptions and uncertainties. 4. Compare material claims and figures with the supplied source. 5. Edit and save a human-owned decision artifact. The matching Lab 04 gives a copy-ready prompt and detailed steps.</w:t>
+      </w:r>
+    </w:p>
+    <w:p>
+      <w:r>
+        <w:t>Executive gate. Legal and risk owners approve wording. Challenge the result if charter is too vague to apply. Record the decision owner and a corrective action.</w:t>
+      </w:r>
+    </w:p>
+    <w:p>
+      <w:r>
+        <w:t>Outcome measure. Exceptions resolved within SLA. State the baseline, cohort and period. Separate observed results from estimates before presenting value to a sponsor.</w:t>
+      </w:r>
+    </w:p>
+    <w:p>
+      <w:r>
+        <w:t>Practice in Lab 04. Evidence: One-page responsible-use charter; expected acceptance: Legal and risk owners approve wording.</w:t>
       </w:r>
     </w:p>
     <w:p>
@@ -975,32 +1102,32 @@
         <w:pStyle w:val="Heading2"/>
       </w:pPr>
       <w:r>
-        <w:t>19. Audit event trail</w:t>
-      </w:r>
-    </w:p>
-    <w:p>
-      <w:r>
-        <w:t>Operational situation. Northstar Service starts with agent action and user identity. The intended transformation is to capture time, actor, source and action and produce traceable audit record.</w:t>
-      </w:r>
-    </w:p>
-    <w:p>
-      <w:r>
-        <w:t>Procedure. 1. Open the relevant approved Microsoft 365 or Copilot Studio workspace, or the synthetic case record supplied in the lab. 2. Record the input and its owner. 3. Apply the transformation to a copy. 4. Compare the output with the source. 5. Log the reviewer, decision and date. Never claim a simulated configuration is a tenant deployment.</w:t>
-      </w:r>
-    </w:p>
-    <w:p>
-      <w:r>
-        <w:t>Control. Admin preserves logs per policy. Diagnose a failure when action cannot be attributed to a user. Preserve an input/output evidence trace and rerun the same test after correction.</w:t>
-      </w:r>
-    </w:p>
-    <w:p>
-      <w:r>
-        <w:t>Measure. Trace-complete actions divided by actions. Define numerator, denominator, time window and cohort before comparing a baseline with a pilot. Do not infer business value from activity counts alone.</w:t>
-      </w:r>
-    </w:p>
-    <w:p>
-      <w:r>
-        <w:t>Practice in Lab 04. Evidence: Traceable audit record; expected acceptance: Admin preserves logs per policy.</w:t>
+        <w:t>21. Risk appetite</w:t>
+      </w:r>
+    </w:p>
+    <w:p>
+      <w:r>
+        <w:t>Business decision. Northstar Service starts with five use cases with different consequences. Rank harms, controls and owners with Copilot. The output is risk-tier matrix.</w:t>
+      </w:r>
+    </w:p>
+    <w:p>
+      <w:r>
+        <w:t>Copilot practice. 1. Open Copilot in Word in the approved Microsoft 365 work environment, or open the synthetic case pack. 2. State the executive decision, audience, source and constraints. 3. Ask Copilot for the named output and request assumptions and uncertainties. 4. Compare material claims and figures with the supplied source. 5. Edit and save a human-owned decision artifact. The matching Lab 05 gives a copy-ready prompt and detailed steps.</w:t>
+      </w:r>
+    </w:p>
+    <w:p>
+      <w:r>
+        <w:t>Executive gate. High-impact uses require stronger review. Challenge the result if all use cases share one weak gate. Record the decision owner and a corrective action.</w:t>
+      </w:r>
+    </w:p>
+    <w:p>
+      <w:r>
+        <w:t>Outcome measure. High-risk use cases with owner. State the baseline, cohort and period. Separate observed results from estimates before presenting value to a sponsor.</w:t>
+      </w:r>
+    </w:p>
+    <w:p>
+      <w:r>
+        <w:t>Practice in Lab 05. Evidence: Risk-tier matrix; expected acceptance: High-impact uses require stronger review.</w:t>
       </w:r>
     </w:p>
     <w:p>
@@ -1008,32 +1135,32 @@
         <w:pStyle w:val="Heading2"/>
       </w:pPr>
       <w:r>
-        <w:t>20. Prompt-injection boundary</w:t>
-      </w:r>
-    </w:p>
-    <w:p>
-      <w:r>
-        <w:t>Operational situation. Northstar Service starts with document with an embedded hostile instruction. The intended transformation is to treat retrieved text as data, not instruction and produce injection test and refusal trace.</w:t>
-      </w:r>
-    </w:p>
-    <w:p>
-      <w:r>
-        <w:t>Procedure. 1. Open the relevant approved Microsoft 365 or Copilot Studio workspace, or the synthetic case record supplied in the lab. 2. Record the input and its owner. 3. Apply the transformation to a copy. 4. Compare the output with the source. 5. Log the reviewer, decision and date. Never claim a simulated configuration is a tenant deployment.</w:t>
-      </w:r>
-    </w:p>
-    <w:p>
-      <w:r>
-        <w:t>Control. Tool action requires explicit authorization. Diagnose a failure when agent follows source text as a command. Preserve an input/output evidence trace and rerun the same test after correction.</w:t>
-      </w:r>
-    </w:p>
-    <w:p>
-      <w:r>
-        <w:t>Measure. Injected commands ignored per test set. Define numerator, denominator, time window and cohort before comparing a baseline with a pilot. Do not infer business value from activity counts alone.</w:t>
-      </w:r>
-    </w:p>
-    <w:p>
-      <w:r>
-        <w:t>Practice in Lab 04. Evidence: Injection test and refusal trace; expected acceptance: Tool action requires explicit authorization.</w:t>
+        <w:t>22. Incident response</w:t>
+      </w:r>
+    </w:p>
+    <w:p>
+      <w:r>
+        <w:t>Business decision. Northstar Service starts with synthetic disclosure near miss. Ask Copilot to organise facts and response options. The output is incident decision timeline.</w:t>
+      </w:r>
+    </w:p>
+    <w:p>
+      <w:r>
+        <w:t>Copilot practice. 1. Open Copilot in Word in the approved Microsoft 365 work environment, or open the synthetic case pack. 2. State the executive decision, audience, source and constraints. 3. Ask Copilot for the named output and request assumptions and uncertainties. 4. Compare material claims and figures with the supplied source. 5. Edit and save a human-owned decision artifact. The matching Lab 05 gives a copy-ready prompt and detailed steps.</w:t>
+      </w:r>
+    </w:p>
+    <w:p>
+      <w:r>
+        <w:t>Executive gate. Security owner determines escalation. Challenge the result if evidence is lost or blame is assigned early. Record the decision owner and a corrective action.</w:t>
+      </w:r>
+    </w:p>
+    <w:p>
+      <w:r>
+        <w:t>Outcome measure. Time to containment. State the baseline, cohort and period. Separate observed results from estimates before presenting value to a sponsor.</w:t>
+      </w:r>
+    </w:p>
+    <w:p>
+      <w:r>
+        <w:t>Practice in Lab 05. Evidence: Incident decision timeline; expected acceptance: Security owner determines escalation.</w:t>
       </w:r>
     </w:p>
     <w:p>
@@ -1041,32 +1168,32 @@
         <w:pStyle w:val="Heading2"/>
       </w:pPr>
       <w:r>
-        <w:t>21. Fabrication review</w:t>
-      </w:r>
-    </w:p>
-    <w:p>
-      <w:r>
-        <w:t>Operational situation. Northstar Service starts with answer with five factual claims. The intended transformation is to check each claim against current citations and produce claim-verification worksheet.</w:t>
-      </w:r>
-    </w:p>
-    <w:p>
-      <w:r>
-        <w:t>Procedure. 1. Open the relevant approved Microsoft 365 or Copilot Studio workspace, or the synthetic case record supplied in the lab. 2. Record the input and its owner. 3. Apply the transformation to a copy. 4. Compare the output with the source. 5. Log the reviewer, decision and date. Never claim a simulated configuration is a tenant deployment.</w:t>
-      </w:r>
-    </w:p>
-    <w:p>
-      <w:r>
-        <w:t>Control. Human reviewer signs high-impact output. Diagnose a failure when plausible unsupported number survives. Preserve an input/output evidence trace and rerun the same test after correction.</w:t>
-      </w:r>
-    </w:p>
-    <w:p>
-      <w:r>
-        <w:t>Measure. Supported claims divided by claims. Define numerator, denominator, time window and cohort before comparing a baseline with a pilot. Do not infer business value from activity counts alone.</w:t>
-      </w:r>
-    </w:p>
-    <w:p>
-      <w:r>
-        <w:t>Practice in Lab 05. Evidence: Claim-verification worksheet; expected acceptance: Human reviewer signs high-impact output.</w:t>
+        <w:t>23. Quality challenge</w:t>
+      </w:r>
+    </w:p>
+    <w:p>
+      <w:r>
+        <w:t>Business decision. Northstar Service starts with confident answer with two errors. Use Copilot as a critic, then verify manually. The output is red-team finding and correction.</w:t>
+      </w:r>
+    </w:p>
+    <w:p>
+      <w:r>
+        <w:t>Copilot practice. 1. Open Copilot in Word in the approved Microsoft 365 work environment, or open the synthetic case pack. 2. State the executive decision, audience, source and constraints. 3. Ask Copilot for the named output and request assumptions and uncertainties. 4. Compare material claims and figures with the supplied source. 5. Edit and save a human-owned decision artifact. The matching Lab 05 gives a copy-ready prompt and detailed steps.</w:t>
+      </w:r>
+    </w:p>
+    <w:p>
+      <w:r>
+        <w:t>Executive gate. Release only after material errors corrected. Challenge the result if fluent answer is treated as proof. Record the decision owner and a corrective action.</w:t>
+      </w:r>
+    </w:p>
+    <w:p>
+      <w:r>
+        <w:t>Outcome measure. Critical errors per review set. State the baseline, cohort and period. Separate observed results from estimates before presenting value to a sponsor.</w:t>
+      </w:r>
+    </w:p>
+    <w:p>
+      <w:r>
+        <w:t>Practice in Lab 05. Evidence: Red-team finding and correction; expected acceptance: Release only after material errors corrected.</w:t>
       </w:r>
     </w:p>
     <w:p>
@@ -1074,32 +1201,32 @@
         <w:pStyle w:val="Heading2"/>
       </w:pPr>
       <w:r>
-        <w:t>22. Tool permission design</w:t>
-      </w:r>
-    </w:p>
-    <w:p>
-      <w:r>
-        <w:t>Operational situation. Northstar Service starts with read and write connector scopes. The intended transformation is to separate read-only pilot from write actions and produce permission grant register.</w:t>
-      </w:r>
-    </w:p>
-    <w:p>
-      <w:r>
-        <w:t>Procedure. 1. Open the relevant approved Microsoft 365 or Copilot Studio workspace, or the synthetic case record supplied in the lab. 2. Record the input and its owner. 3. Apply the transformation to a copy. 4. Compare the output with the source. 5. Log the reviewer, decision and date. Never claim a simulated configuration is a tenant deployment.</w:t>
-      </w:r>
-    </w:p>
-    <w:p>
-      <w:r>
-        <w:t>Control. Entra admin consents only minimum scope. Diagnose a failure when write tool used in a read workflow. Preserve an input/output evidence trace and rerun the same test after correction.</w:t>
-      </w:r>
-    </w:p>
-    <w:p>
-      <w:r>
-        <w:t>Measure. Unused privileged grants count. Define numerator, denominator, time window and cohort before comparing a baseline with a pilot. Do not infer business value from activity counts alone.</w:t>
-      </w:r>
-    </w:p>
-    <w:p>
-      <w:r>
-        <w:t>Practice in Lab 05. Evidence: Permission grant register; expected acceptance: Entra admin consents only minimum scope.</w:t>
+        <w:t>24. Policy ownership</w:t>
+      </w:r>
+    </w:p>
+    <w:p>
+      <w:r>
+        <w:t>Business decision. Northstar Service starts with business, it, legal and hr responsibilities. Draft a RACI with Copilot. The output is governance raci.</w:t>
+      </w:r>
+    </w:p>
+    <w:p>
+      <w:r>
+        <w:t>Copilot practice. 1. Open Copilot in Word in the approved Microsoft 365 work environment, or open the synthetic case pack. 2. State the executive decision, audience, source and constraints. 3. Ask Copilot for the named output and request assumptions and uncertainties. 4. Compare material claims and figures with the supplied source. 5. Edit and save a human-owned decision artifact. The matching Lab 05 gives a copy-ready prompt and detailed steps.</w:t>
+      </w:r>
+    </w:p>
+    <w:p>
+      <w:r>
+        <w:t>Executive gate. No control lacks a decision owner. Challenge the result if everyone assumes it owns content quality. Record the decision owner and a corrective action.</w:t>
+      </w:r>
+    </w:p>
+    <w:p>
+      <w:r>
+        <w:t>Outcome measure. Controls with named owners. State the baseline, cohort and period. Separate observed results from estimates before presenting value to a sponsor.</w:t>
+      </w:r>
+    </w:p>
+    <w:p>
+      <w:r>
+        <w:t>Practice in Lab 05. Evidence: Governance RACI; expected acceptance: No control lacks a decision owner.</w:t>
       </w:r>
     </w:p>
     <w:p>
@@ -1107,32 +1234,47 @@
         <w:pStyle w:val="Heading2"/>
       </w:pPr>
       <w:r>
-        <w:t>23. Environment policy</w:t>
-      </w:r>
-    </w:p>
-    <w:p>
-      <w:r>
-        <w:t>Operational situation. Northstar Service starts with dev, test and production environments. The intended transformation is to apply connector and publishing policy and produce environment control matrix.</w:t>
-      </w:r>
-    </w:p>
-    <w:p>
-      <w:r>
-        <w:t>Procedure. 1. Open the relevant approved Microsoft 365 or Copilot Studio workspace, or the synthetic case record supplied in the lab. 2. Record the input and its owner. 3. Apply the transformation to a copy. 4. Compare the output with the source. 5. Log the reviewer, decision and date. Never claim a simulated configuration is a tenant deployment.</w:t>
-      </w:r>
-    </w:p>
-    <w:p>
-      <w:r>
-        <w:t>Control. Promote only after test evidence. Diagnose a failure when maker publishes from unrestricted default. Preserve an input/output evidence trace and rerun the same test after correction.</w:t>
-      </w:r>
-    </w:p>
-    <w:p>
-      <w:r>
-        <w:t>Measure. Policy violations by environment. Define numerator, denominator, time window and cohort before comparing a baseline with a pilot. Do not infer business value from activity counts alone.</w:t>
-      </w:r>
-    </w:p>
-    <w:p>
-      <w:r>
-        <w:t>Practice in Lab 05. Evidence: Environment control matrix; expected acceptance: Promote only after test evidence.</w:t>
+        <w:t>25. Board assurance</w:t>
+      </w:r>
+    </w:p>
+    <w:p>
+      <w:r>
+        <w:t>Business decision. Northstar Service starts with pilot results and unresolved risks. Summarise assurance evidence with Copilot. The output is board risk-and-control dashboard.</w:t>
+      </w:r>
+    </w:p>
+    <w:p>
+      <w:r>
+        <w:t>Copilot practice. 1. Open Copilot in Word in the approved Microsoft 365 work environment, or open the synthetic case pack. 2. State the executive decision, audience, source and constraints. 3. Ask Copilot for the named output and request assumptions and uncertainties. 4. Compare material claims and figures with the supplied source. 5. Edit and save a human-owned decision artifact. The matching Lab 05 gives a copy-ready prompt and detailed steps.</w:t>
+      </w:r>
+    </w:p>
+    <w:p>
+      <w:r>
+        <w:t>Executive gate. Disclose unresolved material risks. Challenge the result if green status masks a severe issue. Record the decision owner and a corrective action.</w:t>
+      </w:r>
+    </w:p>
+    <w:p>
+      <w:r>
+        <w:t>Outcome measure. Critical issues overdue. State the baseline, cohort and period. Separate observed results from estimates before presenting value to a sponsor.</w:t>
+      </w:r>
+    </w:p>
+    <w:p>
+      <w:r>
+        <w:t>Practice in Lab 05. Evidence: Board risk-and-control dashboard; expected acceptance: Disclose unresolved material risks.</w:t>
+      </w:r>
+    </w:p>
+    <w:p>
+      <w:bookmarkStart w:id="59967" w:name="topic3"/>
+      <w:pPr>
+        <w:pStyle w:val="Heading1"/>
+      </w:pPr>
+      <w:r>
+        <w:t>Topic 3: Integrate Copilot into the Executive Operating Model</w:t>
+      </w:r>
+      <w:bookmarkEnd w:id="59967"/>
+    </w:p>
+    <w:p>
+      <w:r>
+        <w:t>Learning outcome: LO3. Official reference: https://support.microsoft.com/en-us/microsoft-365-copilot/get-started-writing-prompts-in-microsoft-365-copilot</w:t>
       </w:r>
     </w:p>
     <w:p>
@@ -1140,32 +1282,32 @@
         <w:pStyle w:val="Heading2"/>
       </w:pPr>
       <w:r>
-        <w:t>24. Incident response</w:t>
-      </w:r>
-    </w:p>
-    <w:p>
-      <w:r>
-        <w:t>Operational situation. Northstar Service starts with synthetic disclosure report. The intended transformation is to contain, preserve evidence, notify owner and produce incident timeline and action log.</w:t>
-      </w:r>
-    </w:p>
-    <w:p>
-      <w:r>
-        <w:t>Procedure. 1. Open the relevant approved Microsoft 365 or Copilot Studio workspace, or the synthetic case record supplied in the lab. 2. Record the input and its owner. 3. Apply the transformation to a copy. 4. Compare the output with the source. 5. Log the reviewer, decision and date. Never claim a simulated configuration is a tenant deployment.</w:t>
-      </w:r>
-    </w:p>
-    <w:p>
-      <w:r>
-        <w:t>Control. Security owner determines escalation. Diagnose a failure when evidence lost during agent disable. Preserve an input/output evidence trace and rerun the same test after correction.</w:t>
-      </w:r>
-    </w:p>
-    <w:p>
-      <w:r>
-        <w:t>Measure. Time to containment in minutes. Define numerator, denominator, time window and cohort before comparing a baseline with a pilot. Do not infer business value from activity counts alone.</w:t>
-      </w:r>
-    </w:p>
-    <w:p>
-      <w:r>
-        <w:t>Practice in Lab 05. Evidence: Incident timeline and action log; expected acceptance: Security owner determines escalation.</w:t>
+        <w:t>26. Executive meeting</w:t>
+      </w:r>
+    </w:p>
+    <w:p>
+      <w:r>
+        <w:t>Business decision. Northstar Service starts with synthetic leadership meeting transcript. Use Copilot in Teams to extract decisions and dissent. The output is decision and action log.</w:t>
+      </w:r>
+    </w:p>
+    <w:p>
+      <w:r>
+        <w:t>Copilot practice. 1. Open Copilot in Teams and Outlook in the approved Microsoft 365 work environment, or open the synthetic case pack. 2. State the executive decision, audience, source and constraints. 3. Ask Copilot for the named output and request assumptions and uncertainties. 4. Compare material claims and figures with the supplied source. 5. Edit and save a human-owned decision artifact. The matching Lab 06 gives a copy-ready prompt and detailed steps.</w:t>
+      </w:r>
+    </w:p>
+    <w:p>
+      <w:r>
+        <w:t>Executive gate. Chair validates speaker and decision. Challenge the result if ai assigns an action to wrong owner. Record the decision owner and a corrective action.</w:t>
+      </w:r>
+    </w:p>
+    <w:p>
+      <w:r>
+        <w:t>Outcome measure. Confirmed actions divided by extracted. State the baseline, cohort and period. Separate observed results from estimates before presenting value to a sponsor.</w:t>
+      </w:r>
+    </w:p>
+    <w:p>
+      <w:r>
+        <w:t>Practice in Lab 06. Evidence: Decision and action log; expected acceptance: Chair validates speaker and decision.</w:t>
       </w:r>
     </w:p>
     <w:p>
@@ -1173,47 +1315,311 @@
         <w:pStyle w:val="Heading2"/>
       </w:pPr>
       <w:r>
-        <w:t>25. Human decision gate</w:t>
-      </w:r>
-    </w:p>
-    <w:p>
-      <w:r>
-        <w:t>Operational situation. Northstar Service starts with draft customer refund recommendation. The intended transformation is to require reviewer before irreversible action and produce approval record with rationale.</w:t>
-      </w:r>
-    </w:p>
-    <w:p>
-      <w:r>
-        <w:t>Procedure. 1. Open the relevant approved Microsoft 365 or Copilot Studio workspace, or the synthetic case record supplied in the lab. 2. Record the input and its owner. 3. Apply the transformation to a copy. 4. Compare the output with the source. 5. Log the reviewer, decision and date. Never claim a simulated configuration is a tenant deployment.</w:t>
-      </w:r>
-    </w:p>
-    <w:p>
-      <w:r>
-        <w:t>Control. Named business owner signs release. Diagnose a failure when workflow auto-issues refund. Preserve an input/output evidence trace and rerun the same test after correction.</w:t>
-      </w:r>
-    </w:p>
-    <w:p>
-      <w:r>
-        <w:t>Measure. Unapproved actions count. Define numerator, denominator, time window and cohort before comparing a baseline with a pilot. Do not infer business value from activity counts alone.</w:t>
-      </w:r>
-    </w:p>
-    <w:p>
-      <w:r>
-        <w:t>Practice in Lab 05. Evidence: Approval record with rationale; expected acceptance: Named business owner signs release.</w:t>
-      </w:r>
-    </w:p>
-    <w:p>
-      <w:bookmarkStart w:id="14835" w:name="topic3"/>
+        <w:t>27. Outlook decision flow</w:t>
+      </w:r>
+    </w:p>
+    <w:p>
+      <w:r>
+        <w:t>Business decision. Northstar Service starts with a crowded executive email thread. Use Copilot in Outlook to summarise asks and deadlines. The output is prioritised response draft.</w:t>
+      </w:r>
+    </w:p>
+    <w:p>
+      <w:r>
+        <w:t>Copilot practice. 1. Open Copilot in Teams and Outlook in the approved Microsoft 365 work environment, or open the synthetic case pack. 2. State the executive decision, audience, source and constraints. 3. Ask Copilot for the named output and request assumptions and uncertainties. 4. Compare material claims and figures with the supplied source. 5. Edit and save a human-owned decision artifact. The matching Lab 06 gives a copy-ready prompt and detailed steps.</w:t>
+      </w:r>
+    </w:p>
+    <w:p>
+      <w:r>
+        <w:t>Executive gate. Executive reviews tone and commitments. Challenge the result if reply contains a false promise. Record the decision owner and a corrective action.</w:t>
+      </w:r>
+    </w:p>
+    <w:p>
+      <w:r>
+        <w:t>Outcome measure. Decisions made before deadline. State the baseline, cohort and period. Separate observed results from estimates before presenting value to a sponsor.</w:t>
+      </w:r>
+    </w:p>
+    <w:p>
+      <w:r>
+        <w:t>Practice in Lab 06. Evidence: Prioritised response draft; expected acceptance: Executive reviews tone and commitments.</w:t>
+      </w:r>
+    </w:p>
+    <w:p>
+      <w:pPr>
+        <w:pStyle w:val="Heading2"/>
+      </w:pPr>
+      <w:r>
+        <w:t>28. Cross-functional handoff</w:t>
+      </w:r>
+    </w:p>
+    <w:p>
+      <w:r>
+        <w:t>Business decision. Northstar Service starts with service and finance joint request. Ask Copilot to map handoffs and delays. The output is future-state handoff map.</w:t>
+      </w:r>
+    </w:p>
+    <w:p>
+      <w:r>
+        <w:t>Copilot practice. 1. Open Copilot in Teams and Outlook in the approved Microsoft 365 work environment, or open the synthetic case pack. 2. State the executive decision, audience, source and constraints. 3. Ask Copilot for the named output and request assumptions and uncertainties. 4. Compare material claims and figures with the supplied source. 5. Edit and save a human-owned decision artifact. The matching Lab 06 gives a copy-ready prompt and detailed steps.</w:t>
+      </w:r>
+    </w:p>
+    <w:p>
+      <w:r>
+        <w:t>Executive gate. Keep accountable human at each gate. Challenge the result if ai summary blurs ownership. Record the decision owner and a corrective action.</w:t>
+      </w:r>
+    </w:p>
+    <w:p>
+      <w:r>
+        <w:t>Outcome measure. Handoff time reduction. State the baseline, cohort and period. Separate observed results from estimates before presenting value to a sponsor.</w:t>
+      </w:r>
+    </w:p>
+    <w:p>
+      <w:r>
+        <w:t>Practice in Lab 06. Evidence: Future-state handoff map; expected acceptance: Keep accountable human at each gate.</w:t>
+      </w:r>
+    </w:p>
+    <w:p>
+      <w:pPr>
+        <w:pStyle w:val="Heading2"/>
+      </w:pPr>
+      <w:r>
+        <w:t>29. Copilot integration choice</w:t>
+      </w:r>
+    </w:p>
+    <w:p>
+      <w:r>
+        <w:t>Business decision. Northstar Service starts with microsoft 365 and line-of-business options. Compare use-as-is, extend and build choices. The output is integration decision card.</w:t>
+      </w:r>
+    </w:p>
+    <w:p>
+      <w:r>
+        <w:t>Copilot practice. 1. Open Copilot in Teams and Outlook in the approved Microsoft 365 work environment, or open the synthetic case pack. 2. State the executive decision, audience, source and constraints. 3. Ask Copilot for the named output and request assumptions and uncertainties. 4. Compare material claims and figures with the supplied source. 5. Edit and save a human-owned decision artifact. The matching Lab 06 gives a copy-ready prompt and detailed steps.</w:t>
+      </w:r>
+    </w:p>
+    <w:p>
+      <w:r>
+        <w:t>Executive gate. Sponsor accepts cost and risk trade-off. Challenge the result if custom build is chosen without need. Record the decision owner and a corrective action.</w:t>
+      </w:r>
+    </w:p>
+    <w:p>
+      <w:r>
+        <w:t>Outcome measure. Business fit score per option. State the baseline, cohort and period. Separate observed results from estimates before presenting value to a sponsor.</w:t>
+      </w:r>
+    </w:p>
+    <w:p>
+      <w:r>
+        <w:t>Practice in Lab 06. Evidence: Integration decision card; expected acceptance: Sponsor accepts cost and risk trade-off.</w:t>
+      </w:r>
+    </w:p>
+    <w:p>
+      <w:pPr>
+        <w:pStyle w:val="Heading2"/>
+      </w:pPr>
+      <w:r>
+        <w:t>30. Agent opportunity</w:t>
+      </w:r>
+    </w:p>
+    <w:p>
+      <w:r>
+        <w:t>Business decision. Northstar Service starts with a repeatable policy-answer task. Describe where a bounded agent may help. The output is agent opportunity brief.</w:t>
+      </w:r>
+    </w:p>
+    <w:p>
+      <w:r>
+        <w:t>Copilot practice. 1. Open Copilot in Teams and Outlook in the approved Microsoft 365 work environment, or open the synthetic case pack. 2. State the executive decision, audience, source and constraints. 3. Ask Copilot for the named output and request assumptions and uncertainties. 4. Compare material claims and figures with the supplied source. 5. Edit and save a human-owned decision artifact. The matching Lab 06 gives a copy-ready prompt and detailed steps.</w:t>
+      </w:r>
+    </w:p>
+    <w:p>
+      <w:r>
+        <w:t>Executive gate. Do not automate irreversible decisions. Challenge the result if agent scope expands beyond approval. Record the decision owner and a corrective action.</w:t>
+      </w:r>
+    </w:p>
+    <w:p>
+      <w:r>
+        <w:t>Outcome measure. In-scope resolution rate. State the baseline, cohort and period. Separate observed results from estimates before presenting value to a sponsor.</w:t>
+      </w:r>
+    </w:p>
+    <w:p>
+      <w:r>
+        <w:t>Practice in Lab 06. Evidence: Agent opportunity brief; expected acceptance: Do not automate irreversible decisions.</w:t>
+      </w:r>
+    </w:p>
+    <w:p>
+      <w:pPr>
+        <w:pStyle w:val="Heading2"/>
+      </w:pPr>
+      <w:r>
+        <w:t>31. Vendor and partner review</w:t>
+      </w:r>
+    </w:p>
+    <w:p>
+      <w:r>
+        <w:t>Business decision. Northstar Service starts with three proposed ai service options. Use Copilot to structure a due-diligence checklist. The output is partner decision matrix.</w:t>
+      </w:r>
+    </w:p>
+    <w:p>
+      <w:r>
+        <w:t>Copilot practice. 1. Open Microsoft Copilot Chat and Word in the approved Microsoft 365 work environment, or open the synthetic case pack. 2. State the executive decision, audience, source and constraints. 3. Ask Copilot for the named output and request assumptions and uncertainties. 4. Compare material claims and figures with the supplied source. 5. Edit and save a human-owned decision artifact. The matching Lab 07 gives a copy-ready prompt and detailed steps.</w:t>
+      </w:r>
+    </w:p>
+    <w:p>
+      <w:r>
+        <w:t>Executive gate. Verify contractual and data claims. Challenge the result if marketing claims become evidence. Record the decision owner and a corrective action.</w:t>
+      </w:r>
+    </w:p>
+    <w:p>
+      <w:r>
+        <w:t>Outcome measure. Requirements with verified proof. State the baseline, cohort and period. Separate observed results from estimates before presenting value to a sponsor.</w:t>
+      </w:r>
+    </w:p>
+    <w:p>
+      <w:r>
+        <w:t>Practice in Lab 07. Evidence: Partner decision matrix; expected acceptance: Verify contractual and data claims.</w:t>
+      </w:r>
+    </w:p>
+    <w:p>
+      <w:pPr>
+        <w:pStyle w:val="Heading2"/>
+      </w:pPr>
+      <w:r>
+        <w:t>32. Pilot operating model</w:t>
+      </w:r>
+    </w:p>
+    <w:p>
+      <w:r>
+        <w:t>Business decision. Northstar Service starts with 30-seat cross-functional cohort. Draft roles, support and review cadence. The output is pilot operating charter.</w:t>
+      </w:r>
+    </w:p>
+    <w:p>
+      <w:r>
+        <w:t>Copilot practice. 1. Open Microsoft Copilot Chat and Word in the approved Microsoft 365 work environment, or open the synthetic case pack. 2. State the executive decision, audience, source and constraints. 3. Ask Copilot for the named output and request assumptions and uncertainties. 4. Compare material claims and figures with the supplied source. 5. Edit and save a human-owned decision artifact. The matching Lab 07 gives a copy-ready prompt and detailed steps.</w:t>
+      </w:r>
+    </w:p>
+    <w:p>
+      <w:r>
+        <w:t>Executive gate. Sponsor, data owner and risk lead sign off. Challenge the result if pilot has licences but no support. Record the decision owner and a corrective action.</w:t>
+      </w:r>
+    </w:p>
+    <w:p>
+      <w:r>
+        <w:t>Outcome measure. Weekly active pilot users. State the baseline, cohort and period. Separate observed results from estimates before presenting value to a sponsor.</w:t>
+      </w:r>
+    </w:p>
+    <w:p>
+      <w:r>
+        <w:t>Practice in Lab 07. Evidence: Pilot operating charter; expected acceptance: Sponsor, data owner and risk lead sign off.</w:t>
+      </w:r>
+    </w:p>
+    <w:p>
+      <w:pPr>
+        <w:pStyle w:val="Heading2"/>
+      </w:pPr>
+      <w:r>
+        <w:t>33. Leadership role modelling</w:t>
+      </w:r>
+    </w:p>
+    <w:p>
+      <w:r>
+        <w:t>Business decision. Northstar Service starts with three executive work patterns. Use Copilot to select visible leader practices. The output is leader demonstration plan.</w:t>
+      </w:r>
+    </w:p>
+    <w:p>
+      <w:r>
+        <w:t>Copilot practice. 1. Open Microsoft Copilot Chat and Word in the approved Microsoft 365 work environment, or open the synthetic case pack. 2. State the executive decision, audience, source and constraints. 3. Ask Copilot for the named output and request assumptions and uncertainties. 4. Compare material claims and figures with the supplied source. 5. Edit and save a human-owned decision artifact. The matching Lab 07 gives a copy-ready prompt and detailed steps.</w:t>
+      </w:r>
+    </w:p>
+    <w:p>
+      <w:r>
+        <w:t>Executive gate. Leader shows reviewed outputs and limits. Challenge the result if leader promotes unverified output. Record the decision owner and a corrective action.</w:t>
+      </w:r>
+    </w:p>
+    <w:p>
+      <w:r>
+        <w:t>Outcome measure. Leaders demonstrating weekly. State the baseline, cohort and period. Separate observed results from estimates before presenting value to a sponsor.</w:t>
+      </w:r>
+    </w:p>
+    <w:p>
+      <w:r>
+        <w:t>Practice in Lab 07. Evidence: Leader demonstration plan; expected acceptance: Leader shows reviewed outputs and limits.</w:t>
+      </w:r>
+    </w:p>
+    <w:p>
+      <w:pPr>
+        <w:pStyle w:val="Heading2"/>
+      </w:pPr>
+      <w:r>
+        <w:t>34. Change communication</w:t>
+      </w:r>
+    </w:p>
+    <w:p>
+      <w:r>
+        <w:t>Business decision. Northstar Service starts with employee concerns and benefits. Draft FAQ and manager briefing in Word. The output is change narrative and faq.</w:t>
+      </w:r>
+    </w:p>
+    <w:p>
+      <w:r>
+        <w:t>Copilot practice. 1. Open Microsoft Copilot Chat and Word in the approved Microsoft 365 work environment, or open the synthetic case pack. 2. State the executive decision, audience, source and constraints. 3. Ask Copilot for the named output and request assumptions and uncertainties. 4. Compare material claims and figures with the supplied source. 5. Edit and save a human-owned decision artifact. The matching Lab 07 gives a copy-ready prompt and detailed steps.</w:t>
+      </w:r>
+    </w:p>
+    <w:p>
+      <w:r>
+        <w:t>Executive gate. Include limits and escalation route. Challenge the result if message implies job replacement decision. Record the decision owner and a corrective action.</w:t>
+      </w:r>
+    </w:p>
+    <w:p>
+      <w:r>
+        <w:t>Outcome measure. Employee understanding score. State the baseline, cohort and period. Separate observed results from estimates before presenting value to a sponsor.</w:t>
+      </w:r>
+    </w:p>
+    <w:p>
+      <w:r>
+        <w:t>Practice in Lab 07. Evidence: Change narrative and FAQ; expected acceptance: Include limits and escalation route.</w:t>
+      </w:r>
+    </w:p>
+    <w:p>
+      <w:pPr>
+        <w:pStyle w:val="Heading2"/>
+      </w:pPr>
+      <w:r>
+        <w:t>35. Decision escalation</w:t>
+      </w:r>
+    </w:p>
+    <w:p>
+      <w:r>
+        <w:t>Business decision. Northstar Service starts with pilot issue affecting customer outcome. Map pause, fix and restart decisions. The output is escalation playbook.</w:t>
+      </w:r>
+    </w:p>
+    <w:p>
+      <w:r>
+        <w:t>Copilot practice. 1. Open Microsoft Copilot Chat and Word in the approved Microsoft 365 work environment, or open the synthetic case pack. 2. State the executive decision, audience, source and constraints. 3. Ask Copilot for the named output and request assumptions and uncertainties. 4. Compare material claims and figures with the supplied source. 5. Edit and save a human-owned decision artifact. The matching Lab 07 gives a copy-ready prompt and detailed steps.</w:t>
+      </w:r>
+    </w:p>
+    <w:p>
+      <w:r>
+        <w:t>Executive gate. Named sponsor owns pause decision. Challenge the result if issue remains open while rollout expands. Record the decision owner and a corrective action.</w:t>
+      </w:r>
+    </w:p>
+    <w:p>
+      <w:r>
+        <w:t>Outcome measure. Median time to decision. State the baseline, cohort and period. Separate observed results from estimates before presenting value to a sponsor.</w:t>
+      </w:r>
+    </w:p>
+    <w:p>
+      <w:r>
+        <w:t>Practice in Lab 07. Evidence: Escalation playbook; expected acceptance: Named sponsor owns pause decision.</w:t>
+      </w:r>
+    </w:p>
+    <w:p>
+      <w:bookmarkStart w:id="95976" w:name="topic4"/>
       <w:pPr>
         <w:pStyle w:val="Heading1"/>
       </w:pPr>
       <w:r>
-        <w:t>Topic 3: Copilot Integration, AI Agents and Cross-Platform Workflows</w:t>
-      </w:r>
-      <w:bookmarkEnd w:id="14835"/>
-    </w:p>
-    <w:p>
-      <w:r>
-        <w:t>Learning outcome: LO3. Official reference: https://learn.microsoft.com/en-us/microsoft-copilot-studio/knowledge-improve</w:t>
+        <w:t>Topic 4: Measure Value, Scale Adoption and Report to the Board</w:t>
+      </w:r>
+      <w:bookmarkEnd w:id="95976"/>
+    </w:p>
+    <w:p>
+      <w:r>
+        <w:t>Learning outcome: LO4. Official reference: https://learn.microsoft.com/en-us/microsoft-365/copilot/copilot-control-system/measurement-reporting</w:t>
       </w:r>
     </w:p>
     <w:p>
@@ -1221,32 +1627,32 @@
         <w:pStyle w:val="Heading2"/>
       </w:pPr>
       <w:r>
-        <w:t>26. Agent purpose contract</w:t>
-      </w:r>
-    </w:p>
-    <w:p>
-      <w:r>
-        <w:t>Operational situation. Northstar Service starts with helpdesk scope and user intents. The intended transformation is to define allowed requests and refusals and produce agent instruction card.</w:t>
-      </w:r>
-    </w:p>
-    <w:p>
-      <w:r>
-        <w:t>Procedure. 1. Open the relevant approved Microsoft 365 or Copilot Studio workspace, or the synthetic case record supplied in the lab. 2. Record the input and its owner. 3. Apply the transformation to a copy. 4. Compare the output with the source. 5. Log the reviewer, decision and date. Never claim a simulated configuration is a tenant deployment.</w:t>
-      </w:r>
-    </w:p>
-    <w:p>
-      <w:r>
-        <w:t>Control. Scope owner approves boundary. Diagnose a failure when agent answers outside approved domain. Preserve an input/output evidence trace and rerun the same test after correction.</w:t>
-      </w:r>
-    </w:p>
-    <w:p>
-      <w:r>
-        <w:t>Measure. In-scope resolution rate. Define numerator, denominator, time window and cohort before comparing a baseline with a pilot. Do not infer business value from activity counts alone.</w:t>
-      </w:r>
-    </w:p>
-    <w:p>
-      <w:r>
-        <w:t>Practice in Lab 06. Evidence: Agent instruction card; expected acceptance: Scope owner approves boundary.</w:t>
+        <w:t>36. Use-case portfolio</w:t>
+      </w:r>
+    </w:p>
+    <w:p>
+      <w:r>
+        <w:t>Business decision. Northstar Service starts with twelve candidate workflows. Prioritise volume, value, feasibility and risk. The output is ranked opportunity portfolio.</w:t>
+      </w:r>
+    </w:p>
+    <w:p>
+      <w:r>
+        <w:t>Copilot practice. 1. Open Microsoft Copilot Chat and Word in the approved Microsoft 365 work environment, or open the synthetic case pack. 2. State the executive decision, audience, source and constraints. 3. Ask Copilot for the named output and request assumptions and uncertainties. 4. Compare material claims and figures with the supplied source. 5. Edit and save a human-owned decision artifact. The matching Lab 08 gives a copy-ready prompt and detailed steps.</w:t>
+      </w:r>
+    </w:p>
+    <w:p>
+      <w:r>
+        <w:t>Executive gate. Reject ownerless or unsafe use case. Challenge the result if highest score hides weak data. Record the decision owner and a corrective action.</w:t>
+      </w:r>
+    </w:p>
+    <w:p>
+      <w:r>
+        <w:t>Outcome measure. Validated value per use case. State the baseline, cohort and period. Separate observed results from estimates before presenting value to a sponsor.</w:t>
+      </w:r>
+    </w:p>
+    <w:p>
+      <w:r>
+        <w:t>Practice in Lab 08. Evidence: Ranked opportunity portfolio; expected acceptance: Reject ownerless or unsafe use case.</w:t>
       </w:r>
     </w:p>
     <w:p>
@@ -1254,32 +1660,32 @@
         <w:pStyle w:val="Heading2"/>
       </w:pPr>
       <w:r>
-        <w:t>27. Knowledge-source curation</w:t>
-      </w:r>
-    </w:p>
-    <w:p>
-      <w:r>
-        <w:t>Operational situation. Northstar Service starts with policy pdfs and sharepoint site. The intended transformation is to choose authoritative files with metadata and produce source register and index plan.</w:t>
-      </w:r>
-    </w:p>
-    <w:p>
-      <w:r>
-        <w:t>Procedure. 1. Open the relevant approved Microsoft 365 or Copilot Studio workspace, or the synthetic case record supplied in the lab. 2. Record the input and its owner. 3. Apply the transformation to a copy. 4. Compare the output with the source. 5. Log the reviewer, decision and date. Never claim a simulated configuration is a tenant deployment.</w:t>
-      </w:r>
-    </w:p>
-    <w:p>
-      <w:r>
-        <w:t>Control. Remove stale or duplicate files. Diagnose a failure when agent cites archived policy. Preserve an input/output evidence trace and rerun the same test after correction.</w:t>
-      </w:r>
-    </w:p>
-    <w:p>
-      <w:r>
-        <w:t>Measure. Current-source citation rate. Define numerator, denominator, time window and cohort before comparing a baseline with a pilot. Do not infer business value from activity counts alone.</w:t>
-      </w:r>
-    </w:p>
-    <w:p>
-      <w:r>
-        <w:t>Practice in Lab 06. Evidence: Source register and index plan; expected acceptance: Remove stale or duplicate files.</w:t>
+        <w:t>37. Adoption baseline</w:t>
+      </w:r>
+    </w:p>
+    <w:p>
+      <w:r>
+        <w:t>Business decision. Northstar Service starts with usage by role and department. Compare active use with licensed seats. The output is adoption baseline chart.</w:t>
+      </w:r>
+    </w:p>
+    <w:p>
+      <w:r>
+        <w:t>Copilot practice. 1. Open Microsoft Copilot Chat and Word in the approved Microsoft 365 work environment, or open the synthetic case pack. 2. State the executive decision, audience, source and constraints. 3. Ask Copilot for the named output and request assumptions and uncertainties. 4. Compare material claims and figures with the supplied source. 5. Edit and save a human-owned decision artifact. The matching Lab 08 gives a copy-ready prompt and detailed steps.</w:t>
+      </w:r>
+    </w:p>
+    <w:p>
+      <w:r>
+        <w:t>Executive gate. Separate sign-in from productive use. Challenge the result if licence assignment counted as adoption. Record the decision owner and a corrective action.</w:t>
+      </w:r>
+    </w:p>
+    <w:p>
+      <w:r>
+        <w:t>Outcome measure. Weekly active users per cohort. State the baseline, cohort and period. Separate observed results from estimates before presenting value to a sponsor.</w:t>
+      </w:r>
+    </w:p>
+    <w:p>
+      <w:r>
+        <w:t>Practice in Lab 08. Evidence: Adoption baseline chart; expected acceptance: Separate sign-in from productive use.</w:t>
       </w:r>
     </w:p>
     <w:p>
@@ -1287,32 +1693,32 @@
         <w:pStyle w:val="Heading2"/>
       </w:pPr>
       <w:r>
-        <w:t>28. Citation evaluation</w:t>
-      </w:r>
-    </w:p>
-    <w:p>
-      <w:r>
-        <w:t>Operational situation. Northstar Service starts with twenty grounded test questions. The intended transformation is to compare answers to source passages and produce evaluation scorecard.</w:t>
-      </w:r>
-    </w:p>
-    <w:p>
-      <w:r>
-        <w:t>Procedure. 1. Open the relevant approved Microsoft 365 or Copilot Studio workspace, or the synthetic case record supplied in the lab. 2. Record the input and its owner. 3. Apply the transformation to a copy. 4. Compare the output with the source. 5. Log the reviewer, decision and date. Never claim a simulated configuration is a tenant deployment.</w:t>
-      </w:r>
-    </w:p>
-    <w:p>
-      <w:r>
-        <w:t>Control. Fail release below evidence threshold. Diagnose a failure when citation exists but does not support claim. Preserve an input/output evidence trace and rerun the same test after correction.</w:t>
-      </w:r>
-    </w:p>
-    <w:p>
-      <w:r>
-        <w:t>Measure. Supported citations divided by citations. Define numerator, denominator, time window and cohort before comparing a baseline with a pilot. Do not infer business value from activity counts alone.</w:t>
-      </w:r>
-    </w:p>
-    <w:p>
-      <w:r>
-        <w:t>Practice in Lab 06. Evidence: Evaluation scorecard; expected acceptance: Fail release below evidence threshold.</w:t>
+        <w:t>38. Enablement design</w:t>
+      </w:r>
+    </w:p>
+    <w:p>
+      <w:r>
+        <w:t>Business decision. Northstar Service starts with three role-specific skill gaps. Ask Copilot to draft role-based coaching plans. The output is 90-day enablement calendar.</w:t>
+      </w:r>
+    </w:p>
+    <w:p>
+      <w:r>
+        <w:t>Copilot practice. 1. Open Microsoft Copilot Chat and Word in the approved Microsoft 365 work environment, or open the synthetic case pack. 2. State the executive decision, audience, source and constraints. 3. Ask Copilot for the named output and request assumptions and uncertainties. 4. Compare material claims and figures with the supplied source. 5. Edit and save a human-owned decision artifact. The matching Lab 08 gives a copy-ready prompt and detailed steps.</w:t>
+      </w:r>
+    </w:p>
+    <w:p>
+      <w:r>
+        <w:t>Executive gate. Manager commits time for practice. Challenge the result if one generic training suits no one. Record the decision owner and a corrective action.</w:t>
+      </w:r>
+    </w:p>
+    <w:p>
+      <w:r>
+        <w:t>Outcome measure. Practice completion by role. State the baseline, cohort and period. Separate observed results from estimates before presenting value to a sponsor.</w:t>
+      </w:r>
+    </w:p>
+    <w:p>
+      <w:r>
+        <w:t>Practice in Lab 08. Evidence: 90-day enablement calendar; expected acceptance: Manager commits time for practice.</w:t>
       </w:r>
     </w:p>
     <w:p>
@@ -1320,32 +1726,32 @@
         <w:pStyle w:val="Heading2"/>
       </w:pPr>
       <w:r>
-        <w:t>29. Copilot Studio topic routing</w:t>
-      </w:r>
-    </w:p>
-    <w:p>
-      <w:r>
-        <w:t>Operational situation. Northstar Service starts with password reset and leave-query intents. The intended transformation is to route to topic or generative answer and produce topic decision flow.</w:t>
-      </w:r>
-    </w:p>
-    <w:p>
-      <w:r>
-        <w:t>Procedure. 1. Open the relevant approved Microsoft 365 or Copilot Studio workspace, or the synthetic case record supplied in the lab. 2. Record the input and its owner. 3. Apply the transformation to a copy. 4. Compare the output with the source. 5. Log the reviewer, decision and date. Never claim a simulated configuration is a tenant deployment.</w:t>
-      </w:r>
-    </w:p>
-    <w:p>
-      <w:r>
-        <w:t>Control. Escalate unsupported requests. Diagnose a failure when wrong topic triggers a tool. Preserve an input/output evidence trace and rerun the same test after correction.</w:t>
-      </w:r>
-    </w:p>
-    <w:p>
-      <w:r>
-        <w:t>Measure. Correct route per test case. Define numerator, denominator, time window and cohort before comparing a baseline with a pilot. Do not infer business value from activity counts alone.</w:t>
-      </w:r>
-    </w:p>
-    <w:p>
-      <w:r>
-        <w:t>Practice in Lab 06. Evidence: Topic decision flow; expected acceptance: Escalate unsupported requests.</w:t>
+        <w:t>39. Feedback loop</w:t>
+      </w:r>
+    </w:p>
+    <w:p>
+      <w:r>
+        <w:t>Business decision. Northstar Service starts with pilot questions and complaints. Cluster feedback themes with Copilot. The output is prioritised improvement backlog.</w:t>
+      </w:r>
+    </w:p>
+    <w:p>
+      <w:r>
+        <w:t>Copilot practice. 1. Open Microsoft Copilot Chat and Word in the approved Microsoft 365 work environment, or open the synthetic case pack. 2. State the executive decision, audience, source and constraints. 3. Ask Copilot for the named output and request assumptions and uncertainties. 4. Compare material claims and figures with the supplied source. 5. Edit and save a human-owned decision artifact. The matching Lab 08 gives a copy-ready prompt and detailed steps.</w:t>
+      </w:r>
+    </w:p>
+    <w:p>
+      <w:r>
+        <w:t>Executive gate. Assign owner and due date. Challenge the result if prompt advice hides a source defect. Record the decision owner and a corrective action.</w:t>
+      </w:r>
+    </w:p>
+    <w:p>
+      <w:r>
+        <w:t>Outcome measure. Median defect closure time. State the baseline, cohort and period. Separate observed results from estimates before presenting value to a sponsor.</w:t>
+      </w:r>
+    </w:p>
+    <w:p>
+      <w:r>
+        <w:t>Practice in Lab 08. Evidence: Prioritised improvement backlog; expected acceptance: Assign owner and due date.</w:t>
       </w:r>
     </w:p>
     <w:p>
@@ -1353,32 +1759,32 @@
         <w:pStyle w:val="Heading2"/>
       </w:pPr>
       <w:r>
-        <w:t>30. Connector action</w:t>
-      </w:r>
-    </w:p>
-    <w:p>
-      <w:r>
-        <w:t>Operational situation. Northstar Service starts with case-create api schema. The intended transformation is to map validated input to action parameters and produce action contract and sample payload.</w:t>
-      </w:r>
-    </w:p>
-    <w:p>
-      <w:r>
-        <w:t>Procedure. 1. Open the relevant approved Microsoft 365 or Copilot Studio workspace, or the synthetic case record supplied in the lab. 2. Record the input and its owner. 3. Apply the transformation to a copy. 4. Compare the output with the source. 5. Log the reviewer, decision and date. Never claim a simulated configuration is a tenant deployment.</w:t>
-      </w:r>
-    </w:p>
-    <w:p>
-      <w:r>
-        <w:t>Control. Validate inputs and consent. Diagnose a failure when missing case owner causes bad write. Preserve an input/output evidence trace and rerun the same test after correction.</w:t>
-      </w:r>
-    </w:p>
-    <w:p>
-      <w:r>
-        <w:t>Measure. Successful validated actions. Define numerator, denominator, time window and cohort before comparing a baseline with a pilot. Do not infer business value from activity counts alone.</w:t>
-      </w:r>
-    </w:p>
-    <w:p>
-      <w:r>
-        <w:t>Practice in Lab 06. Evidence: Action contract and sample payload; expected acceptance: Validate inputs and consent.</w:t>
+        <w:t>40. Scale gate</w:t>
+      </w:r>
+    </w:p>
+    <w:p>
+      <w:r>
+        <w:t>Business decision. Northstar Service starts with pilot adoption, quality and risk data. Prepare go, hold or stop recommendation. The output is wave-two decision paper.</w:t>
+      </w:r>
+    </w:p>
+    <w:p>
+      <w:r>
+        <w:t>Copilot practice. 1. Open Microsoft Copilot Chat and Word in the approved Microsoft 365 work environment, or open the synthetic case pack. 2. State the executive decision, audience, source and constraints. 3. Ask Copilot for the named output and request assumptions and uncertainties. 4. Compare material claims and figures with the supplied source. 5. Edit and save a human-owned decision artifact. The matching Lab 08 gives a copy-ready prompt and detailed steps.</w:t>
+      </w:r>
+    </w:p>
+    <w:p>
+      <w:r>
+        <w:t>Executive gate. Every critical threshold passes. Challenge the result if average score hides a severe failure. Record the decision owner and a corrective action.</w:t>
+      </w:r>
+    </w:p>
+    <w:p>
+      <w:r>
+        <w:t>Outcome measure. Criteria passed divided by required. State the baseline, cohort and period. Separate observed results from estimates before presenting value to a sponsor.</w:t>
+      </w:r>
+    </w:p>
+    <w:p>
+      <w:r>
+        <w:t>Practice in Lab 08. Evidence: Wave-two decision paper; expected acceptance: Every critical threshold passes.</w:t>
       </w:r>
     </w:p>
     <w:p>
@@ -1386,32 +1792,32 @@
         <w:pStyle w:val="Heading2"/>
       </w:pPr>
       <w:r>
-        <w:t>31. Approval action</w:t>
-      </w:r>
-    </w:p>
-    <w:p>
-      <w:r>
-        <w:t>Operational situation. Northstar Service starts with low and high value requests. The intended transformation is to branch at amount threshold and produce approval path with actor and timestamp.</w:t>
-      </w:r>
-    </w:p>
-    <w:p>
-      <w:r>
-        <w:t>Procedure. 1. Open the relevant approved Microsoft 365 or Copilot Studio workspace, or the synthetic case record supplied in the lab. 2. Record the input and its owner. 3. Apply the transformation to a copy. 4. Compare the output with the source. 5. Log the reviewer, decision and date. Never claim a simulated configuration is a tenant deployment.</w:t>
-      </w:r>
-    </w:p>
-    <w:p>
-      <w:r>
-        <w:t>Control. No silent auto-approval. Diagnose a failure when high-value request takes fast path. Preserve an input/output evidence trace and rerun the same test after correction.</w:t>
-      </w:r>
-    </w:p>
-    <w:p>
-      <w:r>
-        <w:t>Measure. Threshold breaches count. Define numerator, denominator, time window and cohort before comparing a baseline with a pilot. Do not infer business value from activity counts alone.</w:t>
-      </w:r>
-    </w:p>
-    <w:p>
-      <w:r>
-        <w:t>Practice in Lab 07. Evidence: Approval path with actor and timestamp; expected acceptance: No silent auto-approval.</w:t>
+        <w:t>41. Excel value model</w:t>
+      </w:r>
+    </w:p>
+    <w:p>
+      <w:r>
+        <w:t>Business decision. Northstar Service starts with synthetic task time and cost worksheet. Use Copilot in Excel to analyse observed changes. The output is net time-saved table.</w:t>
+      </w:r>
+    </w:p>
+    <w:p>
+      <w:r>
+        <w:t>Copilot practice. 1. Open Copilot in Excel and Word in the approved Microsoft 365 work environment, or open the synthetic case pack. 2. State the executive decision, audience, source and constraints. 3. Ask Copilot for the named output and request assumptions and uncertainties. 4. Compare material claims and figures with the supplied source. 5. Edit and save a human-owned decision artifact. The matching Lab 09 gives a copy-ready prompt and detailed steps.</w:t>
+      </w:r>
+    </w:p>
+    <w:p>
+      <w:r>
+        <w:t>Executive gate. Review time is deducted from gross saving. Challenge the result if gross saving is sold as net value. Record the decision owner and a corrective action.</w:t>
+      </w:r>
+    </w:p>
+    <w:p>
+      <w:r>
+        <w:t>Outcome measure. Net minutes saved per task. State the baseline, cohort and period. Separate observed results from estimates before presenting value to a sponsor.</w:t>
+      </w:r>
+    </w:p>
+    <w:p>
+      <w:r>
+        <w:t>Practice in Lab 09. Evidence: Net time-saved table; expected acceptance: Review time is deducted from gross saving.</w:t>
       </w:r>
     </w:p>
     <w:p>
@@ -1419,32 +1825,32 @@
         <w:pStyle w:val="Heading2"/>
       </w:pPr>
       <w:r>
-        <w:t>32. Power Automate flow</w:t>
-      </w:r>
-    </w:p>
-    <w:p>
-      <w:r>
-        <w:t>Operational situation. Northstar Service starts with form submission and structured fields. The intended transformation is to trigger, validate, approve, write, notify and produce flow run trace.</w:t>
-      </w:r>
-    </w:p>
-    <w:p>
-      <w:r>
-        <w:t>Procedure. 1. Open the relevant approved Microsoft 365 or Copilot Studio workspace, or the synthetic case record supplied in the lab. 2. Record the input and its owner. 3. Apply the transformation to a copy. 4. Compare the output with the source. 5. Log the reviewer, decision and date. Never claim a simulated configuration is a tenant deployment.</w:t>
-      </w:r>
-    </w:p>
-    <w:p>
-      <w:r>
-        <w:t>Control. Use service identity with least privilege. Diagnose a failure when duplicate trigger creates two tickets. Preserve an input/output evidence trace and rerun the same test after correction.</w:t>
-      </w:r>
-    </w:p>
-    <w:p>
-      <w:r>
-        <w:t>Measure. Idempotent completions divided by runs. Define numerator, denominator, time window and cohort before comparing a baseline with a pilot. Do not infer business value from activity counts alone.</w:t>
-      </w:r>
-    </w:p>
-    <w:p>
-      <w:r>
-        <w:t>Practice in Lab 07. Evidence: Flow run trace; expected acceptance: Use service identity with least privilege.</w:t>
+        <w:t>42. Benefit confidence</w:t>
+      </w:r>
+    </w:p>
+    <w:p>
+      <w:r>
+        <w:t>Business decision. Northstar Service starts with observed sample and management estimates. Ask Copilot to label evidence strength. The output is benefit confidence register.</w:t>
+      </w:r>
+    </w:p>
+    <w:p>
+      <w:r>
+        <w:t>Copilot practice. 1. Open Copilot in Excel and Word in the approved Microsoft 365 work environment, or open the synthetic case pack. 2. State the executive decision, audience, source and constraints. 3. Ask Copilot for the named output and request assumptions and uncertainties. 4. Compare material claims and figures with the supplied source. 5. Edit and save a human-owned decision artifact. The matching Lab 09 gives a copy-ready prompt and detailed steps.</w:t>
+      </w:r>
+    </w:p>
+    <w:p>
+      <w:r>
+        <w:t>Executive gate. Assumption is never described as measured. Challenge the result if weak sample is extrapolated widely. Record the decision owner and a corrective action.</w:t>
+      </w:r>
+    </w:p>
+    <w:p>
+      <w:r>
+        <w:t>Outcome measure. Measured share of claimed value. State the baseline, cohort and period. Separate observed results from estimates before presenting value to a sponsor.</w:t>
+      </w:r>
+    </w:p>
+    <w:p>
+      <w:r>
+        <w:t>Practice in Lab 09. Evidence: Benefit confidence register; expected acceptance: Assumption is never described as measured.</w:t>
       </w:r>
     </w:p>
     <w:p>
@@ -1452,32 +1858,32 @@
         <w:pStyle w:val="Heading2"/>
       </w:pPr>
       <w:r>
-        <w:t>33. Dynamics 365 context</w:t>
-      </w:r>
-    </w:p>
-    <w:p>
-      <w:r>
-        <w:t>Operational situation. Northstar Service starts with synthetic account and case record. The intended transformation is to ground response in permitted crm fields and produce case summary and next-step draft.</w:t>
-      </w:r>
-    </w:p>
-    <w:p>
-      <w:r>
-        <w:t>Procedure. 1. Open the relevant approved Microsoft 365 or Copilot Studio workspace, or the synthetic case record supplied in the lab. 2. Record the input and its owner. 3. Apply the transformation to a copy. 4. Compare the output with the source. 5. Log the reviewer, decision and date. Never claim a simulated configuration is a tenant deployment.</w:t>
-      </w:r>
-    </w:p>
-    <w:p>
-      <w:r>
-        <w:t>Control. Respect record-level access. Diagnose a failure when summary includes another account. Preserve an input/output evidence trace and rerun the same test after correction.</w:t>
-      </w:r>
-    </w:p>
-    <w:p>
-      <w:r>
-        <w:t>Measure. Cross-account leakage count. Define numerator, denominator, time window and cohort before comparing a baseline with a pilot. Do not infer business value from activity counts alone.</w:t>
-      </w:r>
-    </w:p>
-    <w:p>
-      <w:r>
-        <w:t>Practice in Lab 07. Evidence: Case summary and next-step draft; expected acceptance: Respect record-level access.</w:t>
+        <w:t>43. Cost of ownership</w:t>
+      </w:r>
+    </w:p>
+    <w:p>
+      <w:r>
+        <w:t>Business decision. Northstar Service starts with seats, enablement and support costs. Use Copilot to compare total cost scenarios. The output is total-cost table.</w:t>
+      </w:r>
+    </w:p>
+    <w:p>
+      <w:r>
+        <w:t>Copilot practice. 1. Open Copilot in Excel and Word in the approved Microsoft 365 work environment, or open the synthetic case pack. 2. State the executive decision, audience, source and constraints. 3. Ask Copilot for the named output and request assumptions and uncertainties. 4. Compare material claims and figures with the supplied source. 5. Edit and save a human-owned decision artifact. The matching Lab 09 gives a copy-ready prompt and detailed steps.</w:t>
+      </w:r>
+    </w:p>
+    <w:p>
+      <w:r>
+        <w:t>Executive gate. Include recurring change and review effort. Challenge the result if license fee is the only cost. Record the decision owner and a corrective action.</w:t>
+      </w:r>
+    </w:p>
+    <w:p>
+      <w:r>
+        <w:t>Outcome measure. Cost per realised outcome. State the baseline, cohort and period. Separate observed results from estimates before presenting value to a sponsor.</w:t>
+      </w:r>
+    </w:p>
+    <w:p>
+      <w:r>
+        <w:t>Practice in Lab 09. Evidence: Total-cost table; expected acceptance: Include recurring change and review effort.</w:t>
       </w:r>
     </w:p>
     <w:p>
@@ -1485,32 +1891,32 @@
         <w:pStyle w:val="Heading2"/>
       </w:pPr>
       <w:r>
-        <w:t>34. Foundry model choice</w:t>
-      </w:r>
-    </w:p>
-    <w:p>
-      <w:r>
-        <w:t>Operational situation. Northstar Service starts with latency, quality and residency constraints. The intended transformation is to compare candidate models on test set and produce model decision card.</w:t>
-      </w:r>
-    </w:p>
-    <w:p>
-      <w:r>
-        <w:t>Procedure. 1. Open the relevant approved Microsoft 365 or Copilot Studio workspace, or the synthetic case record supplied in the lab. 2. Record the input and its owner. 3. Apply the transformation to a copy. 4. Compare the output with the source. 5. Log the reviewer, decision and date. Never claim a simulated configuration is a tenant deployment.</w:t>
-      </w:r>
-    </w:p>
-    <w:p>
-      <w:r>
-        <w:t>Control. Approve budget and data region. Diagnose a failure when cheaper model fails critical test. Preserve an input/output evidence trace and rerun the same test after correction.</w:t>
-      </w:r>
-    </w:p>
-    <w:p>
-      <w:r>
-        <w:t>Measure. Quality score per cost unit. Define numerator, denominator, time window and cohort before comparing a baseline with a pilot. Do not infer business value from activity counts alone.</w:t>
-      </w:r>
-    </w:p>
-    <w:p>
-      <w:r>
-        <w:t>Practice in Lab 07. Evidence: Model decision card; expected acceptance: Approve budget and data region.</w:t>
+        <w:t>44. Sensitivity test</w:t>
+      </w:r>
+    </w:p>
+    <w:p>
+      <w:r>
+        <w:t>Business decision. Northstar Service starts with low, base and high adoption scenarios. Ask Copilot to vary key assumptions. The output is sensitivity chart with break-even point.</w:t>
+      </w:r>
+    </w:p>
+    <w:p>
+      <w:r>
+        <w:t>Copilot practice. 1. Open Copilot in Excel and Word in the approved Microsoft 365 work environment, or open the synthetic case pack. 2. State the executive decision, audience, source and constraints. 3. Ask Copilot for the named output and request assumptions and uncertainties. 4. Compare material claims and figures with the supplied source. 5. Edit and save a human-owned decision artifact. The matching Lab 09 gives a copy-ready prompt and detailed steps.</w:t>
+      </w:r>
+    </w:p>
+    <w:p>
+      <w:r>
+        <w:t>Executive gate. Decision holds under a credible downside. Challenge the result if single optimistic case drives approval. Record the decision owner and a corrective action.</w:t>
+      </w:r>
+    </w:p>
+    <w:p>
+      <w:r>
+        <w:t>Outcome measure. Break-even adoption threshold. State the baseline, cohort and period. Separate observed results from estimates before presenting value to a sponsor.</w:t>
+      </w:r>
+    </w:p>
+    <w:p>
+      <w:r>
+        <w:t>Practice in Lab 09. Evidence: Sensitivity chart with break-even point; expected acceptance: Decision holds under a credible downside.</w:t>
       </w:r>
     </w:p>
     <w:p>
@@ -1518,32 +1924,32 @@
         <w:pStyle w:val="Heading2"/>
       </w:pPr>
       <w:r>
-        <w:t>35. MCP tool registration</w:t>
-      </w:r>
-    </w:p>
-    <w:p>
-      <w:r>
-        <w:t>Operational situation. Northstar Service starts with tool schema and server identity. The intended transformation is to expose a bounded tool to an agent and produce tool catalog with scopes.</w:t>
-      </w:r>
-    </w:p>
-    <w:p>
-      <w:r>
-        <w:t>Procedure. 1. Open the relevant approved Microsoft 365 or Copilot Studio workspace, or the synthetic case record supplied in the lab. 2. Record the input and its owner. 3. Apply the transformation to a copy. 4. Compare the output with the source. 5. Log the reviewer, decision and date. Never claim a simulated configuration is a tenant deployment.</w:t>
-      </w:r>
-    </w:p>
-    <w:p>
-      <w:r>
-        <w:t>Control. Authenticate and log each invocation. Diagnose a failure when untrusted server gains broad access. Preserve an input/output evidence trace and rerun the same test after correction.</w:t>
-      </w:r>
-    </w:p>
-    <w:p>
-      <w:r>
-        <w:t>Measure. Authorized calls divided by all calls. Define numerator, denominator, time window and cohort before comparing a baseline with a pilot. Do not infer business value from activity counts alone.</w:t>
-      </w:r>
-    </w:p>
-    <w:p>
-      <w:r>
-        <w:t>Practice in Lab 07. Evidence: Tool catalog with scopes; expected acceptance: Authenticate and log each invocation.</w:t>
+        <w:t>45. Investment decision</w:t>
+      </w:r>
+    </w:p>
+    <w:p>
+      <w:r>
+        <w:t>Business decision. Northstar Service starts with value model and risk register. Draft a balanced investment memo in Word. The output is fund, hold or stop recommendation.</w:t>
+      </w:r>
+    </w:p>
+    <w:p>
+      <w:r>
+        <w:t>Copilot practice. 1. Open Copilot in Excel and Word in the approved Microsoft 365 work environment, or open the synthetic case pack. 2. State the executive decision, audience, source and constraints. 3. Ask Copilot for the named output and request assumptions and uncertainties. 4. Compare material claims and figures with the supplied source. 5. Edit and save a human-owned decision artifact. The matching Lab 09 gives a copy-ready prompt and detailed steps.</w:t>
+      </w:r>
+    </w:p>
+    <w:p>
+      <w:r>
+        <w:t>Executive gate. Sponsor signs conditions and budget. Challenge the result if recommendation ignores risk-adjusted cost. Record the decision owner and a corrective action.</w:t>
+      </w:r>
+    </w:p>
+    <w:p>
+      <w:r>
+        <w:t>Outcome measure. Conditions met before release. State the baseline, cohort and period. Separate observed results from estimates before presenting value to a sponsor.</w:t>
+      </w:r>
+    </w:p>
+    <w:p>
+      <w:r>
+        <w:t>Practice in Lab 09. Evidence: Fund, hold or stop recommendation; expected acceptance: Sponsor signs conditions and budget.</w:t>
       </w:r>
     </w:p>
     <w:p>
@@ -1551,32 +1957,32 @@
         <w:pStyle w:val="Heading2"/>
       </w:pPr>
       <w:r>
-        <w:t>36. A2A handoff</w:t>
-      </w:r>
-    </w:p>
-    <w:p>
-      <w:r>
-        <w:t>Operational situation. Northstar Service starts with service agent and billing agent contract. The intended transformation is to send task with identity and context limits and produce handoff trace and result.</w:t>
-      </w:r>
-    </w:p>
-    <w:p>
-      <w:r>
-        <w:t>Procedure. 1. Open the relevant approved Microsoft 365 or Copilot Studio workspace, or the synthetic case record supplied in the lab. 2. Record the input and its owner. 3. Apply the transformation to a copy. 4. Compare the output with the source. 5. Log the reviewer, decision and date. Never claim a simulated configuration is a tenant deployment.</w:t>
-      </w:r>
-    </w:p>
-    <w:p>
-      <w:r>
-        <w:t>Control. Entra authorization at endpoint. Diagnose a failure when receiving agent loses context boundary. Preserve an input/output evidence trace and rerun the same test after correction.</w:t>
-      </w:r>
-    </w:p>
-    <w:p>
-      <w:r>
-        <w:t>Measure. Successful authorized handoffs. Define numerator, denominator, time window and cohort before comparing a baseline with a pilot. Do not infer business value from activity counts alone.</w:t>
-      </w:r>
-    </w:p>
-    <w:p>
-      <w:r>
-        <w:t>Practice in Lab 08. Evidence: Handoff trace and result; expected acceptance: Entra authorization at endpoint.</w:t>
+        <w:t>46. Quality scorecard</w:t>
+      </w:r>
+    </w:p>
+    <w:p>
+      <w:r>
+        <w:t>Business decision. Northstar Service starts with sample outputs and evidence checks. Summarise quality results with Copilot. The output is quality trend chart.</w:t>
+      </w:r>
+    </w:p>
+    <w:p>
+      <w:r>
+        <w:t>Copilot practice. 1. Open Copilot in PowerPoint and Chat in the approved Microsoft 365 work environment, or open the synthetic case pack. 2. State the executive decision, audience, source and constraints. 3. Ask Copilot for the named output and request assumptions and uncertainties. 4. Compare material claims and figures with the supplied source. 5. Edit and save a human-owned decision artifact. The matching Lab 10 gives a copy-ready prompt and detailed steps.</w:t>
+      </w:r>
+    </w:p>
+    <w:p>
+      <w:r>
+        <w:t>Executive gate. Any critical safety failure blocks scale. Challenge the result if good average masks one severe error. Record the decision owner and a corrective action.</w:t>
+      </w:r>
+    </w:p>
+    <w:p>
+      <w:r>
+        <w:t>Outcome measure. Critical failures per sample. State the baseline, cohort and period. Separate observed results from estimates before presenting value to a sponsor.</w:t>
+      </w:r>
+    </w:p>
+    <w:p>
+      <w:r>
+        <w:t>Practice in Lab 10. Evidence: Quality trend chart; expected acceptance: Any critical safety failure blocks scale.</w:t>
       </w:r>
     </w:p>
     <w:p>
@@ -1584,32 +1990,32 @@
         <w:pStyle w:val="Heading2"/>
       </w:pPr>
       <w:r>
-        <w:t>37. Multi-agent orchestration</w:t>
-      </w:r>
-    </w:p>
-    <w:p>
-      <w:r>
-        <w:t>Operational situation. Northstar Service starts with research, policy and drafting subagents. The intended transformation is to sequence outputs with conflict resolution and produce orchestration map and provenance.</w:t>
-      </w:r>
-    </w:p>
-    <w:p>
-      <w:r>
-        <w:t>Procedure. 1. Open the relevant approved Microsoft 365 or Copilot Studio workspace, or the synthetic case record supplied in the lab. 2. Record the input and its owner. 3. Apply the transformation to a copy. 4. Compare the output with the source. 5. Log the reviewer, decision and date. Never claim a simulated configuration is a tenant deployment.</w:t>
-      </w:r>
-    </w:p>
-    <w:p>
-      <w:r>
-        <w:t>Control. Supervisor approves final answer. Diagnose a failure when agents amplify an unsupported claim. Preserve an input/output evidence trace and rerun the same test after correction.</w:t>
-      </w:r>
-    </w:p>
-    <w:p>
-      <w:r>
-        <w:t>Measure. Conflicts detected before release. Define numerator, denominator, time window and cohort before comparing a baseline with a pilot. Do not infer business value from activity counts alone.</w:t>
-      </w:r>
-    </w:p>
-    <w:p>
-      <w:r>
-        <w:t>Practice in Lab 08. Evidence: Orchestration map and provenance; expected acceptance: Supervisor approves final answer.</w:t>
+        <w:t>47. Customer outcome</w:t>
+      </w:r>
+    </w:p>
+    <w:p>
+      <w:r>
+        <w:t>Business decision. Northstar Service starts with service response and satisfaction data. Compare customer metrics before and after pilot. The output is customer-impact summary.</w:t>
+      </w:r>
+    </w:p>
+    <w:p>
+      <w:r>
+        <w:t>Copilot practice. 1. Open Copilot in PowerPoint and Chat in the approved Microsoft 365 work environment, or open the synthetic case pack. 2. State the executive decision, audience, source and constraints. 3. Ask Copilot for the named output and request assumptions and uncertainties. 4. Compare material claims and figures with the supplied source. 5. Edit and save a human-owned decision artifact. The matching Lab 10 gives a copy-ready prompt and detailed steps.</w:t>
+      </w:r>
+    </w:p>
+    <w:p>
+      <w:r>
+        <w:t>Executive gate. Control for work mix and seasonality. Challenge the result if ai usage is mistaken for customer benefit. Record the decision owner and a corrective action.</w:t>
+      </w:r>
+    </w:p>
+    <w:p>
+      <w:r>
+        <w:t>Outcome measure. Comparable cycle-time change. State the baseline, cohort and period. Separate observed results from estimates before presenting value to a sponsor.</w:t>
+      </w:r>
+    </w:p>
+    <w:p>
+      <w:r>
+        <w:t>Practice in Lab 10. Evidence: Customer-impact summary; expected acceptance: Control for work mix and seasonality.</w:t>
       </w:r>
     </w:p>
     <w:p>
@@ -1617,466 +2023,121 @@
         <w:pStyle w:val="Heading2"/>
       </w:pPr>
       <w:r>
-        <w:t>38. Cross-platform error handling</w:t>
-      </w:r>
-    </w:p>
-    <w:p>
-      <w:r>
-        <w:t>Operational situation. Northstar Service starts with crm timeout and retry policy. The intended transformation is to retry safely then queue for human and produce dead-letter record with correlation id.</w:t>
-      </w:r>
-    </w:p>
-    <w:p>
-      <w:r>
-        <w:t>Procedure. 1. Open the relevant approved Microsoft 365 or Copilot Studio workspace, or the synthetic case record supplied in the lab. 2. Record the input and its owner. 3. Apply the transformation to a copy. 4. Compare the output with the source. 5. Log the reviewer, decision and date. Never claim a simulated configuration is a tenant deployment.</w:t>
-      </w:r>
-    </w:p>
-    <w:p>
-      <w:r>
-        <w:t>Control. No duplicate write on retry. Diagnose a failure when retry creates duplicate case. Preserve an input/output evidence trace and rerun the same test after correction.</w:t>
-      </w:r>
-    </w:p>
-    <w:p>
-      <w:r>
-        <w:t>Measure. Duplicate-free retries divided by retries. Define numerator, denominator, time window and cohort before comparing a baseline with a pilot. Do not infer business value from activity counts alone.</w:t>
-      </w:r>
-    </w:p>
-    <w:p>
-      <w:r>
-        <w:t>Practice in Lab 08. Evidence: Dead-letter record with correlation ID; expected acceptance: No duplicate write on retry.</w:t>
-      </w:r>
-    </w:p>
-    <w:p>
-      <w:bookmarkStart w:id="65667" w:name="topic4"/>
+        <w:t>48. Board reporting</w:t>
+      </w:r>
+    </w:p>
+    <w:p>
+      <w:r>
+        <w:t>Business decision. Northstar Service starts with adoption, value, quality and risk metrics. Use Copilot in PowerPoint to draft a board update. The output is one-page board scorecard.</w:t>
+      </w:r>
+    </w:p>
+    <w:p>
+      <w:r>
+        <w:t>Copilot practice. 1. Open Copilot in PowerPoint and Chat in the approved Microsoft 365 work environment, or open the synthetic case pack. 2. State the executive decision, audience, source and constraints. 3. Ask Copilot for the named output and request assumptions and uncertainties. 4. Compare material claims and figures with the supplied source. 5. Edit and save a human-owned decision artifact. The matching Lab 10 gives a copy-ready prompt and detailed steps.</w:t>
+      </w:r>
+    </w:p>
+    <w:p>
+      <w:r>
+        <w:t>Executive gate. Every number has source and date. Challenge the result if board pack hides uncertainty. Record the decision owner and a corrective action.</w:t>
+      </w:r>
+    </w:p>
+    <w:p>
+      <w:r>
+        <w:t>Outcome measure. Claims with traceable evidence. State the baseline, cohort and period. Separate observed results from estimates before presenting value to a sponsor.</w:t>
+      </w:r>
+    </w:p>
+    <w:p>
+      <w:r>
+        <w:t>Practice in Lab 10. Evidence: One-page board scorecard; expected acceptance: Every number has source and date.</w:t>
+      </w:r>
+    </w:p>
+    <w:p>
+      <w:pPr>
+        <w:pStyle w:val="Heading2"/>
+      </w:pPr>
+      <w:r>
+        <w:t>49. Next-quarter roadmap</w:t>
+      </w:r>
+    </w:p>
+    <w:p>
+      <w:r>
+        <w:t>Business decision. Northstar Service starts with pilot findings and capacity limits. Ask Copilot to sequence the next three waves. The output is 90-day roadmap with gates.</w:t>
+      </w:r>
+    </w:p>
+    <w:p>
+      <w:r>
+        <w:t>Copilot practice. 1. Open Copilot in PowerPoint and Chat in the approved Microsoft 365 work environment, or open the synthetic case pack. 2. State the executive decision, audience, source and constraints. 3. Ask Copilot for the named output and request assumptions and uncertainties. 4. Compare material claims and figures with the supplied source. 5. Edit and save a human-owned decision artifact. The matching Lab 10 gives a copy-ready prompt and detailed steps.</w:t>
+      </w:r>
+    </w:p>
+    <w:p>
+      <w:r>
+        <w:t>Executive gate. Each wave has owner and stop rule. Challenge the result if scale outruns governance capacity. Record the decision owner and a corrective action.</w:t>
+      </w:r>
+    </w:p>
+    <w:p>
+      <w:r>
+        <w:t>Outcome measure. Wave gates met on schedule. State the baseline, cohort and period. Separate observed results from estimates before presenting value to a sponsor.</w:t>
+      </w:r>
+    </w:p>
+    <w:p>
+      <w:r>
+        <w:t>Practice in Lab 10. Evidence: 90-day roadmap with gates; expected acceptance: Each wave has owner and stop rule.</w:t>
+      </w:r>
+    </w:p>
+    <w:p>
+      <w:pPr>
+        <w:pStyle w:val="Heading2"/>
+      </w:pPr>
+      <w:r>
+        <w:t>50. Executive decision rehearsal</w:t>
+      </w:r>
+    </w:p>
+    <w:p>
+      <w:r>
+        <w:t>Business decision. Northstar Service starts with board challenge questions. Use Copilot to surface counterarguments. The output is final go, hold or stop record.</w:t>
+      </w:r>
+    </w:p>
+    <w:p>
+      <w:r>
+        <w:t>Copilot practice. 1. Open Copilot in PowerPoint and Chat in the approved Microsoft 365 work environment, or open the synthetic case pack. 2. State the executive decision, audience, source and constraints. 3. Ask Copilot for the named output and request assumptions and uncertainties. 4. Compare material claims and figures with the supplied source. 5. Edit and save a human-owned decision artifact. The matching Lab 10 gives a copy-ready prompt and detailed steps.</w:t>
+      </w:r>
+    </w:p>
+    <w:p>
+      <w:r>
+        <w:t>Executive gate. Executive states assumptions and dissent. Challenge the result if decision is made on a polished demo. Record the decision owner and a corrective action.</w:t>
+      </w:r>
+    </w:p>
+    <w:p>
+      <w:r>
+        <w:t>Outcome measure. Decision quality rubric score. State the baseline, cohort and period. Separate observed results from estimates before presenting value to a sponsor.</w:t>
+      </w:r>
+    </w:p>
+    <w:p>
+      <w:r>
+        <w:t>Practice in Lab 10. Evidence: Final go, hold or stop record; expected acceptance: Executive states assumptions and dissent.</w:t>
+      </w:r>
+    </w:p>
+    <w:p>
+      <w:bookmarkStart w:id="38300" w:name="labwalk"/>
       <w:pPr>
         <w:pStyle w:val="Heading1"/>
       </w:pPr>
       <w:r>
-        <w:t>Topic 4: AI Optimization, Performance Monitoring and Business Value Assessment</w:t>
-      </w:r>
-      <w:bookmarkEnd w:id="65667"/>
-    </w:p>
-    <w:p>
-      <w:r>
-        <w:t>Learning outcome: LO4. Official reference: https://learn.microsoft.com/en-us/microsoft-365/copilot/copilot-control-system/measurement-reporting</w:t>
-      </w:r>
-    </w:p>
-    <w:p>
-      <w:pPr>
-        <w:pStyle w:val="Heading2"/>
-      </w:pPr>
-      <w:r>
-        <w:t>39. Usage telemetry</w:t>
-      </w:r>
-    </w:p>
-    <w:p>
-      <w:r>
-        <w:t>Operational situation. Northstar Service starts with weekly usage export by cohort. The intended transformation is to join license, active use and role and produce adoption dashboard.</w:t>
-      </w:r>
-    </w:p>
-    <w:p>
-      <w:r>
-        <w:t>Procedure. 1. Open the relevant approved Microsoft 365 or Copilot Studio workspace, or the synthetic case record supplied in the lab. 2. Record the input and its owner. 3. Apply the transformation to a copy. 4. Compare the output with the source. 5. Log the reviewer, decision and date. Never claim a simulated configuration is a tenant deployment.</w:t>
-      </w:r>
-    </w:p>
-    <w:p>
-      <w:r>
-        <w:t>Control. Aggregate before sharing individual trends. Diagnose a failure when metric counts sign-in as productive use. Preserve an input/output evidence trace and rerun the same test after correction.</w:t>
-      </w:r>
-    </w:p>
-    <w:p>
-      <w:r>
-        <w:t>Measure. Weekly active users divided by licensed. Define numerator, denominator, time window and cohort before comparing a baseline with a pilot. Do not infer business value from activity counts alone.</w:t>
-      </w:r>
-    </w:p>
-    <w:p>
-      <w:r>
-        <w:t>Practice in Lab 08. Evidence: Adoption dashboard; expected acceptance: Aggregate before sharing individual trends.</w:t>
-      </w:r>
-    </w:p>
-    <w:p>
-      <w:pPr>
-        <w:pStyle w:val="Heading2"/>
-      </w:pPr>
-      <w:r>
-        <w:t>40. Agent quality rubric</w:t>
-      </w:r>
-    </w:p>
-    <w:p>
-      <w:r>
-        <w:t>Operational situation. Northstar Service starts with twenty task prompts with known answers. The intended transformation is to score accuracy, evidence and safety and produce evaluation matrix.</w:t>
-      </w:r>
-    </w:p>
-    <w:p>
-      <w:r>
-        <w:t>Procedure. 1. Open the relevant approved Microsoft 365 or Copilot Studio workspace, or the synthetic case record supplied in the lab. 2. Record the input and its owner. 3. Apply the transformation to a copy. 4. Compare the output with the source. 5. Log the reviewer, decision and date. Never claim a simulated configuration is a tenant deployment.</w:t>
-      </w:r>
-    </w:p>
-    <w:p>
-      <w:r>
-        <w:t>Control. Block release on critical safety failure. Diagnose a failure when high average hides one severe error. Preserve an input/output evidence trace and rerun the same test after correction.</w:t>
-      </w:r>
-    </w:p>
-    <w:p>
-      <w:r>
-        <w:t>Measure. Pass rate per risk tier. Define numerator, denominator, time window and cohort before comparing a baseline with a pilot. Do not infer business value from activity counts alone.</w:t>
-      </w:r>
-    </w:p>
-    <w:p>
-      <w:r>
-        <w:t>Practice in Lab 08. Evidence: Evaluation matrix; expected acceptance: Block release on critical safety failure.</w:t>
-      </w:r>
-    </w:p>
-    <w:p>
-      <w:pPr>
-        <w:pStyle w:val="Heading2"/>
-      </w:pPr>
-      <w:r>
-        <w:t>41. Golden test set</w:t>
-      </w:r>
-    </w:p>
-    <w:p>
-      <w:r>
-        <w:t>Operational situation. Northstar Service starts with representative questions and edge cases. The intended transformation is to version expected results and sources and produce regression test dataset.</w:t>
-      </w:r>
-    </w:p>
-    <w:p>
-      <w:r>
-        <w:t>Procedure. 1. Open the relevant approved Microsoft 365 or Copilot Studio workspace, or the synthetic case record supplied in the lab. 2. Record the input and its owner. 3. Apply the transformation to a copy. 4. Compare the output with the source. 5. Log the reviewer, decision and date. Never claim a simulated configuration is a tenant deployment.</w:t>
-      </w:r>
-    </w:p>
-    <w:p>
-      <w:r>
-        <w:t>Control. Data owner approves test updates. Diagnose a failure when test set contains stale expected answer. Preserve an input/output evidence trace and rerun the same test after correction.</w:t>
-      </w:r>
-    </w:p>
-    <w:p>
-      <w:r>
-        <w:t>Measure. Changed results per release. Define numerator, denominator, time window and cohort before comparing a baseline with a pilot. Do not infer business value from activity counts alone.</w:t>
-      </w:r>
-    </w:p>
-    <w:p>
-      <w:r>
-        <w:t>Practice in Lab 09. Evidence: Regression test dataset; expected acceptance: Data owner approves test updates.</w:t>
-      </w:r>
-    </w:p>
-    <w:p>
-      <w:pPr>
-        <w:pStyle w:val="Heading2"/>
-      </w:pPr>
-      <w:r>
-        <w:t>42. Time-saved estimate</w:t>
-      </w:r>
-    </w:p>
-    <w:p>
-      <w:r>
-        <w:t>Operational situation. Northstar Service starts with baseline 18 min and assisted 11 min. The intended transformation is to subtract review time and scale by volume and produce net time-saving model.</w:t>
-      </w:r>
-    </w:p>
-    <w:p>
-      <w:r>
-        <w:t>Procedure. 1. Open the relevant approved Microsoft 365 or Copilot Studio workspace, or the synthetic case record supplied in the lab. 2. Record the input and its owner. 3. Apply the transformation to a copy. 4. Compare the output with the source. 5. Log the reviewer, decision and date. Never claim a simulated configuration is a tenant deployment.</w:t>
-      </w:r>
-    </w:p>
-    <w:p>
-      <w:r>
-        <w:t>Control. Validate observed samples. Diagnose a failure when gross saving ignores review effort. Preserve an input/output evidence trace and rerun the same test after correction.</w:t>
-      </w:r>
-    </w:p>
-    <w:p>
-      <w:r>
-        <w:t>Measure. Net minutes saved per task. Define numerator, denominator, time window and cohort before comparing a baseline with a pilot. Do not infer business value from activity counts alone.</w:t>
-      </w:r>
-    </w:p>
-    <w:p>
-      <w:r>
-        <w:t>Practice in Lab 09. Evidence: Net time-saving model; expected acceptance: Validate observed samples.</w:t>
-      </w:r>
-    </w:p>
-    <w:p>
-      <w:pPr>
-        <w:pStyle w:val="Heading2"/>
-      </w:pPr>
-      <w:r>
-        <w:t>43. ROI model</w:t>
-      </w:r>
-    </w:p>
-    <w:p>
-      <w:r>
-        <w:t>Operational situation. Northstar Service starts with seats, license cost, volume and wage rate. The intended transformation is to compare realized value to total costs and produce conservative roi worksheet.</w:t>
-      </w:r>
-    </w:p>
-    <w:p>
-      <w:r>
-        <w:t>Procedure. 1. Open the relevant approved Microsoft 365 or Copilot Studio workspace, or the synthetic case record supplied in the lab. 2. Record the input and its owner. 3. Apply the transformation to a copy. 4. Compare the output with the source. 5. Log the reviewer, decision and date. Never claim a simulated configuration is a tenant deployment.</w:t>
-      </w:r>
-    </w:p>
-    <w:p>
-      <w:r>
-        <w:t>Control. Separate measured from assumed inputs. Diagnose a failure when benefit double-counts the same task. Preserve an input/output evidence trace and rerun the same test after correction.</w:t>
-      </w:r>
-    </w:p>
-    <w:p>
-      <w:r>
-        <w:t>Measure. (Value minus cost) divided by cost. Define numerator, denominator, time window and cohort before comparing a baseline with a pilot. Do not infer business value from activity counts alone.</w:t>
-      </w:r>
-    </w:p>
-    <w:p>
-      <w:r>
-        <w:t>Practice in Lab 09. Evidence: Conservative ROI worksheet; expected acceptance: Separate measured from assumed inputs.</w:t>
-      </w:r>
-    </w:p>
-    <w:p>
-      <w:pPr>
-        <w:pStyle w:val="Heading2"/>
-      </w:pPr>
-      <w:r>
-        <w:t>44. License optimization</w:t>
-      </w:r>
-    </w:p>
-    <w:p>
-      <w:r>
-        <w:t>Operational situation. Northstar Service starts with seat use by department and month. The intended transformation is to reclaim idle seats after review and produce reallocation recommendation.</w:t>
-      </w:r>
-    </w:p>
-    <w:p>
-      <w:r>
-        <w:t>Procedure. 1. Open the relevant approved Microsoft 365 or Copilot Studio workspace, or the synthetic case record supplied in the lab. 2. Record the input and its owner. 3. Apply the transformation to a copy. 4. Compare the output with the source. 5. Log the reviewer, decision and date. Never claim a simulated configuration is a tenant deployment.</w:t>
-      </w:r>
-    </w:p>
-    <w:p>
-      <w:r>
-        <w:t>Control. Line manager confirms exceptions. Diagnose a failure when idle seats kept while pilot waits. Preserve an input/output evidence trace and rerun the same test after correction.</w:t>
-      </w:r>
-    </w:p>
-    <w:p>
-      <w:r>
-        <w:t>Measure. Active seats divided by assigned seats. Define numerator, denominator, time window and cohort before comparing a baseline with a pilot. Do not infer business value from activity counts alone.</w:t>
-      </w:r>
-    </w:p>
-    <w:p>
-      <w:r>
-        <w:t>Practice in Lab 09. Evidence: Reallocation recommendation; expected acceptance: Line manager confirms exceptions.</w:t>
-      </w:r>
-    </w:p>
-    <w:p>
-      <w:pPr>
-        <w:pStyle w:val="Heading2"/>
-      </w:pPr>
-      <w:r>
-        <w:t>45. Latency budget</w:t>
-      </w:r>
-    </w:p>
-    <w:p>
-      <w:r>
-        <w:t>Operational situation. Northstar Service starts with prompt, retrieval and tool timings. The intended transformation is to decompose p50 and p95 response time and produce latency waterfall.</w:t>
-      </w:r>
-    </w:p>
-    <w:p>
-      <w:r>
-        <w:t>Procedure. 1. Open the relevant approved Microsoft 365 or Copilot Studio workspace, or the synthetic case record supplied in the lab. 2. Record the input and its owner. 3. Apply the transformation to a copy. 4. Compare the output with the source. 5. Log the reviewer, decision and date. Never claim a simulated configuration is a tenant deployment.</w:t>
-      </w:r>
-    </w:p>
-    <w:p>
-      <w:r>
-        <w:t>Control. Do not remove safety checks for speed. Diagnose a failure when tool call dominates p95. Preserve an input/output evidence trace and rerun the same test after correction.</w:t>
-      </w:r>
-    </w:p>
-    <w:p>
-      <w:r>
-        <w:t>Measure. p95 seconds per task. Define numerator, denominator, time window and cohort before comparing a baseline with a pilot. Do not infer business value from activity counts alone.</w:t>
-      </w:r>
-    </w:p>
-    <w:p>
-      <w:r>
-        <w:t>Practice in Lab 09. Evidence: Latency waterfall; expected acceptance: Do not remove safety checks for speed.</w:t>
-      </w:r>
-    </w:p>
-    <w:p>
-      <w:pPr>
-        <w:pStyle w:val="Heading2"/>
-      </w:pPr>
-      <w:r>
-        <w:t>46. Error budget</w:t>
-      </w:r>
-    </w:p>
-    <w:p>
-      <w:r>
-        <w:t>Operational situation. Northstar Service starts with failed action and unsafe answer logs. The intended transformation is to set severity-weighted threshold and produce error-budget burn chart.</w:t>
-      </w:r>
-    </w:p>
-    <w:p>
-      <w:r>
-        <w:t>Procedure. 1. Open the relevant approved Microsoft 365 or Copilot Studio workspace, or the synthetic case record supplied in the lab. 2. Record the input and its owner. 3. Apply the transformation to a copy. 4. Compare the output with the source. 5. Log the reviewer, decision and date. Never claim a simulated configuration is a tenant deployment.</w:t>
-      </w:r>
-    </w:p>
-    <w:p>
-      <w:r>
-        <w:t>Control. Pause rollout at threshold. Diagnose a failure when aggregate rate masks severe event. Preserve an input/output evidence trace and rerun the same test after correction.</w:t>
-      </w:r>
-    </w:p>
-    <w:p>
-      <w:r>
-        <w:t>Measure. Severe failures per 1000 tasks. Define numerator, denominator, time window and cohort before comparing a baseline with a pilot. Do not infer business value from activity counts alone.</w:t>
-      </w:r>
-    </w:p>
-    <w:p>
-      <w:r>
-        <w:t>Practice in Lab 10. Evidence: Error-budget burn chart; expected acceptance: Pause rollout at threshold.</w:t>
-      </w:r>
-    </w:p>
-    <w:p>
-      <w:pPr>
-        <w:pStyle w:val="Heading2"/>
-      </w:pPr>
-      <w:r>
-        <w:t>47. Feedback triage</w:t>
-      </w:r>
-    </w:p>
-    <w:p>
-      <w:r>
-        <w:t>Operational situation. Northstar Service starts with user corrections and support tickets. The intended transformation is to tag source, prompt, policy or tool cause and produce prioritized defect backlog.</w:t>
-      </w:r>
-    </w:p>
-    <w:p>
-      <w:r>
-        <w:t>Procedure. 1. Open the relevant approved Microsoft 365 or Copilot Studio workspace, or the synthetic case record supplied in the lab. 2. Record the input and its owner. 3. Apply the transformation to a copy. 4. Compare the output with the source. 5. Log the reviewer, decision and date. Never claim a simulated configuration is a tenant deployment.</w:t>
-      </w:r>
-    </w:p>
-    <w:p>
-      <w:r>
-        <w:t>Control. Preserve evidence and owner. Diagnose a failure when prompt tweak hides source defect. Preserve an input/output evidence trace and rerun the same test after correction.</w:t>
-      </w:r>
-    </w:p>
-    <w:p>
-      <w:r>
-        <w:t>Measure. Median time to close defect. Define numerator, denominator, time window and cohort before comparing a baseline with a pilot. Do not infer business value from activity counts alone.</w:t>
-      </w:r>
-    </w:p>
-    <w:p>
-      <w:r>
-        <w:t>Practice in Lab 10. Evidence: Prioritized defect backlog; expected acceptance: Preserve evidence and owner.</w:t>
-      </w:r>
-    </w:p>
-    <w:p>
-      <w:pPr>
-        <w:pStyle w:val="Heading2"/>
-      </w:pPr>
-      <w:r>
-        <w:t>48. Experiment design</w:t>
-      </w:r>
-    </w:p>
-    <w:p>
-      <w:r>
-        <w:t>Operational situation. Northstar Service starts with pilot and comparison cohorts. The intended transformation is to hold task and measurement constant and produce evaluation protocol.</w:t>
-      </w:r>
-    </w:p>
-    <w:p>
-      <w:r>
-        <w:t>Procedure. 1. Open the relevant approved Microsoft 365 or Copilot Studio workspace, or the synthetic case record supplied in the lab. 2. Record the input and its owner. 3. Apply the transformation to a copy. 4. Compare the output with the source. 5. Log the reviewer, decision and date. Never claim a simulated configuration is a tenant deployment.</w:t>
-      </w:r>
-    </w:p>
-    <w:p>
-      <w:r>
-        <w:t>Control. Avoid claiming causality from correlation. Diagnose a failure when different work mix biases result. Preserve an input/output evidence trace and rerun the same test after correction.</w:t>
-      </w:r>
-    </w:p>
-    <w:p>
-      <w:r>
-        <w:t>Measure. Adjusted change in cycle time. Define numerator, denominator, time window and cohort before comparing a baseline with a pilot. Do not infer business value from activity counts alone.</w:t>
-      </w:r>
-    </w:p>
-    <w:p>
-      <w:r>
-        <w:t>Practice in Lab 10. Evidence: Evaluation protocol; expected acceptance: Avoid claiming causality from correlation.</w:t>
-      </w:r>
-    </w:p>
-    <w:p>
-      <w:pPr>
-        <w:pStyle w:val="Heading2"/>
-      </w:pPr>
-      <w:r>
-        <w:t>49. Rollout wave gate</w:t>
-      </w:r>
-    </w:p>
-    <w:p>
-      <w:r>
-        <w:t>Operational situation. Northstar Service starts with pilot qa, security and adoption data. The intended transformation is to evaluate go or hold criteria and produce wave decision record.</w:t>
-      </w:r>
-    </w:p>
-    <w:p>
-      <w:r>
-        <w:t>Procedure. 1. Open the relevant approved Microsoft 365 or Copilot Studio workspace, or the synthetic case record supplied in the lab. 2. Record the input and its owner. 3. Apply the transformation to a copy. 4. Compare the output with the source. 5. Log the reviewer, decision and date. Never claim a simulated configuration is a tenant deployment.</w:t>
-      </w:r>
-    </w:p>
-    <w:p>
-      <w:r>
-        <w:t>Control. Named sponsor owns release. Diagnose a failure when wave launches without risk sign-off. Preserve an input/output evidence trace and rerun the same test after correction.</w:t>
-      </w:r>
-    </w:p>
-    <w:p>
-      <w:r>
-        <w:t>Measure. Criteria passed divided by required. Define numerator, denominator, time window and cohort before comparing a baseline with a pilot. Do not infer business value from activity counts alone.</w:t>
-      </w:r>
-    </w:p>
-    <w:p>
-      <w:r>
-        <w:t>Practice in Lab 10. Evidence: Wave decision record; expected acceptance: Named sponsor owns release.</w:t>
-      </w:r>
-    </w:p>
-    <w:p>
-      <w:pPr>
-        <w:pStyle w:val="Heading2"/>
-      </w:pPr>
-      <w:r>
-        <w:t>50. Retirement control</w:t>
-      </w:r>
-    </w:p>
-    <w:p>
-      <w:r>
-        <w:t>Operational situation. Northstar Service starts with unused agent and knowledge sources. The intended transformation is to disable access and retain required records and produce decommission checklist.</w:t>
-      </w:r>
-    </w:p>
-    <w:p>
-      <w:r>
-        <w:t>Procedure. 1. Open the relevant approved Microsoft 365 or Copilot Studio workspace, or the synthetic case record supplied in the lab. 2. Record the input and its owner. 3. Apply the transformation to a copy. 4. Compare the output with the source. 5. Log the reviewer, decision and date. Never claim a simulated configuration is a tenant deployment.</w:t>
-      </w:r>
-    </w:p>
-    <w:p>
-      <w:r>
-        <w:t>Control. Verify no dependent workflow remains. Diagnose a failure when connector remains active after agent removal. Preserve an input/output evidence trace and rerun the same test after correction.</w:t>
-      </w:r>
-    </w:p>
-    <w:p>
-      <w:r>
-        <w:t>Measure. Orphaned privileged grants count. Define numerator, denominator, time window and cohort before comparing a baseline with a pilot. Do not infer business value from activity counts alone.</w:t>
-      </w:r>
-    </w:p>
-    <w:p>
-      <w:r>
-        <w:t>Practice in Lab 10. Evidence: Decommission checklist; expected acceptance: Verify no dependent workflow remains.</w:t>
-      </w:r>
-    </w:p>
-    <w:p>
-      <w:bookmarkStart w:id="8818" w:name="labwalk"/>
+        <w:t>Lab walkthroughs</w:t>
+      </w:r>
+      <w:bookmarkEnd w:id="38300"/>
+    </w:p>
+    <w:p>
       <w:pPr>
         <w:pStyle w:val="Heading1"/>
       </w:pPr>
       <w:r>
-        <w:t>Lab walkthroughs</w:t>
-      </w:r>
-      <w:bookmarkEnd w:id="8818"/>
-    </w:p>
-    <w:p>
-      <w:pPr>
-        <w:pStyle w:val="Heading1"/>
-      </w:pPr>
-      <w:r>
         <w:t>Lab 01 walkthrough</w:t>
       </w:r>
     </w:p>
     <w:p>
       <w:r>
-        <w:t>Goal: Tenant readiness through Opportunity scoring using five synthetic case records. Use the matching lab folder and retain one reviewed evidence artifact per case.</w:t>
+        <w:t>Executive outcome: Executive transformation mandate. Use Microsoft Copilot Chat with five synthetic decisions. Save one reviewed, source-backed artifact for each decision.</w:t>
       </w:r>
     </w:p>
     <w:p>
@@ -2117,14 +2178,14 @@
     </w:p>
     <w:p>
       <w:r>
-        <w:t>UI reference: the following is an authentic screenshot from a separate synthetic Tertiary Infotech training tenant. Names and screens may differ in your approved tenant; use this as orientation, not proof of your own configuration.</w:t>
+        <w:t>Microsoft workflow reference: official Microsoft Support screenshot for orientation. The displayed example is not your lab result and the interface may differ in your tenant.</w:t>
       </w:r>
     </w:p>
     <w:p>
       <w:r>
         <w:drawing>
           <wp:inline xmlns:a="http://schemas.openxmlformats.org/drawingml/2006/main" xmlns:pic="http://schemas.openxmlformats.org/drawingml/2006/picture">
-            <wp:extent cx="5852160" cy="3628339"/>
+            <wp:extent cx="5852160" cy="3291840"/>
             <wp:docPr id="4" name="Picture 4"/>
             <wp:cNvGraphicFramePr>
               <a:graphicFrameLocks noChangeAspect="1"/>
@@ -2133,7 +2194,7 @@
               <a:graphicData uri="http://schemas.openxmlformats.org/drawingml/2006/picture">
                 <pic:pic>
                   <pic:nvPicPr>
-                    <pic:cNvPr id="0" name="ui-reference.png"/>
+                    <pic:cNvPr id="0" name="workflow-reference.png"/>
                     <pic:cNvPicPr/>
                   </pic:nvPicPr>
                   <pic:blipFill>
@@ -2145,7 +2206,7 @@
                   <pic:spPr>
                     <a:xfrm>
                       <a:off x="0" y="0"/>
-                      <a:ext cx="5852160" cy="3628339"/>
+                      <a:ext cx="5852160" cy="3291840"/>
                     </a:xfrm>
                     <a:prstGeom prst="rect"/>
                   </pic:spPr>
@@ -2158,7 +2219,12 @@
     </w:p>
     <w:p>
       <w:r>
-        <w:t>Preparation: open lab-01/scenario.csv, roles.csv, pilot-metrics.csv and source-pack.md. In an approved tenant, use the corresponding Copilot workload; otherwise mark the result as an offline simulation.</w:t>
+        <w:t>Screenshot source: https://support.microsoft.com/en-us/microsoft-365-copilot/draft-content-with-microsoft-365-copilot-chat-and-copilot-pages</w:t>
+      </w:r>
+    </w:p>
+    <w:p>
+      <w:r>
+        <w:t>Preparation: open lab-01/README.md, source-pack.md, scenario.csv, prompt-cards.md and value-model.csv. Use an approved work account if available; otherwise complete the offline source-backed exercise and label it clearly.</w:t>
       </w:r>
     </w:p>
     <w:p>
@@ -2166,7 +2232,7 @@
         <w:pStyle w:val="ListNumber"/>
       </w:pPr>
       <w:r>
-        <w:t>Step 1 — Tenant readiness: locate NS-01 in scenario.csv. Confirm role and source access in roles.csv. Check identities, data estate and licensed workload availability. Save readiness register with owner and gap with the source version. Apply this acceptance gate: Admin signs off app and data prerequisites. Run this negative test: Licensed user lacks a supported app or data source. Record eligible users divided by target users and an assessor-visible screenshot or file export when a tenant is available.</w:t>
+        <w:t>Step 1 — Transformation ambition: locate NS-01 in scenario.csv and read the matching source-pack section. In Microsoft Copilot Chat, use prompt-cards.md to ask for the decision artifact. Use Copilot Chat to compare three improvement ambitions. Save one-page transformation mandate. Check: CEO approves a measurable business problem. Challenge: Ambition is only a technology slogan. Report target service-cycle reduction, source, assumptions, reviewer and date.</w:t>
       </w:r>
     </w:p>
     <w:p>
@@ -2174,7 +2240,7 @@
         <w:pStyle w:val="ListNumber"/>
       </w:pPr>
       <w:r>
-        <w:t>Step 2 — License allocation: locate NS-02 in scenario.csv. Confirm role and source access in roles.csv. Match entitlement to high-frequency document tasks. Save license assignment and cohort list with the source version. Apply this acceptance gate: Approve seats against role and cost center. Run this negative test: Seat assigned but service plan disabled. Record active pilot users divided by assigned seats and an assessor-visible screenshot or file export when a tenant is available.</w:t>
+        <w:t>Step 2 — Value pool map: locate NS-02 in scenario.csv and read the matching source-pack section. In Microsoft Copilot Chat, use prompt-cards.md to ask for the decision artifact. Ask Copilot to cluster recurring knowledge-work opportunities. Save value pool map with owner. Check: Keep only opportunities tied to a named outcome. Challenge: High-volume activity has no customer value. Report annual addressable hours by pool, source, assumptions, reviewer and date.</w:t>
       </w:r>
     </w:p>
     <w:p>
@@ -2182,7 +2248,7 @@
         <w:pStyle w:val="ListNumber"/>
       </w:pPr>
       <w:r>
-        <w:t>Step 3 — Graph permission scope: locate NS-03 in scenario.csv. Confirm role and source access in roles.csv. Compare search results under user A and user B. Save access matrix with allowed files with the source version. Apply this acceptance gate: Least privilege and owner review. Run this negative test: Overshared file appears in both result sets. Record unexpected accessible files count and an assessor-visible screenshot or file export when a tenant is available.</w:t>
+        <w:t>Step 3 — Executive sponsor: locate NS-03 in scenario.csv and read the matching source-pack section. In Microsoft Copilot Chat, use prompt-cards.md to ask for the decision artifact. Draft a sponsor brief in Word with Copilot. Save sponsor decision and named accountable owner. Check: Sponsor commits a review cadence. Challenge: No executive owns the benefit. Report sponsor decisions closed on time, source, assumptions, reviewer and date.</w:t>
       </w:r>
     </w:p>
     <w:p>
@@ -2190,7 +2256,7 @@
         <w:pStyle w:val="ListNumber"/>
       </w:pPr>
       <w:r>
-        <w:t>Step 4 — Business-process mapping: locate NS-04 in scenario.csv. Confirm role and source access in roles.csv. Mark drafting, lookup and approval steps. Save current-to-future swimlane with the source version. Apply this acceptance gate: Keep human approval on customer-facing send. Run this negative test: Automation bypasses approval. Record median handoff time in minutes and an assessor-visible screenshot or file export when a tenant is available.</w:t>
+        <w:t>Step 4 — Stakeholder alignment: locate NS-04 in scenario.csv and read the matching source-pack section. In Microsoft Copilot Chat, use prompt-cards.md to ask for the decision artifact. Summarise the competing positions with Copilot. Save stakeholder trade-off matrix. Check: Record dissent before selecting a pilot. Challenge: Risk concern is omitted from the brief. Report unresolved stakeholder objections, source, assumptions, reviewer and date.</w:t>
       </w:r>
     </w:p>
     <w:p>
@@ -2198,17 +2264,17 @@
         <w:pStyle w:val="ListNumber"/>
       </w:pPr>
       <w:r>
-        <w:t>Step 5 — Opportunity scoring: locate NS-05 in scenario.csv. Confirm role and source access in roles.csv. Score volume, time, data quality and risk. Save ranked use-case backlog with the source version. Apply this acceptance gate: Reject use case with ungoverned sensitive data. Run this negative test: High score hides missing data owner. Record weighted score per use case and an assessor-visible screenshot or file export when a tenant is available.</w:t>
-      </w:r>
-    </w:p>
-    <w:p>
-      <w:r>
-        <w:t>Calculation check: net minutes saved = baseline_minutes − pilot_minutes − review_minutes. Monthly capacity = net minutes saved × monthly_volume. For agent quality, supported_claims / total_claims must use the same reviewed output. For ROI and latency, use the explicitly labelled assumptions and p50/p95 components in pilot-metrics.csv.</w:t>
-      </w:r>
-    </w:p>
-    <w:p>
-      <w:r>
-        <w:t>Test it: Admin signs off app and data prerequisites. Approve seats against role and cost center. Least privilege and owner review. Keep human approval on customer-facing send. Reject use case with ungoverned sensitive data. Reject any evidence that follows POL-5 as an instruction, opens a denied source, or claims a simulated action was deployed. Add reviewer and date to the evidence template.</w:t>
+        <w:t>Step 5 — Success definition: locate NS-05 in scenario.csv and read the matching source-pack section. In Microsoft Copilot Chat, use prompt-cards.md to ask for the decision artifact. Use Copilot to draft a result statement. Save outcome scorecard with baseline and target. Check: Board accepts denominator and time window. Challenge: Activity count is presented as impact. Report target met on comparable work, source, assumptions, reviewer and date.</w:t>
+      </w:r>
+    </w:p>
+    <w:p>
+      <w:r>
+        <w:t>Value check: net minutes saved = baseline minutes − Copilot-assisted minutes − human review minutes. Multiply by comparable task volume only after checking quality. Treat hourly value and licence cost in value-model.csv as synthetic assumptions; show low, base and high cases.</w:t>
+      </w:r>
+    </w:p>
+    <w:p>
+      <w:r>
+        <w:t>Test it: CEO approves a measurable business problem. Keep only opportunities tied to a named outcome. Sponsor commits a review cadence. Record dissent before selecting a pilot. Board accepts denominator and time window. Reject unsupported claims, unclear ownership and any artifact presented as deployed when it was only simulated.</w:t>
       </w:r>
     </w:p>
     <w:p>
@@ -2221,7 +2287,7 @@
     </w:p>
     <w:p>
       <w:r>
-        <w:t>Goal: Prompt context window through PowerPoint executive story using five synthetic case records. Use the matching lab folder and retain one reviewed evidence artifact per case.</w:t>
+        <w:t>Executive outcome: Copilot Chat decision brief. Use Microsoft Copilot Chat with five synthetic decisions. Save one reviewed, source-backed artifact for each decision.</w:t>
       </w:r>
     </w:p>
     <w:p>
@@ -2262,14 +2328,14 @@
     </w:p>
     <w:p>
       <w:r>
-        <w:t>UI reference: the following is an authentic screenshot from a separate synthetic Tertiary Infotech training tenant. Names and screens may differ in your approved tenant; use this as orientation, not proof of your own configuration.</w:t>
+        <w:t>Microsoft workflow reference: official Microsoft Support screenshot for orientation. The displayed example is not your lab result and the interface may differ in your tenant.</w:t>
       </w:r>
     </w:p>
     <w:p>
       <w:r>
         <w:drawing>
           <wp:inline xmlns:a="http://schemas.openxmlformats.org/drawingml/2006/main" xmlns:pic="http://schemas.openxmlformats.org/drawingml/2006/picture">
-            <wp:extent cx="5852160" cy="3142211"/>
+            <wp:extent cx="5852160" cy="3291840"/>
             <wp:docPr id="6" name="Picture 6"/>
             <wp:cNvGraphicFramePr>
               <a:graphicFrameLocks noChangeAspect="1"/>
@@ -2278,11 +2344,11 @@
               <a:graphicData uri="http://schemas.openxmlformats.org/drawingml/2006/picture">
                 <pic:pic>
                   <pic:nvPicPr>
-                    <pic:cNvPr id="0" name="ui-reference.png"/>
+                    <pic:cNvPr id="0" name="workflow-reference.png"/>
                     <pic:cNvPicPr/>
                   </pic:nvPicPr>
                   <pic:blipFill>
-                    <a:blip r:embed="rId16"/>
+                    <a:blip r:embed="rId14"/>
                     <a:stretch>
                       <a:fillRect/>
                     </a:stretch>
@@ -2290,7 +2356,7 @@
                   <pic:spPr>
                     <a:xfrm>
                       <a:off x="0" y="0"/>
-                      <a:ext cx="5852160" cy="3142211"/>
+                      <a:ext cx="5852160" cy="3291840"/>
                     </a:xfrm>
                     <a:prstGeom prst="rect"/>
                   </pic:spPr>
@@ -2303,7 +2369,12 @@
     </w:p>
     <w:p>
       <w:r>
-        <w:t>Preparation: open lab-02/scenario.csv, roles.csv, pilot-metrics.csv and source-pack.md. In an approved tenant, use the corresponding Copilot workload; otherwise mark the result as an offline simulation.</w:t>
+        <w:t>Screenshot source: https://support.microsoft.com/en-us/microsoft-365-copilot/draft-content-with-microsoft-365-copilot-chat-and-copilot-pages</w:t>
+      </w:r>
+    </w:p>
+    <w:p>
+      <w:r>
+        <w:t>Preparation: open lab-02/README.md, source-pack.md, scenario.csv, prompt-cards.md and value-model.csv. Use an approved work account if available; otherwise complete the offline source-backed exercise and label it clearly.</w:t>
       </w:r>
     </w:p>
     <w:p>
@@ -2311,7 +2382,7 @@
         <w:pStyle w:val="ListNumber"/>
       </w:pPr>
       <w:r>
-        <w:t>Step 1 — Prompt context window: locate NS-06 in scenario.csv. Confirm role and source access in roles.csv. Separate task, context, constraints and format. Save reusable prompt card with the source version. Apply this acceptance gate: Never paste personal data into unmanaged chat. Run this negative test: Answer omits policy exception. Record grounded claims divided by claims and an assessor-visible screenshot or file export when a tenant is available.</w:t>
+        <w:t>Step 1 — Copilot Chat briefing: locate NS-06 in scenario.csv and read the matching source-pack section. In Microsoft Copilot Chat, use prompt-cards.md to ask for the decision artifact. Ask Copilot Chat for a sourced executive summary. Save five-point decision brief. Check: Verify each material claim against the pack. Challenge: Plausible but unsupported claim. Report supported claims divided by claims, source, assumptions, reviewer and date.</w:t>
       </w:r>
     </w:p>
     <w:p>
@@ -2319,7 +2390,7 @@
         <w:pStyle w:val="ListNumber"/>
       </w:pPr>
       <w:r>
-        <w:t>Step 2 — Grounded retrieval: locate NS-07 in scenario.csv. Confirm role and source access in roles.csv. Retrieve accessible passages before generation. Save answer with source citations with the source version. Apply this acceptance gate: Verify source version and user permission. Run this negative test: Citation points to superseded policy. Record supported answer statements divided by total and an assessor-visible screenshot or file export when a tenant is available.</w:t>
+        <w:t>Step 2 — Question refinement: locate NS-07 in scenario.csv and read the matching source-pack section. In Microsoft Copilot Chat, use prompt-cards.md to ask for the decision artifact. Refine goal, context, constraints and format in Copilot. Save reusable executive prompt. Check: Prompt names audience and decision. Challenge: Response is polished but irrelevant. Report decision-relevant points per answer, source, assumptions, reviewer and date.</w:t>
       </w:r>
     </w:p>
     <w:p>
@@ -2327,7 +2398,7 @@
         <w:pStyle w:val="ListNumber"/>
       </w:pPr>
       <w:r>
-        <w:t>Step 3 — Word proposal draft: locate NS-08 in scenario.csv. Confirm role and source access in roles.csv. Generate structure then compare to source register. Save draft proposal with evidence comments with the source version. Apply this acceptance gate: Human owns final facts and approval. Run this negative test: Unsupported cost claim enters draft. Record verified claims divided by total claims and an assessor-visible screenshot or file export when a tenant is available.</w:t>
+        <w:t>Step 3 — Source challenge: locate NS-08 in scenario.csv and read the matching source-pack section. In Microsoft Copilot Chat, use prompt-cards.md to ask for the decision artifact. Ask Copilot to identify differences and uncertainty. Save source conflict register. Check: Owner resolves the authoritative version. Challenge: Retired document becomes the basis. Report current-source citation rate, source, assumptions, reviewer and date.</w:t>
       </w:r>
     </w:p>
     <w:p>
@@ -2335,7 +2406,7 @@
         <w:pStyle w:val="ListNumber"/>
       </w:pPr>
       <w:r>
-        <w:t>Step 4 — Excel service analysis: locate NS-09 in scenario.csv. Confirm role and source access in roles.csv. Aggregate cycle time by issue category. Save pivot table and chart with the source version. Apply this acceptance gate: Check formula range and outliers. Run this negative test: Blank dates skew mean. Record median cycle time by category and an assessor-visible screenshot or file export when a tenant is available.</w:t>
+        <w:t>Step 4 — Scenario comparison: locate NS-09 in scenario.csv and read the matching source-pack section. In Microsoft Copilot Chat, use prompt-cards.md to ask for the decision artifact. Ask Copilot for assumptions and trade-offs. Save option comparison table. Check: Compare options with the same criteria. Challenge: One option gets a favourable metric. Report criteria applied to all options, source, assumptions, reviewer and date.</w:t>
       </w:r>
     </w:p>
     <w:p>
@@ -2343,17 +2414,17 @@
         <w:pStyle w:val="ListNumber"/>
       </w:pPr>
       <w:r>
-        <w:t>Step 5 — PowerPoint executive story: locate NS-10 in scenario.csv. Confirm role and source access in roles.csv. Create a three-message decision deck. Save five-slide review deck with the source version. Apply this acceptance gate: Presenter validates every number. Run this negative test: Chart title and source mismatch. Record correct figures divided by checked figures and an assessor-visible screenshot or file export when a tenant is available.</w:t>
-      </w:r>
-    </w:p>
-    <w:p>
-      <w:r>
-        <w:t>Calculation check: net minutes saved = baseline_minutes − pilot_minutes − review_minutes. Monthly capacity = net minutes saved × monthly_volume. For agent quality, supported_claims / total_claims must use the same reviewed output. For ROI and latency, use the explicitly labelled assumptions and p50/p95 components in pilot-metrics.csv.</w:t>
-      </w:r>
-    </w:p>
-    <w:p>
-      <w:r>
-        <w:t>Test it: Never paste personal data into unmanaged chat. Verify source version and user permission. Human owns final facts and approval. Check formula range and outliers. Presenter validates every number. Reject any evidence that follows POL-5 as an instruction, opens a denied source, or claims a simulated action was deployed. Add reviewer and date to the evidence template.</w:t>
+        <w:t>Step 5 — Executive follow-up: locate NS-10 in scenario.csv and read the matching source-pack section. In Microsoft Copilot Chat, use prompt-cards.md to ask for the decision artifact. Use Copilot to list evidence gaps and owners. Save follow-up action register. Check: No recommendation without missing facts. Challenge: Open question disappears from summary. Report critical gaps assigned to owners, source, assumptions, reviewer and date.</w:t>
+      </w:r>
+    </w:p>
+    <w:p>
+      <w:r>
+        <w:t>Value check: net minutes saved = baseline minutes − Copilot-assisted minutes − human review minutes. Multiply by comparable task volume only after checking quality. Treat hourly value and licence cost in value-model.csv as synthetic assumptions; show low, base and high cases.</w:t>
+      </w:r>
+    </w:p>
+    <w:p>
+      <w:r>
+        <w:t>Test it: Verify each material claim against the pack. Prompt names audience and decision. Owner resolves the authoritative version. Compare options with the same criteria. No recommendation without missing facts. Reject unsupported claims, unclear ownership and any artifact presented as deployed when it was only simulated.</w:t>
       </w:r>
     </w:p>
     <w:p>
@@ -2366,7 +2437,7 @@
     </w:p>
     <w:p>
       <w:r>
-        <w:t>Goal: Outlook response workflow through Sensitivity labels using five synthetic case records. Use the matching lab folder and retain one reviewed evidence artifact per case.</w:t>
+        <w:t>Executive outcome: Board memo and story. Use Copilot in Word and PowerPoint with five synthetic decisions. Save one reviewed, source-backed artifact for each decision.</w:t>
       </w:r>
     </w:p>
     <w:p>
@@ -2386,7 +2457,7 @@
                     <pic:cNvPicPr/>
                   </pic:nvPicPr>
                   <pic:blipFill>
-                    <a:blip r:embed="rId17"/>
+                    <a:blip r:embed="rId16"/>
                     <a:stretch>
                       <a:fillRect/>
                     </a:stretch>
@@ -2407,14 +2478,14 @@
     </w:p>
     <w:p>
       <w:r>
-        <w:t>UI reference: the following is an authentic screenshot from a separate synthetic Tertiary Infotech training tenant. Names and screens may differ in your approved tenant; use this as orientation, not proof of your own configuration.</w:t>
+        <w:t>Microsoft workflow reference: official Microsoft Support screenshot for orientation. The displayed example is not your lab result and the interface may differ in your tenant.</w:t>
       </w:r>
     </w:p>
     <w:p>
       <w:r>
         <w:drawing>
           <wp:inline xmlns:a="http://schemas.openxmlformats.org/drawingml/2006/main" xmlns:pic="http://schemas.openxmlformats.org/drawingml/2006/picture">
-            <wp:extent cx="5852160" cy="4548663"/>
+            <wp:extent cx="5852160" cy="3298490"/>
             <wp:docPr id="8" name="Picture 8"/>
             <wp:cNvGraphicFramePr>
               <a:graphicFrameLocks noChangeAspect="1"/>
@@ -2423,11 +2494,11 @@
               <a:graphicData uri="http://schemas.openxmlformats.org/drawingml/2006/picture">
                 <pic:pic>
                   <pic:nvPicPr>
-                    <pic:cNvPr id="0" name="ui-reference.png"/>
+                    <pic:cNvPr id="0" name="workflow-reference.png"/>
                     <pic:cNvPicPr/>
                   </pic:nvPicPr>
                   <pic:blipFill>
-                    <a:blip r:embed="rId18"/>
+                    <a:blip r:embed="rId17"/>
                     <a:stretch>
                       <a:fillRect/>
                     </a:stretch>
@@ -2435,7 +2506,7 @@
                   <pic:spPr>
                     <a:xfrm>
                       <a:off x="0" y="0"/>
-                      <a:ext cx="5852160" cy="4548663"/>
+                      <a:ext cx="5852160" cy="3298490"/>
                     </a:xfrm>
                     <a:prstGeom prst="rect"/>
                   </pic:spPr>
@@ -2448,7 +2519,12 @@
     </w:p>
     <w:p>
       <w:r>
-        <w:t>Preparation: open lab-03/scenario.csv, roles.csv, pilot-metrics.csv and source-pack.md. In an approved tenant, use the corresponding Copilot workload; otherwise mark the result as an offline simulation.</w:t>
+        <w:t>Screenshot source: https://support.microsoft.com/en-us/microsoft-365-copilot/how-copilot-chat-works-in-microsoft-365-apps</w:t>
+      </w:r>
+    </w:p>
+    <w:p>
+      <w:r>
+        <w:t>Preparation: open lab-03/README.md, source-pack.md, scenario.csv, prompt-cards.md and value-model.csv. Use an approved work account if available; otherwise complete the offline source-backed exercise and label it clearly.</w:t>
       </w:r>
     </w:p>
     <w:p>
@@ -2456,7 +2532,7 @@
         <w:pStyle w:val="ListNumber"/>
       </w:pPr>
       <w:r>
-        <w:t>Step 1 — Outlook response workflow: locate NS-11 in scenario.csv. Confirm role and source access in roles.csv. Draft acknowledgement and response options. Save reviewed reply with owner and deadline with the source version. Apply this acceptance gate: Send remains a human action. Run this negative test: Tone implies an unapproved commitment. Record replies with explicit next owner and an assessor-visible screenshot or file export when a tenant is available.</w:t>
+        <w:t>Step 1 — Word strategy memo: locate NS-11 in scenario.csv and read the matching source-pack section. In Copilot in Word and PowerPoint, use prompt-cards.md to ask for the decision artifact. Draft a decision memo with Copilot in Word. Save two-page strategy memo. Check: Human executive signs the recommendation. Challenge: Draft invents a savings figure. Report verified material claims, source, assumptions, reviewer and date.</w:t>
       </w:r>
     </w:p>
     <w:p>
@@ -2464,7 +2540,7 @@
         <w:pStyle w:val="ListNumber"/>
       </w:pPr>
       <w:r>
-        <w:t>Step 2 — Teams meeting synthesis: locate NS-12 in scenario.csv. Confirm role and source access in roles.csv. Extract decisions, dissent and open questions. Save action register with timestamps with the source version. Apply this acceptance gate: Meeting owner confirms transcript accuracy. Run this negative test: Speaker attribution is wrong. Record confirmed actions divided by extracted actions and an assessor-visible screenshot or file export when a tenant is available.</w:t>
+        <w:t>Step 2 — Recommendation logic: locate NS-12 in scenario.csv and read the matching source-pack section. In Copilot in Word and PowerPoint, use prompt-cards.md to ask for the decision artifact. Ask Copilot to test the logic of a recommendation. Save recommendation with assumptions. Check: State rejected alternatives and rationale. Challenge: Trade-off is hidden. Report board questions answered with evidence, source, assumptions, reviewer and date.</w:t>
       </w:r>
     </w:p>
     <w:p>
@@ -2472,7 +2548,7 @@
         <w:pStyle w:val="ListNumber"/>
       </w:pPr>
       <w:r>
-        <w:t>Step 3 — Adoption rollout: locate NS-13 in scenario.csv. Confirm role and source access in roles.csv. Sequence champions, learning and support. Save 30-60-90 day rollout plan with the source version. Apply this acceptance gate: Gate wave two on measured quality. Run this negative test: Low adoption despite licenses. Record weekly active usage by cohort and an assessor-visible screenshot or file export when a tenant is available.</w:t>
+        <w:t>Step 3 — PowerPoint board story: locate NS-13 in scenario.csv and read the matching source-pack section. In Copilot in Word and PowerPoint, use prompt-cards.md to ask for the decision artifact. Create a concise executive deck with Copilot in PowerPoint. Save five-slide board narrative. Check: Every chart traces to approved numbers. Challenge: Slide claims exceed the source. Report figures verified before review, source, assumptions, reviewer and date.</w:t>
       </w:r>
     </w:p>
     <w:p>
@@ -2480,7 +2556,7 @@
         <w:pStyle w:val="ListNumber"/>
       </w:pPr>
       <w:r>
-        <w:t>Step 4 — Identity and MFA: locate NS-14 in scenario.csv. Confirm role and source access in roles.csv. Require appropriate identity assurance. Save conditional-access decision log with the source version. Apply this acceptance gate: Security team owns exception process. Run this negative test: Shared account bypasses attribution. Record protected sign-ins divided by sign-ins and an assessor-visible screenshot or file export when a tenant is available.</w:t>
+        <w:t>Step 4 — Decision appendix: locate NS-14 in scenario.csv and read the matching source-pack section. In Copilot in Word and PowerPoint, use prompt-cards.md to ask for the decision artifact. Use Copilot to structure board Q&amp;A. Save board appendix and question log. Check: Distinguish evidence from assumptions. Challenge: Appendix repeats unsupported claims. Report questions with grounded answers, source, assumptions, reviewer and date.</w:t>
       </w:r>
     </w:p>
     <w:p>
@@ -2488,17 +2564,17 @@
         <w:pStyle w:val="ListNumber"/>
       </w:pPr>
       <w:r>
-        <w:t>Step 5 — Sensitivity labels: locate NS-15 in scenario.csv. Confirm role and source access in roles.csv. Map labels to sharing and Copilot exposure. Save label policy matrix with the source version. Apply this acceptance gate: Data owner reviews label changes. Run this negative test: Confidential file labelled public. Record mislabelled sampled files count and an assessor-visible screenshot or file export when a tenant is available.</w:t>
-      </w:r>
-    </w:p>
-    <w:p>
-      <w:r>
-        <w:t>Calculation check: net minutes saved = baseline_minutes − pilot_minutes − review_minutes. Monthly capacity = net minutes saved × monthly_volume. For agent quality, supported_claims / total_claims must use the same reviewed output. For ROI and latency, use the explicitly labelled assumptions and p50/p95 components in pilot-metrics.csv.</w:t>
-      </w:r>
-    </w:p>
-    <w:p>
-      <w:r>
-        <w:t>Test it: Send remains a human action. Meeting owner confirms transcript accuracy. Gate wave two on measured quality. Security team owns exception process. Data owner reviews label changes. Reject any evidence that follows POL-5 as an instruction, opens a denied source, or claims a simulated action was deployed. Add reviewer and date to the evidence template.</w:t>
+        <w:t>Step 5 — Leadership communication: locate NS-15 in scenario.csv and read the matching source-pack section. In Copilot in Word and PowerPoint, use prompt-cards.md to ask for the decision artifact. Draft a leader message with Copilot in Outlook. Save change announcement for review. Check: No send until approved by sponsor. Challenge: Message promises unapproved outcomes. Report message comprehension in pilot survey, source, assumptions, reviewer and date.</w:t>
+      </w:r>
+    </w:p>
+    <w:p>
+      <w:r>
+        <w:t>Value check: net minutes saved = baseline minutes − Copilot-assisted minutes − human review minutes. Multiply by comparable task volume only after checking quality. Treat hourly value and licence cost in value-model.csv as synthetic assumptions; show low, base and high cases.</w:t>
+      </w:r>
+    </w:p>
+    <w:p>
+      <w:r>
+        <w:t>Test it: Human executive signs the recommendation. State rejected alternatives and rationale. Every chart traces to approved numbers. Distinguish evidence from assumptions. No send until approved by sponsor. Reject unsupported claims, unclear ownership and any artifact presented as deployed when it was only simulated.</w:t>
       </w:r>
     </w:p>
     <w:p>
@@ -2511,7 +2587,7 @@
     </w:p>
     <w:p>
       <w:r>
-        <w:t>Goal: DLP boundaries through Prompt-injection boundary using five synthetic case records. Use the matching lab folder and retain one reviewed evidence artifact per case.</w:t>
+        <w:t>Executive outcome: Information and decision boundaries. Use Microsoft Copilot Chat with five synthetic decisions. Save one reviewed, source-backed artifact for each decision.</w:t>
       </w:r>
     </w:p>
     <w:p>
@@ -2528,6 +2604,156 @@
                 <pic:pic>
                   <pic:nvPicPr>
                     <pic:cNvPr id="0" name="lab-04-flow.png"/>
+                    <pic:cNvPicPr/>
+                  </pic:nvPicPr>
+                  <pic:blipFill>
+                    <a:blip r:embed="rId18"/>
+                    <a:stretch>
+                      <a:fillRect/>
+                    </a:stretch>
+                  </pic:blipFill>
+                  <pic:spPr>
+                    <a:xfrm>
+                      <a:off x="0" y="0"/>
+                      <a:ext cx="5852160" cy="1131418"/>
+                    </a:xfrm>
+                    <a:prstGeom prst="rect"/>
+                  </pic:spPr>
+                </pic:pic>
+              </a:graphicData>
+            </a:graphic>
+          </wp:inline>
+        </w:drawing>
+      </w:r>
+    </w:p>
+    <w:p>
+      <w:r>
+        <w:t>Microsoft workflow reference: official Microsoft Support screenshot for orientation. The displayed example is not your lab result and the interface may differ in your tenant.</w:t>
+      </w:r>
+    </w:p>
+    <w:p>
+      <w:r>
+        <w:drawing>
+          <wp:inline xmlns:a="http://schemas.openxmlformats.org/drawingml/2006/main" xmlns:pic="http://schemas.openxmlformats.org/drawingml/2006/picture">
+            <wp:extent cx="5852160" cy="3291840"/>
+            <wp:docPr id="10" name="Picture 10"/>
+            <wp:cNvGraphicFramePr>
+              <a:graphicFrameLocks noChangeAspect="1"/>
+            </wp:cNvGraphicFramePr>
+            <a:graphic>
+              <a:graphicData uri="http://schemas.openxmlformats.org/drawingml/2006/picture">
+                <pic:pic>
+                  <pic:nvPicPr>
+                    <pic:cNvPr id="0" name="workflow-reference.png"/>
+                    <pic:cNvPicPr/>
+                  </pic:nvPicPr>
+                  <pic:blipFill>
+                    <a:blip r:embed="rId14"/>
+                    <a:stretch>
+                      <a:fillRect/>
+                    </a:stretch>
+                  </pic:blipFill>
+                  <pic:spPr>
+                    <a:xfrm>
+                      <a:off x="0" y="0"/>
+                      <a:ext cx="5852160" cy="3291840"/>
+                    </a:xfrm>
+                    <a:prstGeom prst="rect"/>
+                  </pic:spPr>
+                </pic:pic>
+              </a:graphicData>
+            </a:graphic>
+          </wp:inline>
+        </w:drawing>
+      </w:r>
+    </w:p>
+    <w:p>
+      <w:r>
+        <w:t>Screenshot source: https://support.microsoft.com/en-us/microsoft-365-copilot/draft-content-with-microsoft-365-copilot-chat-and-copilot-pages</w:t>
+      </w:r>
+    </w:p>
+    <w:p>
+      <w:r>
+        <w:t>Preparation: open lab-04/README.md, source-pack.md, scenario.csv, prompt-cards.md and value-model.csv. Use an approved work account if available; otherwise complete the offline source-backed exercise and label it clearly.</w:t>
+      </w:r>
+    </w:p>
+    <w:p>
+      <w:pPr>
+        <w:pStyle w:val="ListNumber"/>
+      </w:pPr>
+      <w:r>
+        <w:t>Step 1 — Information boundary: locate NS-16 in scenario.csv and read the matching source-pack section. In Microsoft Copilot Chat, use prompt-cards.md to ask for the decision artifact. Decide which content may be used with Copilot. Save data-use decision table. Check: Data owner approves permitted sources. Challenge: Sensitive source is broadly shared. Report restricted exposures found in review, source, assumptions, reviewer and date.</w:t>
+      </w:r>
+    </w:p>
+    <w:p>
+      <w:pPr>
+        <w:pStyle w:val="ListNumber"/>
+      </w:pPr>
+      <w:r>
+        <w:t>Step 2 — Permission reality: locate NS-17 in scenario.csv and read the matching source-pack section. In Microsoft Copilot Chat, use prompt-cards.md to ask for the decision artifact. Request the same summary under each approved identity. Save access-test evidence record. Check: Security owner reviews unexpected access. Challenge: User receives material outside role. Report unexpected accessible files, source, assumptions, reviewer and date.</w:t>
+      </w:r>
+    </w:p>
+    <w:p>
+      <w:pPr>
+        <w:pStyle w:val="ListNumber"/>
+      </w:pPr>
+      <w:r>
+        <w:t>Step 3 — Source reliability: locate NS-18 in scenario.csv and read the matching source-pack section. In Microsoft Copilot Chat, use prompt-cards.md to ask for the decision artifact. Compare Copilot answer with authoritative source. Save claim-verification worksheet. Check: Reviewer checks every material statement. Challenge: Retired policy cited as current. Report supported claims divided by claims, source, assumptions, reviewer and date.</w:t>
+      </w:r>
+    </w:p>
+    <w:p>
+      <w:pPr>
+        <w:pStyle w:val="ListNumber"/>
+      </w:pPr>
+      <w:r>
+        <w:t>Step 4 — Human approval: locate NS-19 in scenario.csv and read the matching source-pack section. In Microsoft Copilot Chat, use prompt-cards.md to ask for the decision artifact. Assign a human approval point before release. Save approval decision record. Check: Named owner signs external commitment. Challenge: Copilot text is sent without review. Report unapproved external actions, source, assumptions, reviewer and date.</w:t>
+      </w:r>
+    </w:p>
+    <w:p>
+      <w:pPr>
+        <w:pStyle w:val="ListNumber"/>
+      </w:pPr>
+      <w:r>
+        <w:t>Step 5 — Responsible-use rule: locate NS-20 in scenario.csv and read the matching source-pack section. In Microsoft Copilot Chat, use prompt-cards.md to ask for the decision artifact. Draft a plain-language use rule in Word. Save one-page responsible-use charter. Check: Legal and risk owners approve wording. Challenge: Charter is too vague to apply. Report exceptions resolved within sla, source, assumptions, reviewer and date.</w:t>
+      </w:r>
+    </w:p>
+    <w:p>
+      <w:r>
+        <w:t>Value check: net minutes saved = baseline minutes − Copilot-assisted minutes − human review minutes. Multiply by comparable task volume only after checking quality. Treat hourly value and licence cost in value-model.csv as synthetic assumptions; show low, base and high cases.</w:t>
+      </w:r>
+    </w:p>
+    <w:p>
+      <w:r>
+        <w:t>Test it: Data owner approves permitted sources. Security owner reviews unexpected access. Reviewer checks every material statement. Named owner signs external commitment. Legal and risk owners approve wording. Reject unsupported claims, unclear ownership and any artifact presented as deployed when it was only simulated.</w:t>
+      </w:r>
+    </w:p>
+    <w:p>
+      <w:pPr>
+        <w:pStyle w:val="Heading1"/>
+      </w:pPr>
+      <w:r>
+        <w:t>Lab 05 walkthrough</w:t>
+      </w:r>
+    </w:p>
+    <w:p>
+      <w:r>
+        <w:t>Executive outcome: Governance and assurance charter. Use Copilot in Word with five synthetic decisions. Save one reviewed, source-backed artifact for each decision.</w:t>
+      </w:r>
+    </w:p>
+    <w:p>
+      <w:r>
+        <w:drawing>
+          <wp:inline xmlns:a="http://schemas.openxmlformats.org/drawingml/2006/main" xmlns:pic="http://schemas.openxmlformats.org/drawingml/2006/picture">
+            <wp:extent cx="5852160" cy="1131418"/>
+            <wp:docPr id="11" name="Picture 11"/>
+            <wp:cNvGraphicFramePr>
+              <a:graphicFrameLocks noChangeAspect="1"/>
+            </wp:cNvGraphicFramePr>
+            <a:graphic>
+              <a:graphicData uri="http://schemas.openxmlformats.org/drawingml/2006/picture">
+                <pic:pic>
+                  <pic:nvPicPr>
+                    <pic:cNvPr id="0" name="lab-05-flow.png"/>
                     <pic:cNvPicPr/>
                   </pic:nvPicPr>
                   <pic:blipFill>
@@ -2552,15 +2778,15 @@
     </w:p>
     <w:p>
       <w:r>
-        <w:t>UI reference: the following is an authentic screenshot from a separate synthetic Tertiary Infotech training tenant. Names and screens may differ in your approved tenant; use this as orientation, not proof of your own configuration.</w:t>
+        <w:t>Microsoft workflow reference: official Microsoft Support screenshot for orientation. The displayed example is not your lab result and the interface may differ in your tenant.</w:t>
       </w:r>
     </w:p>
     <w:p>
       <w:r>
         <w:drawing>
           <wp:inline xmlns:a="http://schemas.openxmlformats.org/drawingml/2006/main" xmlns:pic="http://schemas.openxmlformats.org/drawingml/2006/picture">
-            <wp:extent cx="5852160" cy="3442783"/>
-            <wp:docPr id="10" name="Picture 10"/>
+            <wp:extent cx="5852160" cy="3298490"/>
+            <wp:docPr id="12" name="Picture 12"/>
             <wp:cNvGraphicFramePr>
               <a:graphicFrameLocks noChangeAspect="1"/>
             </wp:cNvGraphicFramePr>
@@ -2568,7 +2794,7 @@
               <a:graphicData uri="http://schemas.openxmlformats.org/drawingml/2006/picture">
                 <pic:pic>
                   <pic:nvPicPr>
-                    <pic:cNvPr id="0" name="ui-reference.png"/>
+                    <pic:cNvPr id="0" name="workflow-reference.png"/>
                     <pic:cNvPicPr/>
                   </pic:nvPicPr>
                   <pic:blipFill>
@@ -2580,7 +2806,7 @@
                   <pic:spPr>
                     <a:xfrm>
                       <a:off x="0" y="0"/>
-                      <a:ext cx="5852160" cy="3442783"/>
+                      <a:ext cx="5852160" cy="3298490"/>
                     </a:xfrm>
                     <a:prstGeom prst="rect"/>
                   </pic:spPr>
@@ -2593,7 +2819,12 @@
     </w:p>
     <w:p>
       <w:r>
-        <w:t>Preparation: open lab-04/scenario.csv, roles.csv, pilot-metrics.csv and source-pack.md. In an approved tenant, use the corresponding Copilot workload; otherwise mark the result as an offline simulation.</w:t>
+        <w:t>Screenshot source: https://support.microsoft.com/en-us/microsoft-365-copilot/how-copilot-chat-works-in-microsoft-365-apps</w:t>
+      </w:r>
+    </w:p>
+    <w:p>
+      <w:r>
+        <w:t>Preparation: open lab-05/README.md, source-pack.md, scenario.csv, prompt-cards.md and value-model.csv. Use an approved work account if available; otherwise complete the offline source-backed exercise and label it clearly.</w:t>
       </w:r>
     </w:p>
     <w:p>
@@ -2601,7 +2832,7 @@
         <w:pStyle w:val="ListNumber"/>
       </w:pPr>
       <w:r>
-        <w:t>Step 1 — DLP boundaries: locate NS-16 in scenario.csv. Confirm role and source access in roles.csv. Block or warn for restricted data movement. Save dlp test evidence with the source version. Apply this acceptance gate: Policy owner approves exceptions. Run this negative test: Sensitive output leaves approved boundary. Record blocked risky attempts per test set and an assessor-visible screenshot or file export when a tenant is available.</w:t>
+        <w:t>Step 1 — Risk appetite: locate NS-21 in scenario.csv and read the matching source-pack section. In Copilot in Word, use prompt-cards.md to ask for the decision artifact. Rank harms, controls and owners with Copilot. Save risk-tier matrix. Check: High-impact uses require stronger review. Challenge: All use cases share one weak gate. Report high-risk use cases with owner, source, assumptions, reviewer and date.</w:t>
       </w:r>
     </w:p>
     <w:p>
@@ -2609,7 +2840,7 @@
         <w:pStyle w:val="ListNumber"/>
       </w:pPr>
       <w:r>
-        <w:t>Step 2 — SharePoint oversharing: locate NS-17 in scenario.csv. Confirm role and source access in roles.csv. Review inherited access and link types. Save remediation ticket list with the source version. Apply this acceptance gate: Owner removes broad access before pilot. Run this negative test: Copilot surfaces a broadly shared secret. Record high-risk links remediated and an assessor-visible screenshot or file export when a tenant is available.</w:t>
+        <w:t>Step 2 — Incident response: locate NS-22 in scenario.csv and read the matching source-pack section. In Copilot in Word, use prompt-cards.md to ask for the decision artifact. Ask Copilot to organise facts and response options. Save incident decision timeline. Check: Security owner determines escalation. Challenge: Evidence is lost or blame is assigned early. Report time to containment, source, assumptions, reviewer and date.</w:t>
       </w:r>
     </w:p>
     <w:p>
@@ -2617,7 +2848,7 @@
         <w:pStyle w:val="ListNumber"/>
       </w:pPr>
       <w:r>
-        <w:t>Step 3 — Retention and records: locate NS-18 in scenario.csv. Confirm role and source access in roles.csv. Apply record class to source documents. Save retention decision table with the source version. Apply this acceptance gate: Records officer approves disposal. Run this negative test: Old draft retrieved as current policy. Record current-version retrieval rate and an assessor-visible screenshot or file export when a tenant is available.</w:t>
+        <w:t>Step 3 — Quality challenge: locate NS-23 in scenario.csv and read the matching source-pack section. In Copilot in Word, use prompt-cards.md to ask for the decision artifact. Use Copilot as a critic, then verify manually. Save red-team finding and correction. Check: Release only after material errors corrected. Challenge: Fluent answer is treated as proof. Report critical errors per review set, source, assumptions, reviewer and date.</w:t>
       </w:r>
     </w:p>
     <w:p>
@@ -2625,7 +2856,7 @@
         <w:pStyle w:val="ListNumber"/>
       </w:pPr>
       <w:r>
-        <w:t>Step 4 — Audit event trail: locate NS-19 in scenario.csv. Confirm role and source access in roles.csv. Capture time, actor, source and action. Save traceable audit record with the source version. Apply this acceptance gate: Admin preserves logs per policy. Run this negative test: Action cannot be attributed to a user. Record trace-complete actions divided by actions and an assessor-visible screenshot or file export when a tenant is available.</w:t>
+        <w:t>Step 4 — Policy ownership: locate NS-24 in scenario.csv and read the matching source-pack section. In Copilot in Word, use prompt-cards.md to ask for the decision artifact. Draft a RACI with Copilot. Save governance raci. Check: No control lacks a decision owner. Challenge: Everyone assumes IT owns content quality. Report controls with named owners, source, assumptions, reviewer and date.</w:t>
       </w:r>
     </w:p>
     <w:p>
@@ -2633,17 +2864,17 @@
         <w:pStyle w:val="ListNumber"/>
       </w:pPr>
       <w:r>
-        <w:t>Step 5 — Prompt-injection boundary: locate NS-20 in scenario.csv. Confirm role and source access in roles.csv. Treat retrieved text as data, not instruction. Save injection test and refusal trace with the source version. Apply this acceptance gate: Tool action requires explicit authorization. Run this negative test: Agent follows source text as a command. Record injected commands ignored per test set and an assessor-visible screenshot or file export when a tenant is available.</w:t>
-      </w:r>
-    </w:p>
-    <w:p>
-      <w:r>
-        <w:t>Calculation check: net minutes saved = baseline_minutes − pilot_minutes − review_minutes. Monthly capacity = net minutes saved × monthly_volume. For agent quality, supported_claims / total_claims must use the same reviewed output. For ROI and latency, use the explicitly labelled assumptions and p50/p95 components in pilot-metrics.csv.</w:t>
-      </w:r>
-    </w:p>
-    <w:p>
-      <w:r>
-        <w:t>Test it: Policy owner approves exceptions. Owner removes broad access before pilot. Records officer approves disposal. Admin preserves logs per policy. Tool action requires explicit authorization. Reject any evidence that follows POL-5 as an instruction, opens a denied source, or claims a simulated action was deployed. Add reviewer and date to the evidence template.</w:t>
+        <w:t>Step 5 — Board assurance: locate NS-25 in scenario.csv and read the matching source-pack section. In Copilot in Word, use prompt-cards.md to ask for the decision artifact. Summarise assurance evidence with Copilot. Save board risk-and-control dashboard. Check: Disclose unresolved material risks. Challenge: Green status masks a severe issue. Report critical issues overdue, source, assumptions, reviewer and date.</w:t>
+      </w:r>
+    </w:p>
+    <w:p>
+      <w:r>
+        <w:t>Value check: net minutes saved = baseline minutes − Copilot-assisted minutes − human review minutes. Multiply by comparable task volume only after checking quality. Treat hourly value and licence cost in value-model.csv as synthetic assumptions; show low, base and high cases.</w:t>
+      </w:r>
+    </w:p>
+    <w:p>
+      <w:r>
+        <w:t>Test it: High-impact uses require stronger review. Security owner determines escalation. Release only after material errors corrected. No control lacks a decision owner. Disclose unresolved material risks. Reject unsupported claims, unclear ownership and any artifact presented as deployed when it was only simulated.</w:t>
       </w:r>
     </w:p>
     <w:p>
@@ -2651,12 +2882,12 @@
         <w:pStyle w:val="Heading1"/>
       </w:pPr>
       <w:r>
-        <w:t>Lab 05 walkthrough</w:t>
-      </w:r>
-    </w:p>
-    <w:p>
-      <w:r>
-        <w:t>Goal: Fabrication review through Human decision gate using five synthetic case records. Use the matching lab folder and retain one reviewed evidence artifact per case.</w:t>
+        <w:t>Lab 06 walkthrough</w:t>
+      </w:r>
+    </w:p>
+    <w:p>
+      <w:r>
+        <w:t>Executive outcome: Executive meeting and communication. Use Copilot in Teams and Outlook with five synthetic decisions. Save one reviewed, source-backed artifact for each decision.</w:t>
       </w:r>
     </w:p>
     <w:p>
@@ -2664,7 +2895,7 @@
         <w:drawing>
           <wp:inline xmlns:a="http://schemas.openxmlformats.org/drawingml/2006/main" xmlns:pic="http://schemas.openxmlformats.org/drawingml/2006/picture">
             <wp:extent cx="5852160" cy="1131418"/>
-            <wp:docPr id="11" name="Picture 11"/>
+            <wp:docPr id="13" name="Picture 13"/>
             <wp:cNvGraphicFramePr>
               <a:graphicFrameLocks noChangeAspect="1"/>
             </wp:cNvGraphicFramePr>
@@ -2672,7 +2903,7 @@
               <a:graphicData uri="http://schemas.openxmlformats.org/drawingml/2006/picture">
                 <pic:pic>
                   <pic:nvPicPr>
-                    <pic:cNvPr id="0" name="lab-05-flow.png"/>
+                    <pic:cNvPr id="0" name="lab-06-flow.png"/>
                     <pic:cNvPicPr/>
                   </pic:nvPicPr>
                   <pic:blipFill>
@@ -2697,15 +2928,15 @@
     </w:p>
     <w:p>
       <w:r>
-        <w:t>UI reference: the following is an authentic screenshot from a separate synthetic Tertiary Infotech training tenant. Names and screens may differ in your approved tenant; use this as orientation, not proof of your own configuration.</w:t>
+        <w:t>Microsoft workflow reference: official Microsoft Support screenshot for orientation. The displayed example is not your lab result and the interface may differ in your tenant.</w:t>
       </w:r>
     </w:p>
     <w:p>
       <w:r>
         <w:drawing>
           <wp:inline xmlns:a="http://schemas.openxmlformats.org/drawingml/2006/main" xmlns:pic="http://schemas.openxmlformats.org/drawingml/2006/picture">
-            <wp:extent cx="5852160" cy="9699550"/>
-            <wp:docPr id="12" name="Picture 12"/>
+            <wp:extent cx="5852160" cy="3250381"/>
+            <wp:docPr id="14" name="Picture 14"/>
             <wp:cNvGraphicFramePr>
               <a:graphicFrameLocks noChangeAspect="1"/>
             </wp:cNvGraphicFramePr>
@@ -2713,7 +2944,7 @@
               <a:graphicData uri="http://schemas.openxmlformats.org/drawingml/2006/picture">
                 <pic:pic>
                   <pic:nvPicPr>
-                    <pic:cNvPr id="0" name="ui-reference.png"/>
+                    <pic:cNvPr id="0" name="workflow-reference.png"/>
                     <pic:cNvPicPr/>
                   </pic:nvPicPr>
                   <pic:blipFill>
@@ -2725,7 +2956,7 @@
                   <pic:spPr>
                     <a:xfrm>
                       <a:off x="0" y="0"/>
-                      <a:ext cx="5852160" cy="9699550"/>
+                      <a:ext cx="5852160" cy="3250381"/>
                     </a:xfrm>
                     <a:prstGeom prst="rect"/>
                   </pic:spPr>
@@ -2738,7 +2969,12 @@
     </w:p>
     <w:p>
       <w:r>
-        <w:t>Preparation: open lab-05/scenario.csv, roles.csv, pilot-metrics.csv and source-pack.md. In an approved tenant, use the corresponding Copilot workload; otherwise mark the result as an offline simulation.</w:t>
+        <w:t>Screenshot source: https://support.microsoft.com/en-us/teams/meetings/recap-in-microsoft-teams</w:t>
+      </w:r>
+    </w:p>
+    <w:p>
+      <w:r>
+        <w:t>Preparation: open lab-06/README.md, source-pack.md, scenario.csv, prompt-cards.md and value-model.csv. Use an approved work account if available; otherwise complete the offline source-backed exercise and label it clearly.</w:t>
       </w:r>
     </w:p>
     <w:p>
@@ -2746,7 +2982,7 @@
         <w:pStyle w:val="ListNumber"/>
       </w:pPr>
       <w:r>
-        <w:t>Step 1 — Fabrication review: locate NS-21 in scenario.csv. Confirm role and source access in roles.csv. Check each claim against current citations. Save claim-verification worksheet with the source version. Apply this acceptance gate: Human reviewer signs high-impact output. Run this negative test: Plausible unsupported number survives. Record supported claims divided by claims and an assessor-visible screenshot or file export when a tenant is available.</w:t>
+        <w:t>Step 1 — Executive meeting: locate NS-26 in scenario.csv and read the matching source-pack section. In Copilot in Teams and Outlook, use prompt-cards.md to ask for the decision artifact. Use Copilot in Teams to extract decisions and dissent. Save decision and action log. Check: Chair validates speaker and decision. Challenge: AI assigns an action to wrong owner. Report confirmed actions divided by extracted, source, assumptions, reviewer and date.</w:t>
       </w:r>
     </w:p>
     <w:p>
@@ -2754,7 +2990,7 @@
         <w:pStyle w:val="ListNumber"/>
       </w:pPr>
       <w:r>
-        <w:t>Step 2 — Tool permission design: locate NS-22 in scenario.csv. Confirm role and source access in roles.csv. Separate read-only pilot from write actions. Save permission grant register with the source version. Apply this acceptance gate: Entra admin consents only minimum scope. Run this negative test: Write tool used in a read workflow. Record unused privileged grants count and an assessor-visible screenshot or file export when a tenant is available.</w:t>
+        <w:t>Step 2 — Outlook decision flow: locate NS-27 in scenario.csv and read the matching source-pack section. In Copilot in Teams and Outlook, use prompt-cards.md to ask for the decision artifact. Use Copilot in Outlook to summarise asks and deadlines. Save prioritised response draft. Check: Executive reviews tone and commitments. Challenge: Reply contains a false promise. Report decisions made before deadline, source, assumptions, reviewer and date.</w:t>
       </w:r>
     </w:p>
     <w:p>
@@ -2762,7 +2998,7 @@
         <w:pStyle w:val="ListNumber"/>
       </w:pPr>
       <w:r>
-        <w:t>Step 3 — Environment policy: locate NS-23 in scenario.csv. Confirm role and source access in roles.csv. Apply connector and publishing policy. Save environment control matrix with the source version. Apply this acceptance gate: Promote only after test evidence. Run this negative test: Maker publishes from unrestricted default. Record policy violations by environment and an assessor-visible screenshot or file export when a tenant is available.</w:t>
+        <w:t>Step 3 — Cross-functional handoff: locate NS-28 in scenario.csv and read the matching source-pack section. In Copilot in Teams and Outlook, use prompt-cards.md to ask for the decision artifact. Ask Copilot to map handoffs and delays. Save future-state handoff map. Check: Keep accountable human at each gate. Challenge: AI summary blurs ownership. Report handoff time reduction, source, assumptions, reviewer and date.</w:t>
       </w:r>
     </w:p>
     <w:p>
@@ -2770,7 +3006,7 @@
         <w:pStyle w:val="ListNumber"/>
       </w:pPr>
       <w:r>
-        <w:t>Step 4 — Incident response: locate NS-24 in scenario.csv. Confirm role and source access in roles.csv. Contain, preserve evidence, notify owner. Save incident timeline and action log with the source version. Apply this acceptance gate: Security owner determines escalation. Run this negative test: Evidence lost during agent disable. Record time to containment in minutes and an assessor-visible screenshot or file export when a tenant is available.</w:t>
+        <w:t>Step 4 — Copilot integration choice: locate NS-29 in scenario.csv and read the matching source-pack section. In Copilot in Teams and Outlook, use prompt-cards.md to ask for the decision artifact. Compare use-as-is, extend and build choices. Save integration decision card. Check: Sponsor accepts cost and risk trade-off. Challenge: Custom build is chosen without need. Report business fit score per option, source, assumptions, reviewer and date.</w:t>
       </w:r>
     </w:p>
     <w:p>
@@ -2778,17 +3014,17 @@
         <w:pStyle w:val="ListNumber"/>
       </w:pPr>
       <w:r>
-        <w:t>Step 5 — Human decision gate: locate NS-25 in scenario.csv. Confirm role and source access in roles.csv. Require reviewer before irreversible action. Save approval record with rationale with the source version. Apply this acceptance gate: Named business owner signs release. Run this negative test: Workflow auto-issues refund. Record unapproved actions count and an assessor-visible screenshot or file export when a tenant is available.</w:t>
-      </w:r>
-    </w:p>
-    <w:p>
-      <w:r>
-        <w:t>Calculation check: net minutes saved = baseline_minutes − pilot_minutes − review_minutes. Monthly capacity = net minutes saved × monthly_volume. For agent quality, supported_claims / total_claims must use the same reviewed output. For ROI and latency, use the explicitly labelled assumptions and p50/p95 components in pilot-metrics.csv.</w:t>
-      </w:r>
-    </w:p>
-    <w:p>
-      <w:r>
-        <w:t>Test it: Human reviewer signs high-impact output. Entra admin consents only minimum scope. Promote only after test evidence. Security owner determines escalation. Named business owner signs release. Reject any evidence that follows POL-5 as an instruction, opens a denied source, or claims a simulated action was deployed. Add reviewer and date to the evidence template.</w:t>
+        <w:t>Step 5 — Agent opportunity: locate NS-30 in scenario.csv and read the matching source-pack section. In Copilot in Teams and Outlook, use prompt-cards.md to ask for the decision artifact. Describe where a bounded agent may help. Save agent opportunity brief. Check: Do not automate irreversible decisions. Challenge: Agent scope expands beyond approval. Report in-scope resolution rate, source, assumptions, reviewer and date.</w:t>
+      </w:r>
+    </w:p>
+    <w:p>
+      <w:r>
+        <w:t>Value check: net minutes saved = baseline minutes − Copilot-assisted minutes − human review minutes. Multiply by comparable task volume only after checking quality. Treat hourly value and licence cost in value-model.csv as synthetic assumptions; show low, base and high cases.</w:t>
+      </w:r>
+    </w:p>
+    <w:p>
+      <w:r>
+        <w:t>Test it: Chair validates speaker and decision. Executive reviews tone and commitments. Keep accountable human at each gate. Sponsor accepts cost and risk trade-off. Do not automate irreversible decisions. Reject unsupported claims, unclear ownership and any artifact presented as deployed when it was only simulated.</w:t>
       </w:r>
     </w:p>
     <w:p>
@@ -2796,12 +3032,12 @@
         <w:pStyle w:val="Heading1"/>
       </w:pPr>
       <w:r>
-        <w:t>Lab 06 walkthrough</w:t>
-      </w:r>
-    </w:p>
-    <w:p>
-      <w:r>
-        <w:t>Goal: Agent purpose contract through Connector action using five synthetic case records. Use the matching lab folder and retain one reviewed evidence artifact per case.</w:t>
+        <w:t>Lab 07 walkthrough</w:t>
+      </w:r>
+    </w:p>
+    <w:p>
+      <w:r>
+        <w:t>Executive outcome: Integration and operating model. Use Microsoft Copilot Chat and Word with five synthetic decisions. Save one reviewed, source-backed artifact for each decision.</w:t>
       </w:r>
     </w:p>
     <w:p>
@@ -2809,7 +3045,7 @@
         <w:drawing>
           <wp:inline xmlns:a="http://schemas.openxmlformats.org/drawingml/2006/main" xmlns:pic="http://schemas.openxmlformats.org/drawingml/2006/picture">
             <wp:extent cx="5852160" cy="1131418"/>
-            <wp:docPr id="13" name="Picture 13"/>
+            <wp:docPr id="15" name="Picture 15"/>
             <wp:cNvGraphicFramePr>
               <a:graphicFrameLocks noChangeAspect="1"/>
             </wp:cNvGraphicFramePr>
@@ -2817,7 +3053,7 @@
               <a:graphicData uri="http://schemas.openxmlformats.org/drawingml/2006/picture">
                 <pic:pic>
                   <pic:nvPicPr>
-                    <pic:cNvPr id="0" name="lab-06-flow.png"/>
+                    <pic:cNvPr id="0" name="lab-07-flow.png"/>
                     <pic:cNvPicPr/>
                   </pic:nvPicPr>
                   <pic:blipFill>
@@ -2842,15 +3078,15 @@
     </w:p>
     <w:p>
       <w:r>
-        <w:t>UI reference: the following is an authentic screenshot from a separate synthetic Tertiary Infotech training tenant. Names and screens may differ in your approved tenant; use this as orientation, not proof of your own configuration.</w:t>
+        <w:t>Microsoft workflow reference: official Microsoft Support screenshot for orientation. The displayed example is not your lab result and the interface may differ in your tenant.</w:t>
       </w:r>
     </w:p>
     <w:p>
       <w:r>
         <w:drawing>
           <wp:inline xmlns:a="http://schemas.openxmlformats.org/drawingml/2006/main" xmlns:pic="http://schemas.openxmlformats.org/drawingml/2006/picture">
-            <wp:extent cx="5852160" cy="1531314"/>
-            <wp:docPr id="14" name="Picture 14"/>
+            <wp:extent cx="5852160" cy="3277210"/>
+            <wp:docPr id="16" name="Picture 16"/>
             <wp:cNvGraphicFramePr>
               <a:graphicFrameLocks noChangeAspect="1"/>
             </wp:cNvGraphicFramePr>
@@ -2858,7 +3094,7 @@
               <a:graphicData uri="http://schemas.openxmlformats.org/drawingml/2006/picture">
                 <pic:pic>
                   <pic:nvPicPr>
-                    <pic:cNvPr id="0" name="ui-reference.png"/>
+                    <pic:cNvPr id="0" name="workflow-reference.png"/>
                     <pic:cNvPicPr/>
                   </pic:nvPicPr>
                   <pic:blipFill>
@@ -2870,7 +3106,7 @@
                   <pic:spPr>
                     <a:xfrm>
                       <a:off x="0" y="0"/>
-                      <a:ext cx="5852160" cy="1531314"/>
+                      <a:ext cx="5852160" cy="3277210"/>
                     </a:xfrm>
                     <a:prstGeom prst="rect"/>
                   </pic:spPr>
@@ -2883,7 +3119,12 @@
     </w:p>
     <w:p>
       <w:r>
-        <w:t>Preparation: open lab-06/scenario.csv, roles.csv, pilot-metrics.csv and source-pack.md. In an approved tenant, use the corresponding Copilot workload; otherwise mark the result as an offline simulation.</w:t>
+        <w:t>Screenshot source: https://support.microsoft.com/en-us/microsoft-365-copilot/how-copilot-chat-works-in-microsoft-365-apps</w:t>
+      </w:r>
+    </w:p>
+    <w:p>
+      <w:r>
+        <w:t>Preparation: open lab-07/README.md, source-pack.md, scenario.csv, prompt-cards.md and value-model.csv. Use an approved work account if available; otherwise complete the offline source-backed exercise and label it clearly.</w:t>
       </w:r>
     </w:p>
     <w:p>
@@ -2891,7 +3132,7 @@
         <w:pStyle w:val="ListNumber"/>
       </w:pPr>
       <w:r>
-        <w:t>Step 1 — Agent purpose contract: locate NS-26 in scenario.csv. Confirm role and source access in roles.csv. Define allowed requests and refusals. Save agent instruction card with the source version. Apply this acceptance gate: Scope owner approves boundary. Run this negative test: Agent answers outside approved domain. Record in-scope resolution rate and an assessor-visible screenshot or file export when a tenant is available.</w:t>
+        <w:t>Step 1 — Vendor and partner review: locate NS-31 in scenario.csv and read the matching source-pack section. In Microsoft Copilot Chat and Word, use prompt-cards.md to ask for the decision artifact. Use Copilot to structure a due-diligence checklist. Save partner decision matrix. Check: Verify contractual and data claims. Challenge: Marketing claims become evidence. Report requirements with verified proof, source, assumptions, reviewer and date.</w:t>
       </w:r>
     </w:p>
     <w:p>
@@ -2899,7 +3140,7 @@
         <w:pStyle w:val="ListNumber"/>
       </w:pPr>
       <w:r>
-        <w:t>Step 2 — Knowledge-source curation: locate NS-27 in scenario.csv. Confirm role and source access in roles.csv. Choose authoritative files with metadata. Save source register and index plan with the source version. Apply this acceptance gate: Remove stale or duplicate files. Run this negative test: Agent cites archived policy. Record current-source citation rate and an assessor-visible screenshot or file export when a tenant is available.</w:t>
+        <w:t>Step 2 — Pilot operating model: locate NS-32 in scenario.csv and read the matching source-pack section. In Microsoft Copilot Chat and Word, use prompt-cards.md to ask for the decision artifact. Draft roles, support and review cadence. Save pilot operating charter. Check: Sponsor, data owner and risk lead sign off. Challenge: Pilot has licences but no support. Report weekly active pilot users, source, assumptions, reviewer and date.</w:t>
       </w:r>
     </w:p>
     <w:p>
@@ -2907,7 +3148,7 @@
         <w:pStyle w:val="ListNumber"/>
       </w:pPr>
       <w:r>
-        <w:t>Step 3 — Citation evaluation: locate NS-28 in scenario.csv. Confirm role and source access in roles.csv. Compare answers to source passages. Save evaluation scorecard with the source version. Apply this acceptance gate: Fail release below evidence threshold. Run this negative test: Citation exists but does not support claim. Record supported citations divided by citations and an assessor-visible screenshot or file export when a tenant is available.</w:t>
+        <w:t>Step 3 — Leadership role modelling: locate NS-33 in scenario.csv and read the matching source-pack section. In Microsoft Copilot Chat and Word, use prompt-cards.md to ask for the decision artifact. Use Copilot to select visible leader practices. Save leader demonstration plan. Check: Leader shows reviewed outputs and limits. Challenge: Leader promotes unverified output. Report leaders demonstrating weekly, source, assumptions, reviewer and date.</w:t>
       </w:r>
     </w:p>
     <w:p>
@@ -2915,7 +3156,7 @@
         <w:pStyle w:val="ListNumber"/>
       </w:pPr>
       <w:r>
-        <w:t>Step 4 — Copilot Studio topic routing: locate NS-29 in scenario.csv. Confirm role and source access in roles.csv. Route to topic or generative answer. Save topic decision flow with the source version. Apply this acceptance gate: Escalate unsupported requests. Run this negative test: Wrong topic triggers a tool. Record correct route per test case and an assessor-visible screenshot or file export when a tenant is available.</w:t>
+        <w:t>Step 4 — Change communication: locate NS-34 in scenario.csv and read the matching source-pack section. In Microsoft Copilot Chat and Word, use prompt-cards.md to ask for the decision artifact. Draft FAQ and manager briefing in Word. Save change narrative and faq. Check: Include limits and escalation route. Challenge: Message implies job replacement decision. Report employee understanding score, source, assumptions, reviewer and date.</w:t>
       </w:r>
     </w:p>
     <w:p>
@@ -2923,17 +3164,17 @@
         <w:pStyle w:val="ListNumber"/>
       </w:pPr>
       <w:r>
-        <w:t>Step 5 — Connector action: locate NS-30 in scenario.csv. Confirm role and source access in roles.csv. Map validated input to action parameters. Save action contract and sample payload with the source version. Apply this acceptance gate: Validate inputs and consent. Run this negative test: Missing case owner causes bad write. Record successful validated actions and an assessor-visible screenshot or file export when a tenant is available.</w:t>
-      </w:r>
-    </w:p>
-    <w:p>
-      <w:r>
-        <w:t>Calculation check: net minutes saved = baseline_minutes − pilot_minutes − review_minutes. Monthly capacity = net minutes saved × monthly_volume. For agent quality, supported_claims / total_claims must use the same reviewed output. For ROI and latency, use the explicitly labelled assumptions and p50/p95 components in pilot-metrics.csv.</w:t>
-      </w:r>
-    </w:p>
-    <w:p>
-      <w:r>
-        <w:t>Test it: Scope owner approves boundary. Remove stale or duplicate files. Fail release below evidence threshold. Escalate unsupported requests. Validate inputs and consent. Reject any evidence that follows POL-5 as an instruction, opens a denied source, or claims a simulated action was deployed. Add reviewer and date to the evidence template.</w:t>
+        <w:t>Step 5 — Decision escalation: locate NS-35 in scenario.csv and read the matching source-pack section. In Microsoft Copilot Chat and Word, use prompt-cards.md to ask for the decision artifact. Map pause, fix and restart decisions. Save escalation playbook. Check: Named sponsor owns pause decision. Challenge: Issue remains open while rollout expands. Report median time to decision, source, assumptions, reviewer and date.</w:t>
+      </w:r>
+    </w:p>
+    <w:p>
+      <w:r>
+        <w:t>Value check: net minutes saved = baseline minutes − Copilot-assisted minutes − human review minutes. Multiply by comparable task volume only after checking quality. Treat hourly value and licence cost in value-model.csv as synthetic assumptions; show low, base and high cases.</w:t>
+      </w:r>
+    </w:p>
+    <w:p>
+      <w:r>
+        <w:t>Test it: Verify contractual and data claims. Sponsor, data owner and risk lead sign off. Leader shows reviewed outputs and limits. Include limits and escalation route. Named sponsor owns pause decision. Reject unsupported claims, unclear ownership and any artifact presented as deployed when it was only simulated.</w:t>
       </w:r>
     </w:p>
     <w:p>
@@ -2941,12 +3182,12 @@
         <w:pStyle w:val="Heading1"/>
       </w:pPr>
       <w:r>
-        <w:t>Lab 07 walkthrough</w:t>
-      </w:r>
-    </w:p>
-    <w:p>
-      <w:r>
-        <w:t>Goal: Approval action through MCP tool registration using five synthetic case records. Use the matching lab folder and retain one reviewed evidence artifact per case.</w:t>
+        <w:t>Lab 08 walkthrough</w:t>
+      </w:r>
+    </w:p>
+    <w:p>
+      <w:r>
+        <w:t>Executive outcome: Adoption and scale plan. Use Microsoft Copilot Chat and Word with five synthetic decisions. Save one reviewed, source-backed artifact for each decision.</w:t>
       </w:r>
     </w:p>
     <w:p>
@@ -2954,7 +3195,7 @@
         <w:drawing>
           <wp:inline xmlns:a="http://schemas.openxmlformats.org/drawingml/2006/main" xmlns:pic="http://schemas.openxmlformats.org/drawingml/2006/picture">
             <wp:extent cx="5852160" cy="1131418"/>
-            <wp:docPr id="15" name="Picture 15"/>
+            <wp:docPr id="17" name="Picture 17"/>
             <wp:cNvGraphicFramePr>
               <a:graphicFrameLocks noChangeAspect="1"/>
             </wp:cNvGraphicFramePr>
@@ -2962,7 +3203,7 @@
               <a:graphicData uri="http://schemas.openxmlformats.org/drawingml/2006/picture">
                 <pic:pic>
                   <pic:nvPicPr>
-                    <pic:cNvPr id="0" name="lab-07-flow.png"/>
+                    <pic:cNvPr id="0" name="lab-08-flow.png"/>
                     <pic:cNvPicPr/>
                   </pic:nvPicPr>
                   <pic:blipFill>
@@ -2987,15 +3228,15 @@
     </w:p>
     <w:p>
       <w:r>
-        <w:t>UI reference: the following is an authentic screenshot from a separate synthetic Tertiary Infotech training tenant. Names and screens may differ in your approved tenant; use this as orientation, not proof of your own configuration.</w:t>
+        <w:t>Microsoft workflow reference: official Microsoft Support screenshot for orientation. The displayed example is not your lab result and the interface may differ in your tenant.</w:t>
       </w:r>
     </w:p>
     <w:p>
       <w:r>
         <w:drawing>
           <wp:inline xmlns:a="http://schemas.openxmlformats.org/drawingml/2006/main" xmlns:pic="http://schemas.openxmlformats.org/drawingml/2006/picture">
-            <wp:extent cx="5852160" cy="5740969"/>
-            <wp:docPr id="16" name="Picture 16"/>
+            <wp:extent cx="5852160" cy="3298490"/>
+            <wp:docPr id="18" name="Picture 18"/>
             <wp:cNvGraphicFramePr>
               <a:graphicFrameLocks noChangeAspect="1"/>
             </wp:cNvGraphicFramePr>
@@ -3003,11 +3244,11 @@
               <a:graphicData uri="http://schemas.openxmlformats.org/drawingml/2006/picture">
                 <pic:pic>
                   <pic:nvPicPr>
-                    <pic:cNvPr id="0" name="ui-reference.png"/>
+                    <pic:cNvPr id="0" name="workflow-reference.png"/>
                     <pic:cNvPicPr/>
                   </pic:nvPicPr>
                   <pic:blipFill>
-                    <a:blip r:embed="rId26"/>
+                    <a:blip r:embed="rId20"/>
                     <a:stretch>
                       <a:fillRect/>
                     </a:stretch>
@@ -3015,7 +3256,7 @@
                   <pic:spPr>
                     <a:xfrm>
                       <a:off x="0" y="0"/>
-                      <a:ext cx="5852160" cy="5740969"/>
+                      <a:ext cx="5852160" cy="3298490"/>
                     </a:xfrm>
                     <a:prstGeom prst="rect"/>
                   </pic:spPr>
@@ -3028,7 +3269,12 @@
     </w:p>
     <w:p>
       <w:r>
-        <w:t>Preparation: open lab-07/scenario.csv, roles.csv, pilot-metrics.csv and source-pack.md. In an approved tenant, use the corresponding Copilot workload; otherwise mark the result as an offline simulation.</w:t>
+        <w:t>Screenshot source: https://support.microsoft.com/en-us/microsoft-365-copilot/how-copilot-chat-works-in-microsoft-365-apps</w:t>
+      </w:r>
+    </w:p>
+    <w:p>
+      <w:r>
+        <w:t>Preparation: open lab-08/README.md, source-pack.md, scenario.csv, prompt-cards.md and value-model.csv. Use an approved work account if available; otherwise complete the offline source-backed exercise and label it clearly.</w:t>
       </w:r>
     </w:p>
     <w:p>
@@ -3036,7 +3282,7 @@
         <w:pStyle w:val="ListNumber"/>
       </w:pPr>
       <w:r>
-        <w:t>Step 1 — Approval action: locate NS-31 in scenario.csv. Confirm role and source access in roles.csv. Branch at amount threshold. Save approval path with actor and timestamp with the source version. Apply this acceptance gate: No silent auto-approval. Run this negative test: High-value request takes fast path. Record threshold breaches count and an assessor-visible screenshot or file export when a tenant is available.</w:t>
+        <w:t>Step 1 — Use-case portfolio: locate NS-36 in scenario.csv and read the matching source-pack section. In Microsoft Copilot Chat and Word, use prompt-cards.md to ask for the decision artifact. Prioritise volume, value, feasibility and risk. Save ranked opportunity portfolio. Check: Reject ownerless or unsafe use case. Challenge: Highest score hides weak data. Report validated value per use case, source, assumptions, reviewer and date.</w:t>
       </w:r>
     </w:p>
     <w:p>
@@ -3044,7 +3290,7 @@
         <w:pStyle w:val="ListNumber"/>
       </w:pPr>
       <w:r>
-        <w:t>Step 2 — Power Automate flow: locate NS-32 in scenario.csv. Confirm role and source access in roles.csv. Trigger, validate, approve, write, notify. Save flow run trace with the source version. Apply this acceptance gate: Use service identity with least privilege. Run this negative test: Duplicate trigger creates two tickets. Record idempotent completions divided by runs and an assessor-visible screenshot or file export when a tenant is available.</w:t>
+        <w:t>Step 2 — Adoption baseline: locate NS-37 in scenario.csv and read the matching source-pack section. In Microsoft Copilot Chat and Word, use prompt-cards.md to ask for the decision artifact. Compare active use with licensed seats. Save adoption baseline chart. Check: Separate sign-in from productive use. Challenge: Licence assignment counted as adoption. Report weekly active users per cohort, source, assumptions, reviewer and date.</w:t>
       </w:r>
     </w:p>
     <w:p>
@@ -3052,7 +3298,7 @@
         <w:pStyle w:val="ListNumber"/>
       </w:pPr>
       <w:r>
-        <w:t>Step 3 — Dynamics 365 context: locate NS-33 in scenario.csv. Confirm role and source access in roles.csv. Ground response in permitted CRM fields. Save case summary and next-step draft with the source version. Apply this acceptance gate: Respect record-level access. Run this negative test: Summary includes another account. Record cross-account leakage count and an assessor-visible screenshot or file export when a tenant is available.</w:t>
+        <w:t>Step 3 — Enablement design: locate NS-38 in scenario.csv and read the matching source-pack section. In Microsoft Copilot Chat and Word, use prompt-cards.md to ask for the decision artifact. Ask Copilot to draft role-based coaching plans. Save 90-day enablement calendar. Check: Manager commits time for practice. Challenge: One generic training suits no one. Report practice completion by role, source, assumptions, reviewer and date.</w:t>
       </w:r>
     </w:p>
     <w:p>
@@ -3060,7 +3306,7 @@
         <w:pStyle w:val="ListNumber"/>
       </w:pPr>
       <w:r>
-        <w:t>Step 4 — Foundry model choice: locate NS-34 in scenario.csv. Confirm role and source access in roles.csv. Compare candidate models on test set. Save model decision card with the source version. Apply this acceptance gate: Approve budget and data region. Run this negative test: Cheaper model fails critical test. Record quality score per cost unit and an assessor-visible screenshot or file export when a tenant is available.</w:t>
+        <w:t>Step 4 — Feedback loop: locate NS-39 in scenario.csv and read the matching source-pack section. In Microsoft Copilot Chat and Word, use prompt-cards.md to ask for the decision artifact. Cluster feedback themes with Copilot. Save prioritised improvement backlog. Check: Assign owner and due date. Challenge: Prompt advice hides a source defect. Report median defect closure time, source, assumptions, reviewer and date.</w:t>
       </w:r>
     </w:p>
     <w:p>
@@ -3068,17 +3314,17 @@
         <w:pStyle w:val="ListNumber"/>
       </w:pPr>
       <w:r>
-        <w:t>Step 5 — MCP tool registration: locate NS-35 in scenario.csv. Confirm role and source access in roles.csv. Expose a bounded tool to an agent. Save tool catalog with scopes with the source version. Apply this acceptance gate: Authenticate and log each invocation. Run this negative test: Untrusted server gains broad access. Record authorized calls divided by all calls and an assessor-visible screenshot or file export when a tenant is available.</w:t>
-      </w:r>
-    </w:p>
-    <w:p>
-      <w:r>
-        <w:t>Calculation check: net minutes saved = baseline_minutes − pilot_minutes − review_minutes. Monthly capacity = net minutes saved × monthly_volume. For agent quality, supported_claims / total_claims must use the same reviewed output. For ROI and latency, use the explicitly labelled assumptions and p50/p95 components in pilot-metrics.csv.</w:t>
-      </w:r>
-    </w:p>
-    <w:p>
-      <w:r>
-        <w:t>Test it: No silent auto-approval. Use service identity with least privilege. Respect record-level access. Approve budget and data region. Authenticate and log each invocation. Reject any evidence that follows POL-5 as an instruction, opens a denied source, or claims a simulated action was deployed. Add reviewer and date to the evidence template.</w:t>
+        <w:t>Step 5 — Scale gate: locate NS-40 in scenario.csv and read the matching source-pack section. In Microsoft Copilot Chat and Word, use prompt-cards.md to ask for the decision artifact. Prepare go, hold or stop recommendation. Save wave-two decision paper. Check: Every critical threshold passes. Challenge: Average score hides a severe failure. Report criteria passed divided by required, source, assumptions, reviewer and date.</w:t>
+      </w:r>
+    </w:p>
+    <w:p>
+      <w:r>
+        <w:t>Value check: net minutes saved = baseline minutes − Copilot-assisted minutes − human review minutes. Multiply by comparable task volume only after checking quality. Treat hourly value and licence cost in value-model.csv as synthetic assumptions; show low, base and high cases.</w:t>
+      </w:r>
+    </w:p>
+    <w:p>
+      <w:r>
+        <w:t>Test it: Reject ownerless or unsafe use case. Separate sign-in from productive use. Manager commits time for practice. Assign owner and due date. Every critical threshold passes. Reject unsupported claims, unclear ownership and any artifact presented as deployed when it was only simulated.</w:t>
       </w:r>
     </w:p>
     <w:p>
@@ -3086,12 +3332,12 @@
         <w:pStyle w:val="Heading1"/>
       </w:pPr>
       <w:r>
-        <w:t>Lab 08 walkthrough</w:t>
-      </w:r>
-    </w:p>
-    <w:p>
-      <w:r>
-        <w:t>Goal: A2A handoff through Agent quality rubric using five synthetic case records. Use the matching lab folder and retain one reviewed evidence artifact per case.</w:t>
+        <w:t>Lab 09 walkthrough</w:t>
+      </w:r>
+    </w:p>
+    <w:p>
+      <w:r>
+        <w:t>Executive outcome: Investment and value case. Use Copilot in Excel and Word with five synthetic decisions. Save one reviewed, source-backed artifact for each decision.</w:t>
       </w:r>
     </w:p>
     <w:p>
@@ -3099,7 +3345,7 @@
         <w:drawing>
           <wp:inline xmlns:a="http://schemas.openxmlformats.org/drawingml/2006/main" xmlns:pic="http://schemas.openxmlformats.org/drawingml/2006/picture">
             <wp:extent cx="5852160" cy="1131418"/>
-            <wp:docPr id="17" name="Picture 17"/>
+            <wp:docPr id="19" name="Picture 19"/>
             <wp:cNvGraphicFramePr>
               <a:graphicFrameLocks noChangeAspect="1"/>
             </wp:cNvGraphicFramePr>
@@ -3107,11 +3353,11 @@
               <a:graphicData uri="http://schemas.openxmlformats.org/drawingml/2006/picture">
                 <pic:pic>
                   <pic:nvPicPr>
-                    <pic:cNvPr id="0" name="lab-08-flow.png"/>
+                    <pic:cNvPr id="0" name="lab-09-flow.png"/>
                     <pic:cNvPicPr/>
                   </pic:nvPicPr>
                   <pic:blipFill>
-                    <a:blip r:embed="rId27"/>
+                    <a:blip r:embed="rId26"/>
                     <a:stretch>
                       <a:fillRect/>
                     </a:stretch>
@@ -3132,15 +3378,15 @@
     </w:p>
     <w:p>
       <w:r>
-        <w:t>UI reference: the following is an authentic screenshot from a separate synthetic Tertiary Infotech training tenant. Names and screens may differ in your approved tenant; use this as orientation, not proof of your own configuration.</w:t>
+        <w:t>Microsoft workflow reference: official Microsoft Support screenshot for orientation. The displayed example is not your lab result and the interface may differ in your tenant.</w:t>
       </w:r>
     </w:p>
     <w:p>
       <w:r>
         <w:drawing>
           <wp:inline xmlns:a="http://schemas.openxmlformats.org/drawingml/2006/main" xmlns:pic="http://schemas.openxmlformats.org/drawingml/2006/picture">
-            <wp:extent cx="5852160" cy="4288841"/>
-            <wp:docPr id="18" name="Picture 18"/>
+            <wp:extent cx="5852160" cy="3667354"/>
+            <wp:docPr id="20" name="Picture 20"/>
             <wp:cNvGraphicFramePr>
               <a:graphicFrameLocks noChangeAspect="1"/>
             </wp:cNvGraphicFramePr>
@@ -3148,11 +3394,11 @@
               <a:graphicData uri="http://schemas.openxmlformats.org/drawingml/2006/picture">
                 <pic:pic>
                   <pic:nvPicPr>
-                    <pic:cNvPr id="0" name="ui-reference.png"/>
+                    <pic:cNvPr id="0" name="workflow-reference.png"/>
                     <pic:cNvPicPr/>
                   </pic:nvPicPr>
                   <pic:blipFill>
-                    <a:blip r:embed="rId28"/>
+                    <a:blip r:embed="rId27"/>
                     <a:stretch>
                       <a:fillRect/>
                     </a:stretch>
@@ -3160,7 +3406,7 @@
                   <pic:spPr>
                     <a:xfrm>
                       <a:off x="0" y="0"/>
-                      <a:ext cx="5852160" cy="4288841"/>
+                      <a:ext cx="5852160" cy="3667354"/>
                     </a:xfrm>
                     <a:prstGeom prst="rect"/>
                   </pic:spPr>
@@ -3173,7 +3419,12 @@
     </w:p>
     <w:p>
       <w:r>
-        <w:t>Preparation: open lab-08/scenario.csv, roles.csv, pilot-metrics.csv and source-pack.md. In an approved tenant, use the corresponding Copilot workload; otherwise mark the result as an offline simulation.</w:t>
+        <w:t>Screenshot source: https://support.microsoft.com/en-us/microsoft-365-copilot/how-copilot-chat-works-in-microsoft-365-apps</w:t>
+      </w:r>
+    </w:p>
+    <w:p>
+      <w:r>
+        <w:t>Preparation: open lab-09/README.md, source-pack.md, scenario.csv, prompt-cards.md and value-model.csv. Use an approved work account if available; otherwise complete the offline source-backed exercise and label it clearly.</w:t>
       </w:r>
     </w:p>
     <w:p>
@@ -3181,7 +3432,7 @@
         <w:pStyle w:val="ListNumber"/>
       </w:pPr>
       <w:r>
-        <w:t>Step 1 — A2A handoff: locate NS-36 in scenario.csv. Confirm role and source access in roles.csv. Send task with identity and context limits. Save handoff trace and result with the source version. Apply this acceptance gate: Entra authorization at endpoint. Run this negative test: Receiving agent loses context boundary. Record successful authorized handoffs and an assessor-visible screenshot or file export when a tenant is available.</w:t>
+        <w:t>Step 1 — Excel value model: locate NS-41 in scenario.csv and read the matching source-pack section. In Copilot in Excel and Word, use prompt-cards.md to ask for the decision artifact. Use Copilot in Excel to analyse observed changes. Save net time-saved table. Check: Review time is deducted from gross saving. Challenge: Gross saving is sold as net value. Report net minutes saved per task, source, assumptions, reviewer and date.</w:t>
       </w:r>
     </w:p>
     <w:p>
@@ -3189,7 +3440,7 @@
         <w:pStyle w:val="ListNumber"/>
       </w:pPr>
       <w:r>
-        <w:t>Step 2 — Multi-agent orchestration: locate NS-37 in scenario.csv. Confirm role and source access in roles.csv. Sequence outputs with conflict resolution. Save orchestration map and provenance with the source version. Apply this acceptance gate: Supervisor approves final answer. Run this negative test: Agents amplify an unsupported claim. Record conflicts detected before release and an assessor-visible screenshot or file export when a tenant is available.</w:t>
+        <w:t>Step 2 — Benefit confidence: locate NS-42 in scenario.csv and read the matching source-pack section. In Copilot in Excel and Word, use prompt-cards.md to ask for the decision artifact. Ask Copilot to label evidence strength. Save benefit confidence register. Check: Assumption is never described as measured. Challenge: Weak sample is extrapolated widely. Report measured share of claimed value, source, assumptions, reviewer and date.</w:t>
       </w:r>
     </w:p>
     <w:p>
@@ -3197,7 +3448,7 @@
         <w:pStyle w:val="ListNumber"/>
       </w:pPr>
       <w:r>
-        <w:t>Step 3 — Cross-platform error handling: locate NS-38 in scenario.csv. Confirm role and source access in roles.csv. Retry safely then queue for human. Save dead-letter record with correlation id with the source version. Apply this acceptance gate: No duplicate write on retry. Run this negative test: Retry creates duplicate case. Record duplicate-free retries divided by retries and an assessor-visible screenshot or file export when a tenant is available.</w:t>
+        <w:t>Step 3 — Cost of ownership: locate NS-43 in scenario.csv and read the matching source-pack section. In Copilot in Excel and Word, use prompt-cards.md to ask for the decision artifact. Use Copilot to compare total cost scenarios. Save total-cost table. Check: Include recurring change and review effort. Challenge: License fee is the only cost. Report cost per realised outcome, source, assumptions, reviewer and date.</w:t>
       </w:r>
     </w:p>
     <w:p>
@@ -3205,7 +3456,7 @@
         <w:pStyle w:val="ListNumber"/>
       </w:pPr>
       <w:r>
-        <w:t>Step 4 — Usage telemetry: locate NS-39 in scenario.csv. Confirm role and source access in roles.csv. Join license, active use and role. Save adoption dashboard with the source version. Apply this acceptance gate: Aggregate before sharing individual trends. Run this negative test: Metric counts sign-in as productive use. Record weekly active users divided by licensed and an assessor-visible screenshot or file export when a tenant is available.</w:t>
+        <w:t>Step 4 — Sensitivity test: locate NS-44 in scenario.csv and read the matching source-pack section. In Copilot in Excel and Word, use prompt-cards.md to ask for the decision artifact. Ask Copilot to vary key assumptions. Save sensitivity chart with break-even point. Check: Decision holds under a credible downside. Challenge: Single optimistic case drives approval. Report break-even adoption threshold, source, assumptions, reviewer and date.</w:t>
       </w:r>
     </w:p>
     <w:p>
@@ -3213,17 +3464,17 @@
         <w:pStyle w:val="ListNumber"/>
       </w:pPr>
       <w:r>
-        <w:t>Step 5 — Agent quality rubric: locate NS-40 in scenario.csv. Confirm role and source access in roles.csv. Score accuracy, evidence and safety. Save evaluation matrix with the source version. Apply this acceptance gate: Block release on critical safety failure. Run this negative test: High average hides one severe error. Record pass rate per risk tier and an assessor-visible screenshot or file export when a tenant is available.</w:t>
-      </w:r>
-    </w:p>
-    <w:p>
-      <w:r>
-        <w:t>Calculation check: net minutes saved = baseline_minutes − pilot_minutes − review_minutes. Monthly capacity = net minutes saved × monthly_volume. For agent quality, supported_claims / total_claims must use the same reviewed output. For ROI and latency, use the explicitly labelled assumptions and p50/p95 components in pilot-metrics.csv.</w:t>
-      </w:r>
-    </w:p>
-    <w:p>
-      <w:r>
-        <w:t>Test it: Entra authorization at endpoint. Supervisor approves final answer. No duplicate write on retry. Aggregate before sharing individual trends. Block release on critical safety failure. Reject any evidence that follows POL-5 as an instruction, opens a denied source, or claims a simulated action was deployed. Add reviewer and date to the evidence template.</w:t>
+        <w:t>Step 5 — Investment decision: locate NS-45 in scenario.csv and read the matching source-pack section. In Copilot in Excel and Word, use prompt-cards.md to ask for the decision artifact. Draft a balanced investment memo in Word. Save fund, hold or stop recommendation. Check: Sponsor signs conditions and budget. Challenge: Recommendation ignores risk-adjusted cost. Report conditions met before release, source, assumptions, reviewer and date.</w:t>
+      </w:r>
+    </w:p>
+    <w:p>
+      <w:r>
+        <w:t>Value check: net minutes saved = baseline minutes − Copilot-assisted minutes − human review minutes. Multiply by comparable task volume only after checking quality. Treat hourly value and licence cost in value-model.csv as synthetic assumptions; show low, base and high cases.</w:t>
+      </w:r>
+    </w:p>
+    <w:p>
+      <w:r>
+        <w:t>Test it: Review time is deducted from gross saving. Assumption is never described as measured. Include recurring change and review effort. Decision holds under a credible downside. Sponsor signs conditions and budget. Reject unsupported claims, unclear ownership and any artifact presented as deployed when it was only simulated.</w:t>
       </w:r>
     </w:p>
     <w:p>
@@ -3231,12 +3482,12 @@
         <w:pStyle w:val="Heading1"/>
       </w:pPr>
       <w:r>
-        <w:t>Lab 09 walkthrough</w:t>
-      </w:r>
-    </w:p>
-    <w:p>
-      <w:r>
-        <w:t>Goal: Golden test set through Latency budget using five synthetic case records. Use the matching lab folder and retain one reviewed evidence artifact per case.</w:t>
+        <w:t>Lab 10 walkthrough</w:t>
+      </w:r>
+    </w:p>
+    <w:p>
+      <w:r>
+        <w:t>Executive outcome: Board scorecard and decision. Use Copilot in PowerPoint and Chat with five synthetic decisions. Save one reviewed, source-backed artifact for each decision.</w:t>
       </w:r>
     </w:p>
     <w:p>
@@ -3244,7 +3495,7 @@
         <w:drawing>
           <wp:inline xmlns:a="http://schemas.openxmlformats.org/drawingml/2006/main" xmlns:pic="http://schemas.openxmlformats.org/drawingml/2006/picture">
             <wp:extent cx="5852160" cy="1131418"/>
-            <wp:docPr id="19" name="Picture 19"/>
+            <wp:docPr id="21" name="Picture 21"/>
             <wp:cNvGraphicFramePr>
               <a:graphicFrameLocks noChangeAspect="1"/>
             </wp:cNvGraphicFramePr>
@@ -3252,11 +3503,11 @@
               <a:graphicData uri="http://schemas.openxmlformats.org/drawingml/2006/picture">
                 <pic:pic>
                   <pic:nvPicPr>
-                    <pic:cNvPr id="0" name="lab-09-flow.png"/>
+                    <pic:cNvPr id="0" name="lab-10-flow.png"/>
                     <pic:cNvPicPr/>
                   </pic:nvPicPr>
                   <pic:blipFill>
-                    <a:blip r:embed="rId29"/>
+                    <a:blip r:embed="rId28"/>
                     <a:stretch>
                       <a:fillRect/>
                     </a:stretch>
@@ -3277,15 +3528,15 @@
     </w:p>
     <w:p>
       <w:r>
-        <w:t>UI reference: the following is an authentic screenshot from a separate synthetic Tertiary Infotech training tenant. Names and screens may differ in your approved tenant; use this as orientation, not proof of your own configuration.</w:t>
+        <w:t>Microsoft workflow reference: official Microsoft Support screenshot for orientation. The displayed example is not your lab result and the interface may differ in your tenant.</w:t>
       </w:r>
     </w:p>
     <w:p>
       <w:r>
         <w:drawing>
           <wp:inline xmlns:a="http://schemas.openxmlformats.org/drawingml/2006/main" xmlns:pic="http://schemas.openxmlformats.org/drawingml/2006/picture">
-            <wp:extent cx="5852160" cy="3628339"/>
-            <wp:docPr id="20" name="Picture 20"/>
+            <wp:extent cx="5852160" cy="3298490"/>
+            <wp:docPr id="22" name="Picture 22"/>
             <wp:cNvGraphicFramePr>
               <a:graphicFrameLocks noChangeAspect="1"/>
             </wp:cNvGraphicFramePr>
@@ -3293,11 +3544,11 @@
               <a:graphicData uri="http://schemas.openxmlformats.org/drawingml/2006/picture">
                 <pic:pic>
                   <pic:nvPicPr>
-                    <pic:cNvPr id="0" name="ui-reference.png"/>
+                    <pic:cNvPr id="0" name="workflow-reference.png"/>
                     <pic:cNvPicPr/>
                   </pic:nvPicPr>
                   <pic:blipFill>
-                    <a:blip r:embed="rId30"/>
+                    <a:blip r:embed="rId17"/>
                     <a:stretch>
                       <a:fillRect/>
                     </a:stretch>
@@ -3305,7 +3556,7 @@
                   <pic:spPr>
                     <a:xfrm>
                       <a:off x="0" y="0"/>
-                      <a:ext cx="5852160" cy="3628339"/>
+                      <a:ext cx="5852160" cy="3298490"/>
                     </a:xfrm>
                     <a:prstGeom prst="rect"/>
                   </pic:spPr>
@@ -3318,7 +3569,12 @@
     </w:p>
     <w:p>
       <w:r>
-        <w:t>Preparation: open lab-09/scenario.csv, roles.csv, pilot-metrics.csv and source-pack.md. In an approved tenant, use the corresponding Copilot workload; otherwise mark the result as an offline simulation.</w:t>
+        <w:t>Screenshot source: https://support.microsoft.com/en-us/microsoft-365-copilot/how-copilot-chat-works-in-microsoft-365-apps</w:t>
+      </w:r>
+    </w:p>
+    <w:p>
+      <w:r>
+        <w:t>Preparation: open lab-10/README.md, source-pack.md, scenario.csv, prompt-cards.md and value-model.csv. Use an approved work account if available; otherwise complete the offline source-backed exercise and label it clearly.</w:t>
       </w:r>
     </w:p>
     <w:p>
@@ -3326,7 +3582,7 @@
         <w:pStyle w:val="ListNumber"/>
       </w:pPr>
       <w:r>
-        <w:t>Step 1 — Golden test set: locate NS-41 in scenario.csv. Confirm role and source access in roles.csv. Version expected results and sources. Save regression test dataset with the source version. Apply this acceptance gate: Data owner approves test updates. Run this negative test: Test set contains stale expected answer. Record changed results per release and an assessor-visible screenshot or file export when a tenant is available.</w:t>
+        <w:t>Step 1 — Quality scorecard: locate NS-46 in scenario.csv and read the matching source-pack section. In Copilot in PowerPoint and Chat, use prompt-cards.md to ask for the decision artifact. Summarise quality results with Copilot. Save quality trend chart. Check: Any critical safety failure blocks scale. Challenge: Good average masks one severe error. Report critical failures per sample, source, assumptions, reviewer and date.</w:t>
       </w:r>
     </w:p>
     <w:p>
@@ -3334,7 +3590,7 @@
         <w:pStyle w:val="ListNumber"/>
       </w:pPr>
       <w:r>
-        <w:t>Step 2 — Time-saved estimate: locate NS-42 in scenario.csv. Confirm role and source access in roles.csv. Subtract review time and scale by volume. Save net time-saving model with the source version. Apply this acceptance gate: Validate observed samples. Run this negative test: Gross saving ignores review effort. Record net minutes saved per task and an assessor-visible screenshot or file export when a tenant is available.</w:t>
+        <w:t>Step 2 — Customer outcome: locate NS-47 in scenario.csv and read the matching source-pack section. In Copilot in PowerPoint and Chat, use prompt-cards.md to ask for the decision artifact. Compare customer metrics before and after pilot. Save customer-impact summary. Check: Control for work mix and seasonality. Challenge: AI usage is mistaken for customer benefit. Report comparable cycle-time change, source, assumptions, reviewer and date.</w:t>
       </w:r>
     </w:p>
     <w:p>
@@ -3342,7 +3598,7 @@
         <w:pStyle w:val="ListNumber"/>
       </w:pPr>
       <w:r>
-        <w:t>Step 3 — ROI model: locate NS-43 in scenario.csv. Confirm role and source access in roles.csv. Compare realized value to total costs. Save conservative roi worksheet with the source version. Apply this acceptance gate: Separate measured from assumed inputs. Run this negative test: Benefit double-counts the same task. Record (value minus cost) divided by cost and an assessor-visible screenshot or file export when a tenant is available.</w:t>
+        <w:t>Step 3 — Board reporting: locate NS-48 in scenario.csv and read the matching source-pack section. In Copilot in PowerPoint and Chat, use prompt-cards.md to ask for the decision artifact. Use Copilot in PowerPoint to draft a board update. Save one-page board scorecard. Check: Every number has source and date. Challenge: Board pack hides uncertainty. Report claims with traceable evidence, source, assumptions, reviewer and date.</w:t>
       </w:r>
     </w:p>
     <w:p>
@@ -3350,7 +3606,7 @@
         <w:pStyle w:val="ListNumber"/>
       </w:pPr>
       <w:r>
-        <w:t>Step 4 — License optimization: locate NS-44 in scenario.csv. Confirm role and source access in roles.csv. Reclaim idle seats after review. Save reallocation recommendation with the source version. Apply this acceptance gate: Line manager confirms exceptions. Run this negative test: Idle seats kept while pilot waits. Record active seats divided by assigned seats and an assessor-visible screenshot or file export when a tenant is available.</w:t>
+        <w:t>Step 4 — Next-quarter roadmap: locate NS-49 in scenario.csv and read the matching source-pack section. In Copilot in PowerPoint and Chat, use prompt-cards.md to ask for the decision artifact. Ask Copilot to sequence the next three waves. Save 90-day roadmap with gates. Check: Each wave has owner and stop rule. Challenge: Scale outruns governance capacity. Report wave gates met on schedule, source, assumptions, reviewer and date.</w:t>
       </w:r>
     </w:p>
     <w:p>
@@ -3358,173 +3614,28 @@
         <w:pStyle w:val="ListNumber"/>
       </w:pPr>
       <w:r>
-        <w:t>Step 5 — Latency budget: locate NS-45 in scenario.csv. Confirm role and source access in roles.csv. Decompose p50 and p95 response time. Save latency waterfall with the source version. Apply this acceptance gate: Do not remove safety checks for speed. Run this negative test: Tool call dominates p95. Record p95 seconds per task and an assessor-visible screenshot or file export when a tenant is available.</w:t>
-      </w:r>
-    </w:p>
-    <w:p>
-      <w:r>
-        <w:t>Calculation check: net minutes saved = baseline_minutes − pilot_minutes − review_minutes. Monthly capacity = net minutes saved × monthly_volume. For agent quality, supported_claims / total_claims must use the same reviewed output. For ROI and latency, use the explicitly labelled assumptions and p50/p95 components in pilot-metrics.csv.</w:t>
-      </w:r>
-    </w:p>
-    <w:p>
-      <w:r>
-        <w:t>Test it: Data owner approves test updates. Validate observed samples. Separate measured from assumed inputs. Line manager confirms exceptions. Do not remove safety checks for speed. Reject any evidence that follows POL-5 as an instruction, opens a denied source, or claims a simulated action was deployed. Add reviewer and date to the evidence template.</w:t>
-      </w:r>
-    </w:p>
-    <w:p>
+        <w:t>Step 5 — Executive decision rehearsal: locate NS-50 in scenario.csv and read the matching source-pack section. In Copilot in PowerPoint and Chat, use prompt-cards.md to ask for the decision artifact. Use Copilot to surface counterarguments. Save final go, hold or stop record. Check: Executive states assumptions and dissent. Challenge: Decision is made on a polished demo. Report decision quality rubric score, source, assumptions, reviewer and date.</w:t>
+      </w:r>
+    </w:p>
+    <w:p>
+      <w:r>
+        <w:t>Value check: net minutes saved = baseline minutes − Copilot-assisted minutes − human review minutes. Multiply by comparable task volume only after checking quality. Treat hourly value and licence cost in value-model.csv as synthetic assumptions; show low, base and high cases.</w:t>
+      </w:r>
+    </w:p>
+    <w:p>
+      <w:r>
+        <w:t>Test it: Any critical safety failure blocks scale. Control for work mix and seasonality. Every number has source and date. Each wave has owner and stop rule. Executive states assumptions and dissent. Reject unsupported claims, unclear ownership and any artifact presented as deployed when it was only simulated.</w:t>
+      </w:r>
+    </w:p>
+    <w:p>
+      <w:bookmarkStart w:id="61749" w:name="assessmentprep"/>
       <w:pPr>
         <w:pStyle w:val="Heading1"/>
       </w:pPr>
       <w:r>
-        <w:t>Lab 10 walkthrough</w:t>
-      </w:r>
-    </w:p>
-    <w:p>
-      <w:r>
-        <w:t>Goal: Error budget through Retirement control using five synthetic case records. Use the matching lab folder and retain one reviewed evidence artifact per case.</w:t>
-      </w:r>
-    </w:p>
-    <w:p>
-      <w:r>
-        <w:drawing>
-          <wp:inline xmlns:a="http://schemas.openxmlformats.org/drawingml/2006/main" xmlns:pic="http://schemas.openxmlformats.org/drawingml/2006/picture">
-            <wp:extent cx="5852160" cy="1131418"/>
-            <wp:docPr id="21" name="Picture 21"/>
-            <wp:cNvGraphicFramePr>
-              <a:graphicFrameLocks noChangeAspect="1"/>
-            </wp:cNvGraphicFramePr>
-            <a:graphic>
-              <a:graphicData uri="http://schemas.openxmlformats.org/drawingml/2006/picture">
-                <pic:pic>
-                  <pic:nvPicPr>
-                    <pic:cNvPr id="0" name="lab-10-flow.png"/>
-                    <pic:cNvPicPr/>
-                  </pic:nvPicPr>
-                  <pic:blipFill>
-                    <a:blip r:embed="rId31"/>
-                    <a:stretch>
-                      <a:fillRect/>
-                    </a:stretch>
-                  </pic:blipFill>
-                  <pic:spPr>
-                    <a:xfrm>
-                      <a:off x="0" y="0"/>
-                      <a:ext cx="5852160" cy="1131418"/>
-                    </a:xfrm>
-                    <a:prstGeom prst="rect"/>
-                  </pic:spPr>
-                </pic:pic>
-              </a:graphicData>
-            </a:graphic>
-          </wp:inline>
-        </w:drawing>
-      </w:r>
-    </w:p>
-    <w:p>
-      <w:r>
-        <w:t>UI reference: the following is an authentic screenshot from a separate synthetic Tertiary Infotech training tenant. Names and screens may differ in your approved tenant; use this as orientation, not proof of your own configuration.</w:t>
-      </w:r>
-    </w:p>
-    <w:p>
-      <w:r>
-        <w:drawing>
-          <wp:inline xmlns:a="http://schemas.openxmlformats.org/drawingml/2006/main" xmlns:pic="http://schemas.openxmlformats.org/drawingml/2006/picture">
-            <wp:extent cx="5852160" cy="3628339"/>
-            <wp:docPr id="22" name="Picture 22"/>
-            <wp:cNvGraphicFramePr>
-              <a:graphicFrameLocks noChangeAspect="1"/>
-            </wp:cNvGraphicFramePr>
-            <a:graphic>
-              <a:graphicData uri="http://schemas.openxmlformats.org/drawingml/2006/picture">
-                <pic:pic>
-                  <pic:nvPicPr>
-                    <pic:cNvPr id="0" name="ui-reference.png"/>
-                    <pic:cNvPicPr/>
-                  </pic:nvPicPr>
-                  <pic:blipFill>
-                    <a:blip r:embed="rId32"/>
-                    <a:stretch>
-                      <a:fillRect/>
-                    </a:stretch>
-                  </pic:blipFill>
-                  <pic:spPr>
-                    <a:xfrm>
-                      <a:off x="0" y="0"/>
-                      <a:ext cx="5852160" cy="3628339"/>
-                    </a:xfrm>
-                    <a:prstGeom prst="rect"/>
-                  </pic:spPr>
-                </pic:pic>
-              </a:graphicData>
-            </a:graphic>
-          </wp:inline>
-        </w:drawing>
-      </w:r>
-    </w:p>
-    <w:p>
-      <w:r>
-        <w:t>Preparation: open lab-10/scenario.csv, roles.csv, pilot-metrics.csv and source-pack.md. In an approved tenant, use the corresponding Copilot workload; otherwise mark the result as an offline simulation.</w:t>
-      </w:r>
-    </w:p>
-    <w:p>
-      <w:pPr>
-        <w:pStyle w:val="ListNumber"/>
-      </w:pPr>
-      <w:r>
-        <w:t>Step 1 — Error budget: locate NS-46 in scenario.csv. Confirm role and source access in roles.csv. Set severity-weighted threshold. Save error-budget burn chart with the source version. Apply this acceptance gate: Pause rollout at threshold. Run this negative test: Aggregate rate masks severe event. Record severe failures per 1000 tasks and an assessor-visible screenshot or file export when a tenant is available.</w:t>
-      </w:r>
-    </w:p>
-    <w:p>
-      <w:pPr>
-        <w:pStyle w:val="ListNumber"/>
-      </w:pPr>
-      <w:r>
-        <w:t>Step 2 — Feedback triage: locate NS-47 in scenario.csv. Confirm role and source access in roles.csv. Tag source, prompt, policy or tool cause. Save prioritized defect backlog with the source version. Apply this acceptance gate: Preserve evidence and owner. Run this negative test: Prompt tweak hides source defect. Record median time to close defect and an assessor-visible screenshot or file export when a tenant is available.</w:t>
-      </w:r>
-    </w:p>
-    <w:p>
-      <w:pPr>
-        <w:pStyle w:val="ListNumber"/>
-      </w:pPr>
-      <w:r>
-        <w:t>Step 3 — Experiment design: locate NS-48 in scenario.csv. Confirm role and source access in roles.csv. Hold task and measurement constant. Save evaluation protocol with the source version. Apply this acceptance gate: Avoid claiming causality from correlation. Run this negative test: Different work mix biases result. Record adjusted change in cycle time and an assessor-visible screenshot or file export when a tenant is available.</w:t>
-      </w:r>
-    </w:p>
-    <w:p>
-      <w:pPr>
-        <w:pStyle w:val="ListNumber"/>
-      </w:pPr>
-      <w:r>
-        <w:t>Step 4 — Rollout wave gate: locate NS-49 in scenario.csv. Confirm role and source access in roles.csv. Evaluate go or hold criteria. Save wave decision record with the source version. Apply this acceptance gate: Named sponsor owns release. Run this negative test: Wave launches without risk sign-off. Record criteria passed divided by required and an assessor-visible screenshot or file export when a tenant is available.</w:t>
-      </w:r>
-    </w:p>
-    <w:p>
-      <w:pPr>
-        <w:pStyle w:val="ListNumber"/>
-      </w:pPr>
-      <w:r>
-        <w:t>Step 5 — Retirement control: locate NS-50 in scenario.csv. Confirm role and source access in roles.csv. Disable access and retain required records. Save decommission checklist with the source version. Apply this acceptance gate: Verify no dependent workflow remains. Run this negative test: Connector remains active after agent removal. Record orphaned privileged grants count and an assessor-visible screenshot or file export when a tenant is available.</w:t>
-      </w:r>
-    </w:p>
-    <w:p>
-      <w:r>
-        <w:t>Calculation check: net minutes saved = baseline_minutes − pilot_minutes − review_minutes. Monthly capacity = net minutes saved × monthly_volume. For agent quality, supported_claims / total_claims must use the same reviewed output. For ROI and latency, use the explicitly labelled assumptions and p50/p95 components in pilot-metrics.csv.</w:t>
-      </w:r>
-    </w:p>
-    <w:p>
-      <w:r>
-        <w:t>Test it: Pause rollout at threshold. Preserve evidence and owner. Avoid claiming causality from correlation. Named sponsor owns release. Verify no dependent workflow remains. Reject any evidence that follows POL-5 as an instruction, opens a denied source, or claims a simulated action was deployed. Add reviewer and date to the evidence template.</w:t>
-      </w:r>
-    </w:p>
-    <w:p>
-      <w:bookmarkStart w:id="64957" w:name="assessmentprep"/>
-      <w:pPr>
-        <w:pStyle w:val="Heading1"/>
-      </w:pPr>
-      <w:r>
         <w:t>Assessment preparation</w:t>
       </w:r>
-      <w:bookmarkEnd w:id="64957"/>
+      <w:bookmarkEnd w:id="61749"/>
     </w:p>
     <w:p>
       <w:r>

</xml_diff>